<commit_message>
fix wrestler row clickable for picking
</commit_message>
<xml_diff>
--- a/Promt MongolNaadam.docx
+++ b/Promt MongolNaadam.docx
@@ -7,79 +7,7 @@
         <w:pStyle w:val="NormalWeb"/>
       </w:pPr>
       <w:r>
-        <w:t xml:space="preserve">2026 </w:t>
-      </w:r>
-      <w:proofErr w:type="spellStart"/>
-      <w:r>
-        <w:t>оны</w:t>
-      </w:r>
-      <w:proofErr w:type="spellEnd"/>
-      <w:r>
-        <w:t xml:space="preserve"> </w:t>
-      </w:r>
-      <w:proofErr w:type="spellStart"/>
-      <w:r>
-        <w:t>улсын</w:t>
-      </w:r>
-      <w:proofErr w:type="spellEnd"/>
-      <w:r>
-        <w:t xml:space="preserve"> </w:t>
-      </w:r>
-      <w:proofErr w:type="spellStart"/>
-      <w:r>
-        <w:t>баяр</w:t>
-      </w:r>
-      <w:proofErr w:type="spellEnd"/>
-      <w:r>
-        <w:t xml:space="preserve"> </w:t>
-      </w:r>
-      <w:proofErr w:type="spellStart"/>
-      <w:r>
-        <w:t>наадмын</w:t>
-      </w:r>
-      <w:proofErr w:type="spellEnd"/>
-      <w:r>
-        <w:t xml:space="preserve"> </w:t>
-      </w:r>
-      <w:proofErr w:type="spellStart"/>
-      <w:r>
-        <w:t>бөхийн</w:t>
-      </w:r>
-      <w:proofErr w:type="spellEnd"/>
-      <w:r>
-        <w:t xml:space="preserve"> </w:t>
-      </w:r>
-      <w:proofErr w:type="spellStart"/>
-      <w:r>
-        <w:t>таавар</w:t>
-      </w:r>
-      <w:proofErr w:type="spellEnd"/>
-      <w:r>
-        <w:t xml:space="preserve"> </w:t>
-      </w:r>
-      <w:proofErr w:type="spellStart"/>
-      <w:r>
-        <w:t>оруулах</w:t>
-      </w:r>
-      <w:proofErr w:type="spellEnd"/>
-      <w:r>
-        <w:t xml:space="preserve"> </w:t>
-      </w:r>
-      <w:proofErr w:type="spellStart"/>
-      <w:r>
-        <w:t>гэж</w:t>
-      </w:r>
-      <w:proofErr w:type="spellEnd"/>
-      <w:r>
-        <w:t xml:space="preserve"> </w:t>
-      </w:r>
-      <w:proofErr w:type="spellStart"/>
-      <w:r>
-        <w:t>байна</w:t>
-      </w:r>
-      <w:proofErr w:type="spellEnd"/>
-      <w:r>
-        <w:t xml:space="preserve">. </w:t>
+        <w:t xml:space="preserve">2026 оны улсын баяр наадмын бөхийн таавар оруулах гэж байна. </w:t>
       </w:r>
     </w:p>
     <w:p>
@@ -90,43 +18,9 @@
           <w:numId w:val="1"/>
         </w:numPr>
       </w:pPr>
-      <w:proofErr w:type="spellStart"/>
-      <w:r>
-        <w:t>Барилдааны</w:t>
-      </w:r>
-      <w:proofErr w:type="spellEnd"/>
-      <w:r>
-        <w:t xml:space="preserve"> </w:t>
-      </w:r>
-      <w:proofErr w:type="spellStart"/>
-      <w:r>
-        <w:t>нэр</w:t>
-      </w:r>
-      <w:proofErr w:type="spellEnd"/>
-      <w:r>
-        <w:t xml:space="preserve"> </w:t>
-      </w:r>
-      <w:proofErr w:type="spellStart"/>
-      <w:r>
-        <w:t>яаж</w:t>
-      </w:r>
-      <w:proofErr w:type="spellEnd"/>
-      <w:r>
-        <w:t xml:space="preserve"> </w:t>
-      </w:r>
-      <w:proofErr w:type="spellStart"/>
-      <w:r>
-        <w:t>оруулах</w:t>
-      </w:r>
-      <w:proofErr w:type="spellEnd"/>
-      <w:r>
-        <w:t xml:space="preserve"> </w:t>
-      </w:r>
-      <w:proofErr w:type="spellStart"/>
-      <w:r>
-        <w:t>вэ</w:t>
-      </w:r>
-      <w:proofErr w:type="spellEnd"/>
+      <w:r>
+        <w:t>Барилдааны нэр яаж оруулах вэ</w:t>
+      </w:r>
     </w:p>
     <w:p>
       <w:pPr>
@@ -1076,6 +970,60 @@
           <w:lang w:val="mn-MN"/>
         </w:rPr>
       </w:pPr>
+      <w:r>
+        <w:t>About (</w:t>
+      </w:r>
+      <w:r>
+        <w:rPr>
+          <w:lang w:val="mn-MN"/>
+        </w:rPr>
+        <w:t>Шагналын сан болон Шагналын сан хувиарлагдах зарчмын тайлбар</w:t>
+      </w:r>
+      <w:r>
+        <w:t>), Profile-(Your statistics-</w:t>
+      </w:r>
+      <w:r>
+        <w:rPr>
+          <w:lang w:val="mn-MN"/>
+        </w:rPr>
+        <w:t xml:space="preserve">Тааварт оролцсон байдал, Хэн хэн дээр </w:t>
+      </w:r>
+      <w:r>
+        <w:t xml:space="preserve">bet </w:t>
+      </w:r>
+      <w:r>
+        <w:rPr>
+          <w:lang w:val="mn-MN"/>
+        </w:rPr>
+        <w:t xml:space="preserve">тавьсан, </w:t>
+      </w:r>
+      <w:r>
+        <w:t>Bet-</w:t>
+      </w:r>
+      <w:r>
+        <w:rPr>
+          <w:lang w:val="mn-MN"/>
+        </w:rPr>
+        <w:t xml:space="preserve">ийн хэмжээ ба хугацаа, Өмнөх </w:t>
+      </w:r>
+      <w:r>
+        <w:t>Bet-</w:t>
+      </w:r>
+      <w:r>
+        <w:rPr>
+          <w:lang w:val="mn-MN"/>
+        </w:rPr>
+        <w:t>ийн түүх</w:t>
+      </w:r>
+      <w:r>
+        <w:t>)</w:t>
+      </w:r>
+      <w:r>
+        <w:rPr>
+          <w:lang w:val="mn-MN"/>
+        </w:rPr>
+        <w:t xml:space="preserve">, Наадмын таавар, Барилдааны таавар, </w:t>
+      </w:r>
     </w:p>
     <w:p>
       <w:pPr>
@@ -1085,11 +1033,104 @@
           <w:lang w:val="mn-MN"/>
         </w:rPr>
       </w:pPr>
-      <w:r>
-        <w:rPr>
-          <w:lang w:val="mn-MN"/>
-        </w:rPr>
-        <w:t xml:space="preserve">Тааврын нэр оруулна. </w:t>
+    </w:p>
+    <w:p>
+      <w:pPr>
+        <w:spacing w:before="100" w:beforeAutospacing="1" w:after="100" w:afterAutospacing="1" w:line="240" w:lineRule="auto"/>
+        <w:rPr>
+          <w:rFonts w:ascii="Times New Roman" w:eastAsia="Times New Roman" w:hAnsi="Times New Roman" w:cs="Times New Roman"/>
+          <w:sz w:val="24"/>
+          <w:szCs w:val="24"/>
+          <w:lang w:val="mn-MN"/>
+        </w:rPr>
+      </w:pPr>
+      <w:r>
+        <w:rPr>
+          <w:rFonts w:ascii="Times New Roman" w:eastAsia="Times New Roman" w:hAnsi="Times New Roman" w:cs="Times New Roman"/>
+          <w:sz w:val="24"/>
+          <w:szCs w:val="24"/>
+          <w:lang w:val="mn-MN"/>
+        </w:rPr>
+        <w:t xml:space="preserve">2 зүйл нэмнэ. </w:t>
+      </w:r>
+    </w:p>
+    <w:p>
+      <w:pPr>
+        <w:pStyle w:val="ListParagraph"/>
+        <w:numPr>
+          <w:ilvl w:val="0"/>
+          <w:numId w:val="5"/>
+        </w:numPr>
+        <w:spacing w:before="100" w:beforeAutospacing="1" w:after="100" w:afterAutospacing="1" w:line="240" w:lineRule="auto"/>
+        <w:rPr>
+          <w:rFonts w:ascii="Times New Roman" w:eastAsia="Times New Roman" w:hAnsi="Times New Roman" w:cs="Times New Roman"/>
+          <w:sz w:val="24"/>
+          <w:szCs w:val="24"/>
+        </w:rPr>
+      </w:pPr>
+      <w:r>
+        <w:rPr>
+          <w:rFonts w:ascii="Times New Roman" w:eastAsia="Times New Roman" w:hAnsi="Times New Roman" w:cs="Times New Roman"/>
+          <w:sz w:val="24"/>
+          <w:szCs w:val="24"/>
+        </w:rPr>
+        <w:t xml:space="preserve">About – </w:t>
+      </w:r>
+      <w:r>
+        <w:rPr>
+          <w:rFonts w:ascii="Times New Roman" w:eastAsia="Times New Roman" w:hAnsi="Times New Roman" w:cs="Times New Roman"/>
+          <w:sz w:val="24"/>
+          <w:szCs w:val="24"/>
+          <w:lang w:val="mn-MN"/>
+        </w:rPr>
+        <w:t xml:space="preserve">Эсвэл Тухай </w:t>
+      </w:r>
+      <w:r>
+        <w:rPr>
+          <w:rFonts w:ascii="Times New Roman" w:eastAsia="Times New Roman" w:hAnsi="Times New Roman" w:cs="Times New Roman"/>
+          <w:sz w:val="24"/>
+          <w:szCs w:val="24"/>
+        </w:rPr>
+        <w:t>Tab (</w:t>
+      </w:r>
+      <w:r>
+        <w:rPr>
+          <w:rFonts w:ascii="Times New Roman" w:eastAsia="Times New Roman" w:hAnsi="Times New Roman" w:cs="Times New Roman"/>
+          <w:sz w:val="24"/>
+          <w:szCs w:val="24"/>
+        </w:rPr>
+        <w:t>Тааврын ажиллах дүрэм, шагналын санг хуваах зарчим</w:t>
+      </w:r>
+      <w:r>
+        <w:rPr>
+          <w:rFonts w:ascii="Times New Roman" w:eastAsia="Times New Roman" w:hAnsi="Times New Roman" w:cs="Times New Roman"/>
+          <w:sz w:val="24"/>
+          <w:szCs w:val="24"/>
+        </w:rPr>
+        <w:t>)</w:t>
+      </w:r>
+    </w:p>
+    <w:p>
+      <w:pPr>
+        <w:pStyle w:val="ListParagraph"/>
+        <w:numPr>
+          <w:ilvl w:val="0"/>
+          <w:numId w:val="5"/>
+        </w:numPr>
+        <w:spacing w:before="100" w:beforeAutospacing="1" w:after="100" w:afterAutospacing="1" w:line="240" w:lineRule="auto"/>
+        <w:rPr>
+          <w:rFonts w:ascii="Times New Roman" w:eastAsia="Times New Roman" w:hAnsi="Times New Roman" w:cs="Times New Roman"/>
+          <w:sz w:val="24"/>
+          <w:szCs w:val="24"/>
+        </w:rPr>
+      </w:pPr>
+      <w:r>
+        <w:rPr>
+          <w:rFonts w:ascii="Times New Roman" w:eastAsia="Times New Roman" w:hAnsi="Times New Roman" w:cs="Times New Roman"/>
+          <w:sz w:val="24"/>
+          <w:szCs w:val="24"/>
+        </w:rPr>
+        <w:t>Profile-</w:t>
       </w:r>
     </w:p>
     <w:p>
@@ -1100,42 +1141,6 @@
           <w:lang w:val="mn-MN"/>
         </w:rPr>
       </w:pPr>
-      <w:r>
-        <w:rPr>
-          <w:lang w:val="mn-MN"/>
-        </w:rPr>
-        <w:t>Шагналын сан</w:t>
-      </w:r>
-      <w:r>
-        <w:rPr>
-          <w:lang w:val="mn-MN"/>
-        </w:rPr>
-        <w:t xml:space="preserve"> болон </w:t>
-      </w:r>
-      <w:r>
-        <w:rPr>
-          <w:lang w:val="mn-MN"/>
-        </w:rPr>
-        <w:t>Шагналын сан хувиарлагдах зарч</w:t>
-      </w:r>
-      <w:r>
-        <w:rPr>
-          <w:lang w:val="mn-MN"/>
-        </w:rPr>
-        <w:t>м</w:t>
-      </w:r>
-      <w:r>
-        <w:rPr>
-          <w:lang w:val="mn-MN"/>
-        </w:rPr>
-        <w:t>ын тайлбар оруулах</w:t>
-      </w:r>
-      <w:r>
-        <w:rPr>
-          <w:lang w:val="mn-MN"/>
-        </w:rPr>
-        <w:t>.</w:t>
-      </w:r>
     </w:p>
     <w:p>
       <w:pPr>
@@ -1145,84 +1150,3230 @@
           <w:lang w:val="mn-MN"/>
         </w:rPr>
       </w:pPr>
+    </w:p>
+    <w:p>
+      <w:pPr>
+        <w:pStyle w:val="NormalWeb"/>
+        <w:ind w:left="360"/>
+        <w:rPr>
+          <w:lang w:val="mn-MN"/>
+        </w:rPr>
+      </w:pPr>
+      <w:r>
+        <w:rPr>
+          <w:lang w:val="mn-MN"/>
+        </w:rPr>
+        <w:t xml:space="preserve">Тааврын нэр оруулна. </w:t>
+      </w:r>
+    </w:p>
+    <w:p>
+      <w:pPr>
+        <w:pStyle w:val="NormalWeb"/>
+        <w:ind w:left="360"/>
+        <w:rPr>
+          <w:lang w:val="mn-MN"/>
+        </w:rPr>
+      </w:pPr>
+      <w:r>
+        <w:rPr>
+          <w:lang w:val="mn-MN"/>
+        </w:rPr>
+        <w:t>Шагналын сан</w:t>
+      </w:r>
+      <w:r>
+        <w:rPr>
+          <w:lang w:val="mn-MN"/>
+        </w:rPr>
+        <w:t xml:space="preserve"> болон </w:t>
+      </w:r>
+      <w:r>
+        <w:rPr>
+          <w:lang w:val="mn-MN"/>
+        </w:rPr>
+        <w:t>Шагналын сан хувиарлагдах зарч</w:t>
+      </w:r>
+      <w:r>
+        <w:rPr>
+          <w:lang w:val="mn-MN"/>
+        </w:rPr>
+        <w:t>м</w:t>
+      </w:r>
+      <w:r>
+        <w:rPr>
+          <w:lang w:val="mn-MN"/>
+        </w:rPr>
+        <w:t>ын тайлбар оруулах</w:t>
+      </w:r>
+      <w:r>
+        <w:rPr>
+          <w:lang w:val="mn-MN"/>
+        </w:rPr>
+        <w:t>.</w:t>
+      </w:r>
+    </w:p>
+    <w:p>
+      <w:pPr>
+        <w:pStyle w:val="NormalWeb"/>
+        <w:ind w:left="360"/>
+      </w:pPr>
+    </w:p>
+    <w:p>
+      <w:pPr>
+        <w:pStyle w:val="NormalWeb"/>
+        <w:ind w:left="360"/>
+        <w:rPr>
+          <w:lang w:val="mn-MN"/>
+        </w:rPr>
+      </w:pPr>
+    </w:p>
+    <w:p>
+      <w:pPr>
+        <w:pStyle w:val="NormalWeb"/>
+        <w:ind w:left="360"/>
+        <w:rPr>
+          <w:lang w:val="mn-MN"/>
+        </w:rPr>
+      </w:pPr>
       <w:r>
         <w:rPr>
           <w:lang w:val="mn-MN"/>
         </w:rPr>
         <w:t>Оноогоо мөнгөнд хөрвүүлэх хүсэлт</w:t>
       </w:r>
+      <w:r>
+        <w:rPr>
+          <w:lang w:val="mn-MN"/>
+        </w:rPr>
+        <w:t xml:space="preserve"> </w:t>
+      </w:r>
+    </w:p>
+    <w:p>
+      <w:pPr>
+        <w:pStyle w:val="NormalWeb"/>
+        <w:ind w:left="360"/>
+        <w:rPr>
+          <w:lang w:val="mn-MN"/>
+        </w:rPr>
+      </w:pPr>
+    </w:p>
+    <w:p>
+      <w:pPr>
+        <w:pStyle w:val="NormalWeb"/>
+        <w:ind w:left="360"/>
+        <w:rPr>
+          <w:lang w:val="mn-MN"/>
+        </w:rPr>
+      </w:pPr>
+      <w:r>
+        <w:t xml:space="preserve">Channel </w:t>
+      </w:r>
+      <w:r>
+        <w:rPr>
+          <w:lang w:val="mn-MN"/>
+        </w:rPr>
+        <w:t>болон</w:t>
+      </w:r>
+      <w:r>
+        <w:t xml:space="preserve"> Telegramm </w:t>
+      </w:r>
+      <w:r>
+        <w:rPr>
+          <w:lang w:val="mn-MN"/>
+        </w:rPr>
+        <w:t xml:space="preserve">хөгжүүлэх талаар асуух. </w:t>
+      </w:r>
+      <w:r>
+        <w:t xml:space="preserve">Subsciption fee </w:t>
+      </w:r>
+      <w:r>
+        <w:rPr>
+          <w:lang w:val="mn-MN"/>
+        </w:rPr>
+        <w:t>яаж орж ирдэг вэ. Ирсэнийг яаж мэдэх вэ. Түрийвч нээх үү.</w:t>
+      </w:r>
+    </w:p>
+    <w:p>
+      <w:pPr>
+        <w:pStyle w:val="NormalWeb"/>
+        <w:ind w:left="360"/>
+        <w:rPr>
+          <w:lang w:val="mn-MN"/>
+        </w:rPr>
+      </w:pPr>
+    </w:p>
+    <w:p>
+      <w:pPr>
+        <w:spacing w:before="100" w:beforeAutospacing="1" w:after="100" w:afterAutospacing="1" w:line="240" w:lineRule="auto"/>
+        <w:rPr>
+          <w:rFonts w:ascii="Times New Roman" w:eastAsia="Times New Roman" w:hAnsi="Times New Roman" w:cs="Times New Roman"/>
+          <w:sz w:val="24"/>
+          <w:szCs w:val="24"/>
+        </w:rPr>
+      </w:pPr>
+      <w:r>
+        <w:rPr>
+          <w:rFonts w:ascii="Times New Roman" w:eastAsia="Times New Roman" w:hAnsi="Times New Roman" w:cs="Times New Roman"/>
+          <w:sz w:val="24"/>
+          <w:szCs w:val="24"/>
+        </w:rPr>
+        <w:t>Одоо апп-ын байдал:</w:t>
+      </w:r>
+    </w:p>
+    <w:p>
+      <w:pPr>
+        <w:numPr>
+          <w:ilvl w:val="0"/>
+          <w:numId w:val="3"/>
+        </w:numPr>
+        <w:spacing w:before="100" w:beforeAutospacing="1" w:after="100" w:afterAutospacing="1" w:line="240" w:lineRule="auto"/>
+        <w:rPr>
+          <w:rFonts w:ascii="Times New Roman" w:eastAsia="Times New Roman" w:hAnsi="Times New Roman" w:cs="Times New Roman"/>
+          <w:sz w:val="24"/>
+          <w:szCs w:val="24"/>
+        </w:rPr>
+      </w:pPr>
+      <w:r>
+        <w:rPr>
+          <w:rFonts w:ascii="Segoe UI Symbol" w:eastAsia="Times New Roman" w:hAnsi="Segoe UI Symbol" w:cs="Segoe UI Symbol"/>
+          <w:sz w:val="24"/>
+          <w:szCs w:val="24"/>
+        </w:rPr>
+        <w:t>✅</w:t>
+      </w:r>
+      <w:r>
+        <w:rPr>
+          <w:rFonts w:ascii="Times New Roman" w:eastAsia="Times New Roman" w:hAnsi="Times New Roman" w:cs="Times New Roman"/>
+          <w:sz w:val="24"/>
+          <w:szCs w:val="24"/>
+        </w:rPr>
+        <w:t xml:space="preserve"> Барилдааны нэр нэмэх, засах, устгах</w:t>
+      </w:r>
+    </w:p>
+    <w:p>
+      <w:pPr>
+        <w:numPr>
+          <w:ilvl w:val="0"/>
+          <w:numId w:val="3"/>
+        </w:numPr>
+        <w:spacing w:before="100" w:beforeAutospacing="1" w:after="100" w:afterAutospacing="1" w:line="240" w:lineRule="auto"/>
+        <w:rPr>
+          <w:rFonts w:ascii="Times New Roman" w:eastAsia="Times New Roman" w:hAnsi="Times New Roman" w:cs="Times New Roman"/>
+          <w:sz w:val="24"/>
+          <w:szCs w:val="24"/>
+        </w:rPr>
+      </w:pPr>
+      <w:r>
+        <w:rPr>
+          <w:rFonts w:ascii="Segoe UI Symbol" w:eastAsia="Times New Roman" w:hAnsi="Segoe UI Symbol" w:cs="Segoe UI Symbol"/>
+          <w:sz w:val="24"/>
+          <w:szCs w:val="24"/>
+        </w:rPr>
+        <w:t>✅</w:t>
+      </w:r>
+      <w:r>
+        <w:rPr>
+          <w:rFonts w:ascii="Times New Roman" w:eastAsia="Times New Roman" w:hAnsi="Times New Roman" w:cs="Times New Roman"/>
+          <w:sz w:val="24"/>
+          <w:szCs w:val="24"/>
+        </w:rPr>
+        <w:t xml:space="preserve"> Барилдаан бүлгээр харагдах</w:t>
+      </w:r>
+    </w:p>
+    <w:p>
+      <w:pPr>
+        <w:numPr>
+          <w:ilvl w:val="0"/>
+          <w:numId w:val="3"/>
+        </w:numPr>
+        <w:spacing w:before="100" w:beforeAutospacing="1" w:after="100" w:afterAutospacing="1" w:line="240" w:lineRule="auto"/>
+        <w:rPr>
+          <w:rFonts w:ascii="Times New Roman" w:eastAsia="Times New Roman" w:hAnsi="Times New Roman" w:cs="Times New Roman"/>
+          <w:sz w:val="24"/>
+          <w:szCs w:val="24"/>
+        </w:rPr>
+      </w:pPr>
+      <w:r>
+        <w:rPr>
+          <w:rFonts w:ascii="Segoe UI Symbol" w:eastAsia="Times New Roman" w:hAnsi="Segoe UI Symbol" w:cs="Segoe UI Symbol"/>
+          <w:sz w:val="24"/>
+          <w:szCs w:val="24"/>
+        </w:rPr>
+        <w:t>✅</w:t>
+      </w:r>
+      <w:r>
+        <w:rPr>
+          <w:rFonts w:ascii="Times New Roman" w:eastAsia="Times New Roman" w:hAnsi="Times New Roman" w:cs="Times New Roman"/>
+          <w:sz w:val="24"/>
+          <w:szCs w:val="24"/>
+        </w:rPr>
+        <w:t xml:space="preserve"> Санал өгөх (subscription шаардана)</w:t>
+      </w:r>
+    </w:p>
+    <w:p>
+      <w:pPr>
+        <w:numPr>
+          <w:ilvl w:val="0"/>
+          <w:numId w:val="3"/>
+        </w:numPr>
+        <w:spacing w:before="100" w:beforeAutospacing="1" w:after="100" w:afterAutospacing="1" w:line="240" w:lineRule="auto"/>
+        <w:rPr>
+          <w:rFonts w:ascii="Times New Roman" w:eastAsia="Times New Roman" w:hAnsi="Times New Roman" w:cs="Times New Roman"/>
+          <w:sz w:val="24"/>
+          <w:szCs w:val="24"/>
+        </w:rPr>
+      </w:pPr>
+      <w:r>
+        <w:rPr>
+          <w:rFonts w:ascii="Segoe UI Symbol" w:eastAsia="Times New Roman" w:hAnsi="Segoe UI Symbol" w:cs="Segoe UI Symbol"/>
+          <w:sz w:val="24"/>
+          <w:szCs w:val="24"/>
+        </w:rPr>
+        <w:t>✅</w:t>
+      </w:r>
+      <w:r>
+        <w:rPr>
+          <w:rFonts w:ascii="Times New Roman" w:eastAsia="Times New Roman" w:hAnsi="Times New Roman" w:cs="Times New Roman"/>
+          <w:sz w:val="24"/>
+          <w:szCs w:val="24"/>
+        </w:rPr>
+        <w:t xml:space="preserve"> Админ — давлаа тэмдэглэх</w:t>
+      </w:r>
+    </w:p>
+    <w:p>
+      <w:pPr>
+        <w:numPr>
+          <w:ilvl w:val="0"/>
+          <w:numId w:val="3"/>
+        </w:numPr>
+        <w:spacing w:before="100" w:beforeAutospacing="1" w:after="100" w:afterAutospacing="1" w:line="240" w:lineRule="auto"/>
+        <w:rPr>
+          <w:rFonts w:ascii="Times New Roman" w:eastAsia="Times New Roman" w:hAnsi="Times New Roman" w:cs="Times New Roman"/>
+          <w:sz w:val="24"/>
+          <w:szCs w:val="24"/>
+        </w:rPr>
+      </w:pPr>
+      <w:r>
+        <w:rPr>
+          <w:rFonts w:ascii="Segoe UI Symbol" w:eastAsia="Times New Roman" w:hAnsi="Segoe UI Symbol" w:cs="Segoe UI Symbol"/>
+          <w:sz w:val="24"/>
+          <w:szCs w:val="24"/>
+        </w:rPr>
+        <w:t>✅</w:t>
+      </w:r>
+      <w:r>
+        <w:rPr>
+          <w:rFonts w:ascii="Times New Roman" w:eastAsia="Times New Roman" w:hAnsi="Times New Roman" w:cs="Times New Roman"/>
+          <w:sz w:val="24"/>
+          <w:szCs w:val="24"/>
+        </w:rPr>
+        <w:t xml:space="preserve"> Цол, дэвжээний бүрэн жагсаал</w:t>
+      </w:r>
+    </w:p>
+    <w:p>
+      <w:pPr>
+        <w:spacing w:before="100" w:beforeAutospacing="1" w:after="100" w:afterAutospacing="1" w:line="240" w:lineRule="auto"/>
+        <w:rPr>
+          <w:rFonts w:ascii="Times New Roman" w:eastAsia="Times New Roman" w:hAnsi="Times New Roman" w:cs="Times New Roman"/>
+          <w:sz w:val="24"/>
+          <w:szCs w:val="24"/>
+        </w:rPr>
+      </w:pPr>
+      <w:r>
+        <w:rPr>
+          <w:rFonts w:ascii="Times New Roman" w:eastAsia="Times New Roman" w:hAnsi="Times New Roman" w:cs="Times New Roman"/>
+          <w:sz w:val="24"/>
+          <w:szCs w:val="24"/>
+        </w:rPr>
+        <w:t>Шинэ функцүүд:</w:t>
+      </w:r>
+    </w:p>
+    <w:p>
+      <w:pPr>
+        <w:numPr>
+          <w:ilvl w:val="0"/>
+          <w:numId w:val="4"/>
+        </w:numPr>
+        <w:spacing w:before="100" w:beforeAutospacing="1" w:after="100" w:afterAutospacing="1" w:line="240" w:lineRule="auto"/>
+        <w:rPr>
+          <w:rFonts w:ascii="Times New Roman" w:eastAsia="Times New Roman" w:hAnsi="Times New Roman" w:cs="Times New Roman"/>
+          <w:sz w:val="24"/>
+          <w:szCs w:val="24"/>
+        </w:rPr>
+      </w:pPr>
+      <w:r>
+        <w:rPr>
+          <w:rFonts w:ascii="Segoe UI Symbol" w:eastAsia="Times New Roman" w:hAnsi="Segoe UI Symbol" w:cs="Segoe UI Symbol"/>
+          <w:sz w:val="24"/>
+          <w:szCs w:val="24"/>
+        </w:rPr>
+        <w:t>✅</w:t>
+      </w:r>
+      <w:r>
+        <w:rPr>
+          <w:rFonts w:ascii="Times New Roman" w:eastAsia="Times New Roman" w:hAnsi="Times New Roman" w:cs="Times New Roman"/>
+          <w:sz w:val="24"/>
+          <w:szCs w:val="24"/>
+        </w:rPr>
+        <w:t xml:space="preserve"> </w:t>
+      </w:r>
+      <w:r>
+        <w:rPr>
+          <w:rFonts w:ascii="Segoe UI Symbol" w:eastAsia="Times New Roman" w:hAnsi="Segoe UI Symbol" w:cs="Segoe UI Symbol"/>
+          <w:b/>
+          <w:bCs/>
+          <w:sz w:val="24"/>
+          <w:szCs w:val="24"/>
+        </w:rPr>
+        <w:t>🏆</w:t>
+      </w:r>
+      <w:r>
+        <w:rPr>
+          <w:rFonts w:ascii="Times New Roman" w:eastAsia="Times New Roman" w:hAnsi="Times New Roman" w:cs="Times New Roman"/>
+          <w:b/>
+          <w:bCs/>
+          <w:sz w:val="24"/>
+          <w:szCs w:val="24"/>
+        </w:rPr>
+        <w:t xml:space="preserve"> Наадам</w:t>
+      </w:r>
+      <w:r>
+        <w:rPr>
+          <w:rFonts w:ascii="Times New Roman" w:eastAsia="Times New Roman" w:hAnsi="Times New Roman" w:cs="Times New Roman"/>
+          <w:sz w:val="24"/>
+          <w:szCs w:val="24"/>
+        </w:rPr>
+        <w:t xml:space="preserve"> tab нэмэгдлээ</w:t>
+      </w:r>
+    </w:p>
+    <w:p>
+      <w:pPr>
+        <w:numPr>
+          <w:ilvl w:val="0"/>
+          <w:numId w:val="4"/>
+        </w:numPr>
+        <w:spacing w:before="100" w:beforeAutospacing="1" w:after="100" w:afterAutospacing="1" w:line="240" w:lineRule="auto"/>
+        <w:rPr>
+          <w:rFonts w:ascii="Times New Roman" w:eastAsia="Times New Roman" w:hAnsi="Times New Roman" w:cs="Times New Roman"/>
+          <w:sz w:val="24"/>
+          <w:szCs w:val="24"/>
+        </w:rPr>
+      </w:pPr>
+      <w:r>
+        <w:rPr>
+          <w:rFonts w:ascii="Segoe UI Symbol" w:eastAsia="Times New Roman" w:hAnsi="Segoe UI Symbol" w:cs="Segoe UI Symbol"/>
+          <w:sz w:val="24"/>
+          <w:szCs w:val="24"/>
+        </w:rPr>
+        <w:t>✅</w:t>
+      </w:r>
+      <w:r>
+        <w:rPr>
+          <w:rFonts w:ascii="Times New Roman" w:eastAsia="Times New Roman" w:hAnsi="Times New Roman" w:cs="Times New Roman"/>
+          <w:sz w:val="24"/>
+          <w:szCs w:val="24"/>
+        </w:rPr>
+        <w:t xml:space="preserve"> 5,6,7,8,9-р давааны бөхчүүд</w:t>
+      </w:r>
+    </w:p>
+    <w:p>
+      <w:pPr>
+        <w:numPr>
+          <w:ilvl w:val="0"/>
+          <w:numId w:val="4"/>
+        </w:numPr>
+        <w:spacing w:before="100" w:beforeAutospacing="1" w:after="100" w:afterAutospacing="1" w:line="240" w:lineRule="auto"/>
+        <w:rPr>
+          <w:rFonts w:ascii="Times New Roman" w:eastAsia="Times New Roman" w:hAnsi="Times New Roman" w:cs="Times New Roman"/>
+          <w:sz w:val="24"/>
+          <w:szCs w:val="24"/>
+        </w:rPr>
+      </w:pPr>
+      <w:r>
+        <w:rPr>
+          <w:rFonts w:ascii="Segoe UI Symbol" w:eastAsia="Times New Roman" w:hAnsi="Segoe UI Symbol" w:cs="Segoe UI Symbol"/>
+          <w:sz w:val="24"/>
+          <w:szCs w:val="24"/>
+        </w:rPr>
+        <w:t>✅</w:t>
+      </w:r>
+      <w:r>
+        <w:rPr>
+          <w:rFonts w:ascii="Times New Roman" w:eastAsia="Times New Roman" w:hAnsi="Times New Roman" w:cs="Times New Roman"/>
+          <w:sz w:val="24"/>
+          <w:szCs w:val="24"/>
+        </w:rPr>
+        <w:t xml:space="preserve"> Цол, дэвжээгээр filter хийх</w:t>
+      </w:r>
+    </w:p>
+    <w:p>
+      <w:pPr>
+        <w:numPr>
+          <w:ilvl w:val="0"/>
+          <w:numId w:val="4"/>
+        </w:numPr>
+        <w:spacing w:before="100" w:beforeAutospacing="1" w:after="100" w:afterAutospacing="1" w:line="240" w:lineRule="auto"/>
+        <w:rPr>
+          <w:rFonts w:ascii="Times New Roman" w:eastAsia="Times New Roman" w:hAnsi="Times New Roman" w:cs="Times New Roman"/>
+          <w:sz w:val="24"/>
+          <w:szCs w:val="24"/>
+        </w:rPr>
+      </w:pPr>
+      <w:r>
+        <w:rPr>
+          <w:rFonts w:ascii="Segoe UI Symbol" w:eastAsia="Times New Roman" w:hAnsi="Segoe UI Symbol" w:cs="Segoe UI Symbol"/>
+          <w:sz w:val="24"/>
+          <w:szCs w:val="24"/>
+        </w:rPr>
+        <w:t>✅</w:t>
+      </w:r>
+      <w:r>
+        <w:rPr>
+          <w:rFonts w:ascii="Times New Roman" w:eastAsia="Times New Roman" w:hAnsi="Times New Roman" w:cs="Times New Roman"/>
+          <w:sz w:val="24"/>
+          <w:szCs w:val="24"/>
+        </w:rPr>
+        <w:t xml:space="preserve"> Checkbox-оор санал өгөх, цуцлах</w:t>
+      </w:r>
+    </w:p>
+    <w:p>
+      <w:pPr>
+        <w:numPr>
+          <w:ilvl w:val="0"/>
+          <w:numId w:val="4"/>
+        </w:numPr>
+        <w:spacing w:before="100" w:beforeAutospacing="1" w:after="100" w:afterAutospacing="1" w:line="240" w:lineRule="auto"/>
+        <w:rPr>
+          <w:rFonts w:ascii="Times New Roman" w:eastAsia="Times New Roman" w:hAnsi="Times New Roman" w:cs="Times New Roman"/>
+          <w:sz w:val="24"/>
+          <w:szCs w:val="24"/>
+        </w:rPr>
+      </w:pPr>
+      <w:r>
+        <w:rPr>
+          <w:rFonts w:ascii="Segoe UI Symbol" w:eastAsia="Times New Roman" w:hAnsi="Segoe UI Symbol" w:cs="Segoe UI Symbol"/>
+          <w:sz w:val="24"/>
+          <w:szCs w:val="24"/>
+        </w:rPr>
+        <w:t>✅</w:t>
+      </w:r>
+      <w:r>
+        <w:rPr>
+          <w:rFonts w:ascii="Times New Roman" w:eastAsia="Times New Roman" w:hAnsi="Times New Roman" w:cs="Times New Roman"/>
+          <w:sz w:val="24"/>
+          <w:szCs w:val="24"/>
+        </w:rPr>
+        <w:t xml:space="preserve"> Жагсаалтад байхгүй бол өөрөө бичих</w:t>
+      </w:r>
+    </w:p>
+    <w:p>
+      <w:pPr>
+        <w:numPr>
+          <w:ilvl w:val="0"/>
+          <w:numId w:val="4"/>
+        </w:numPr>
+        <w:spacing w:before="100" w:beforeAutospacing="1" w:after="100" w:afterAutospacing="1" w:line="240" w:lineRule="auto"/>
+        <w:rPr>
+          <w:rFonts w:ascii="Times New Roman" w:eastAsia="Times New Roman" w:hAnsi="Times New Roman" w:cs="Times New Roman"/>
+          <w:sz w:val="24"/>
+          <w:szCs w:val="24"/>
+        </w:rPr>
+      </w:pPr>
+      <w:r>
+        <w:rPr>
+          <w:rFonts w:ascii="Segoe UI Symbol" w:eastAsia="Times New Roman" w:hAnsi="Segoe UI Symbol" w:cs="Segoe UI Symbol"/>
+          <w:sz w:val="24"/>
+          <w:szCs w:val="24"/>
+        </w:rPr>
+        <w:t>✅</w:t>
+      </w:r>
+      <w:r>
+        <w:rPr>
+          <w:rFonts w:ascii="Times New Roman" w:eastAsia="Times New Roman" w:hAnsi="Times New Roman" w:cs="Times New Roman"/>
+          <w:sz w:val="24"/>
+          <w:szCs w:val="24"/>
+        </w:rPr>
+        <w:t xml:space="preserve"> Админ бөх нэмэх, устгах, давагч тэмдэглэх</w:t>
+      </w:r>
+    </w:p>
+    <w:p>
+      <w:pPr>
+        <w:spacing w:before="100" w:beforeAutospacing="1" w:after="100" w:afterAutospacing="1" w:line="240" w:lineRule="auto"/>
+        <w:rPr>
+          <w:rFonts w:ascii="Times New Roman" w:eastAsia="Times New Roman" w:hAnsi="Times New Roman" w:cs="Times New Roman"/>
+          <w:sz w:val="24"/>
+          <w:szCs w:val="24"/>
+        </w:rPr>
+      </w:pPr>
+      <w:r>
+        <w:rPr>
+          <w:rFonts w:ascii="Times New Roman" w:eastAsia="Times New Roman" w:hAnsi="Times New Roman" w:cs="Times New Roman"/>
+          <w:sz w:val="24"/>
+          <w:szCs w:val="24"/>
+        </w:rPr>
+        <w:t>Шинэ функцүүд:</w:t>
+      </w:r>
+    </w:p>
+    <w:p>
+      <w:pPr>
+        <w:numPr>
+          <w:ilvl w:val="0"/>
+          <w:numId w:val="6"/>
+        </w:numPr>
+        <w:spacing w:before="100" w:beforeAutospacing="1" w:after="100" w:afterAutospacing="1" w:line="240" w:lineRule="auto"/>
+        <w:rPr>
+          <w:rFonts w:ascii="Times New Roman" w:eastAsia="Times New Roman" w:hAnsi="Times New Roman" w:cs="Times New Roman"/>
+          <w:sz w:val="24"/>
+          <w:szCs w:val="24"/>
+        </w:rPr>
+      </w:pPr>
+      <w:r>
+        <w:rPr>
+          <w:rFonts w:ascii="Segoe UI Symbol" w:eastAsia="Times New Roman" w:hAnsi="Segoe UI Symbol" w:cs="Segoe UI Symbol"/>
+          <w:sz w:val="24"/>
+          <w:szCs w:val="24"/>
+        </w:rPr>
+        <w:t>✅</w:t>
+      </w:r>
+      <w:r>
+        <w:rPr>
+          <w:rFonts w:ascii="Times New Roman" w:eastAsia="Times New Roman" w:hAnsi="Times New Roman" w:cs="Times New Roman"/>
+          <w:sz w:val="24"/>
+          <w:szCs w:val="24"/>
+        </w:rPr>
+        <w:t xml:space="preserve"> </w:t>
+      </w:r>
+      <w:r>
+        <w:rPr>
+          <w:rFonts w:ascii="Segoe UI Symbol" w:eastAsia="Times New Roman" w:hAnsi="Segoe UI Symbol" w:cs="Segoe UI Symbol"/>
+          <w:b/>
+          <w:bCs/>
+          <w:sz w:val="24"/>
+          <w:szCs w:val="24"/>
+        </w:rPr>
+        <w:t>🏆</w:t>
+      </w:r>
+      <w:r>
+        <w:rPr>
+          <w:rFonts w:ascii="Times New Roman" w:eastAsia="Times New Roman" w:hAnsi="Times New Roman" w:cs="Times New Roman"/>
+          <w:b/>
+          <w:bCs/>
+          <w:sz w:val="24"/>
+          <w:szCs w:val="24"/>
+        </w:rPr>
+        <w:t xml:space="preserve"> Байр</w:t>
+      </w:r>
+      <w:r>
+        <w:rPr>
+          <w:rFonts w:ascii="Times New Roman" w:eastAsia="Times New Roman" w:hAnsi="Times New Roman" w:cs="Times New Roman"/>
+          <w:sz w:val="24"/>
+          <w:szCs w:val="24"/>
+        </w:rPr>
+        <w:t xml:space="preserve"> — Leaderboard, оноо, шагнал</w:t>
+      </w:r>
+    </w:p>
+    <w:p>
+      <w:pPr>
+        <w:numPr>
+          <w:ilvl w:val="0"/>
+          <w:numId w:val="6"/>
+        </w:numPr>
+        <w:spacing w:before="100" w:beforeAutospacing="1" w:after="100" w:afterAutospacing="1" w:line="240" w:lineRule="auto"/>
+        <w:rPr>
+          <w:rFonts w:ascii="Times New Roman" w:eastAsia="Times New Roman" w:hAnsi="Times New Roman" w:cs="Times New Roman"/>
+          <w:sz w:val="24"/>
+          <w:szCs w:val="24"/>
+        </w:rPr>
+      </w:pPr>
+      <w:r>
+        <w:rPr>
+          <w:rFonts w:ascii="Segoe UI Symbol" w:eastAsia="Times New Roman" w:hAnsi="Segoe UI Symbol" w:cs="Segoe UI Symbol"/>
+          <w:sz w:val="24"/>
+          <w:szCs w:val="24"/>
+        </w:rPr>
+        <w:t>✅</w:t>
+      </w:r>
+      <w:r>
+        <w:rPr>
+          <w:rFonts w:ascii="Times New Roman" w:eastAsia="Times New Roman" w:hAnsi="Times New Roman" w:cs="Times New Roman"/>
+          <w:sz w:val="24"/>
+          <w:szCs w:val="24"/>
+        </w:rPr>
+        <w:t xml:space="preserve"> </w:t>
+      </w:r>
+      <w:r>
+        <w:rPr>
+          <w:rFonts w:ascii="Segoe UI Symbol" w:eastAsia="Times New Roman" w:hAnsi="Segoe UI Symbol" w:cs="Segoe UI Symbol"/>
+          <w:b/>
+          <w:bCs/>
+          <w:sz w:val="24"/>
+          <w:szCs w:val="24"/>
+        </w:rPr>
+        <w:t>👤</w:t>
+      </w:r>
+      <w:r>
+        <w:rPr>
+          <w:rFonts w:ascii="Times New Roman" w:eastAsia="Times New Roman" w:hAnsi="Times New Roman" w:cs="Times New Roman"/>
+          <w:b/>
+          <w:bCs/>
+          <w:sz w:val="24"/>
+          <w:szCs w:val="24"/>
+        </w:rPr>
+        <w:t xml:space="preserve"> Профайл</w:t>
+      </w:r>
+      <w:r>
+        <w:rPr>
+          <w:rFonts w:ascii="Times New Roman" w:eastAsia="Times New Roman" w:hAnsi="Times New Roman" w:cs="Times New Roman"/>
+          <w:sz w:val="24"/>
+          <w:szCs w:val="24"/>
+        </w:rPr>
+        <w:t xml:space="preserve"> — Өөрийн оноо, байр, статистик</w:t>
+      </w:r>
+    </w:p>
+    <w:p>
+      <w:pPr>
+        <w:numPr>
+          <w:ilvl w:val="0"/>
+          <w:numId w:val="6"/>
+        </w:numPr>
+        <w:spacing w:before="100" w:beforeAutospacing="1" w:after="100" w:afterAutospacing="1" w:line="240" w:lineRule="auto"/>
+        <w:rPr>
+          <w:rFonts w:ascii="Times New Roman" w:eastAsia="Times New Roman" w:hAnsi="Times New Roman" w:cs="Times New Roman"/>
+          <w:sz w:val="24"/>
+          <w:szCs w:val="24"/>
+        </w:rPr>
+      </w:pPr>
+      <w:r>
+        <w:rPr>
+          <w:rFonts w:ascii="Segoe UI Symbol" w:eastAsia="Times New Roman" w:hAnsi="Segoe UI Symbol" w:cs="Segoe UI Symbol"/>
+          <w:sz w:val="24"/>
+          <w:szCs w:val="24"/>
+        </w:rPr>
+        <w:t>✅</w:t>
+      </w:r>
+      <w:r>
+        <w:rPr>
+          <w:rFonts w:ascii="Times New Roman" w:eastAsia="Times New Roman" w:hAnsi="Times New Roman" w:cs="Times New Roman"/>
+          <w:sz w:val="24"/>
+          <w:szCs w:val="24"/>
+        </w:rPr>
+        <w:t xml:space="preserve"> </w:t>
+      </w:r>
+      <w:r>
+        <w:rPr>
+          <w:rFonts w:ascii="Times New Roman" w:eastAsia="Times New Roman" w:hAnsi="Times New Roman" w:cs="Times New Roman"/>
+          <w:b/>
+          <w:bCs/>
+          <w:sz w:val="24"/>
+          <w:szCs w:val="24"/>
+        </w:rPr>
+        <w:t>🤼 Таавар</w:t>
+      </w:r>
+      <w:r>
+        <w:rPr>
+          <w:rFonts w:ascii="Times New Roman" w:eastAsia="Times New Roman" w:hAnsi="Times New Roman" w:cs="Times New Roman"/>
+          <w:sz w:val="24"/>
+          <w:szCs w:val="24"/>
+        </w:rPr>
+        <w:t xml:space="preserve"> — Барилдаан + Наадам</w:t>
+      </w:r>
+    </w:p>
+    <w:p>
+      <w:pPr>
+        <w:numPr>
+          <w:ilvl w:val="0"/>
+          <w:numId w:val="6"/>
+        </w:numPr>
+        <w:spacing w:before="100" w:beforeAutospacing="1" w:after="100" w:afterAutospacing="1" w:line="240" w:lineRule="auto"/>
+        <w:rPr>
+          <w:rFonts w:ascii="Times New Roman" w:eastAsia="Times New Roman" w:hAnsi="Times New Roman" w:cs="Times New Roman"/>
+          <w:sz w:val="24"/>
+          <w:szCs w:val="24"/>
+        </w:rPr>
+      </w:pPr>
+      <w:r>
+        <w:rPr>
+          <w:rFonts w:ascii="Segoe UI Symbol" w:eastAsia="Times New Roman" w:hAnsi="Segoe UI Symbol" w:cs="Segoe UI Symbol"/>
+          <w:sz w:val="24"/>
+          <w:szCs w:val="24"/>
+        </w:rPr>
+        <w:t>✅</w:t>
+      </w:r>
+      <w:r>
+        <w:rPr>
+          <w:rFonts w:ascii="Times New Roman" w:eastAsia="Times New Roman" w:hAnsi="Times New Roman" w:cs="Times New Roman"/>
+          <w:sz w:val="24"/>
+          <w:szCs w:val="24"/>
+        </w:rPr>
+        <w:t xml:space="preserve"> </w:t>
+      </w:r>
+      <w:r>
+        <w:rPr>
+          <w:rFonts w:ascii="Segoe UI Symbol" w:eastAsia="Times New Roman" w:hAnsi="Segoe UI Symbol" w:cs="Segoe UI Symbol"/>
+          <w:b/>
+          <w:bCs/>
+          <w:sz w:val="24"/>
+          <w:szCs w:val="24"/>
+        </w:rPr>
+        <w:t>💰</w:t>
+      </w:r>
+      <w:r>
+        <w:rPr>
+          <w:rFonts w:ascii="Times New Roman" w:eastAsia="Times New Roman" w:hAnsi="Times New Roman" w:cs="Times New Roman"/>
+          <w:b/>
+          <w:bCs/>
+          <w:sz w:val="24"/>
+          <w:szCs w:val="24"/>
+        </w:rPr>
+        <w:t xml:space="preserve"> Дүрэм</w:t>
+      </w:r>
+      <w:r>
+        <w:rPr>
+          <w:rFonts w:ascii="Times New Roman" w:eastAsia="Times New Roman" w:hAnsi="Times New Roman" w:cs="Times New Roman"/>
+          <w:sz w:val="24"/>
+          <w:szCs w:val="24"/>
+        </w:rPr>
+        <w:t xml:space="preserve"> — Шагналын дүрэм, тооцоолол</w:t>
+      </w:r>
+    </w:p>
+    <w:p>
+      <w:pPr>
+        <w:numPr>
+          <w:ilvl w:val="0"/>
+          <w:numId w:val="6"/>
+        </w:numPr>
+        <w:spacing w:before="100" w:beforeAutospacing="1" w:after="100" w:afterAutospacing="1" w:line="240" w:lineRule="auto"/>
+        <w:rPr>
+          <w:rFonts w:ascii="Times New Roman" w:eastAsia="Times New Roman" w:hAnsi="Times New Roman" w:cs="Times New Roman"/>
+          <w:sz w:val="24"/>
+          <w:szCs w:val="24"/>
+        </w:rPr>
+      </w:pPr>
+      <w:r>
+        <w:rPr>
+          <w:rFonts w:ascii="Segoe UI Symbol" w:eastAsia="Times New Roman" w:hAnsi="Segoe UI Symbol" w:cs="Segoe UI Symbol"/>
+          <w:sz w:val="24"/>
+          <w:szCs w:val="24"/>
+        </w:rPr>
+        <w:t>✅</w:t>
+      </w:r>
+      <w:r>
+        <w:rPr>
+          <w:rFonts w:ascii="Times New Roman" w:eastAsia="Times New Roman" w:hAnsi="Times New Roman" w:cs="Times New Roman"/>
+          <w:sz w:val="24"/>
+          <w:szCs w:val="24"/>
+        </w:rPr>
+        <w:t xml:space="preserve"> Доод талд </w:t>
+      </w:r>
+      <w:r>
+        <w:rPr>
+          <w:rFonts w:ascii="Times New Roman" w:eastAsia="Times New Roman" w:hAnsi="Times New Roman" w:cs="Times New Roman"/>
+          <w:b/>
+          <w:bCs/>
+          <w:sz w:val="24"/>
+          <w:szCs w:val="24"/>
+        </w:rPr>
+        <w:t>fixed navigation bar</w:t>
+      </w:r>
+    </w:p>
+    <w:p>
+      <w:pPr>
+        <w:spacing w:before="100" w:beforeAutospacing="1" w:after="100" w:afterAutospacing="1" w:line="240" w:lineRule="auto"/>
+        <w:rPr>
+          <w:rFonts w:ascii="Times New Roman" w:eastAsia="Times New Roman" w:hAnsi="Times New Roman" w:cs="Times New Roman"/>
+          <w:sz w:val="24"/>
+          <w:szCs w:val="24"/>
+        </w:rPr>
+      </w:pPr>
+      <w:r>
+        <w:rPr>
+          <w:rFonts w:ascii="Times New Roman" w:eastAsia="Times New Roman" w:hAnsi="Times New Roman" w:cs="Times New Roman"/>
+          <w:sz w:val="24"/>
+          <w:szCs w:val="24"/>
+        </w:rPr>
+        <w:t>Шинэ функцүүд:</w:t>
+      </w:r>
+    </w:p>
+    <w:p>
+      <w:pPr>
+        <w:numPr>
+          <w:ilvl w:val="0"/>
+          <w:numId w:val="7"/>
+        </w:numPr>
+        <w:spacing w:before="100" w:beforeAutospacing="1" w:after="100" w:afterAutospacing="1" w:line="240" w:lineRule="auto"/>
+        <w:rPr>
+          <w:rFonts w:ascii="Times New Roman" w:eastAsia="Times New Roman" w:hAnsi="Times New Roman" w:cs="Times New Roman"/>
+          <w:sz w:val="24"/>
+          <w:szCs w:val="24"/>
+        </w:rPr>
+      </w:pPr>
+      <w:r>
+        <w:rPr>
+          <w:rFonts w:ascii="Segoe UI Symbol" w:eastAsia="Times New Roman" w:hAnsi="Segoe UI Symbol" w:cs="Segoe UI Symbol"/>
+          <w:sz w:val="24"/>
+          <w:szCs w:val="24"/>
+        </w:rPr>
+        <w:t>✅</w:t>
+      </w:r>
+      <w:r>
+        <w:rPr>
+          <w:rFonts w:ascii="Times New Roman" w:eastAsia="Times New Roman" w:hAnsi="Times New Roman" w:cs="Times New Roman"/>
+          <w:sz w:val="24"/>
+          <w:szCs w:val="24"/>
+        </w:rPr>
+        <w:t xml:space="preserve"> Барилдааны нэр </w:t>
+      </w:r>
+      <w:r>
+        <w:rPr>
+          <w:rFonts w:ascii="Times New Roman" w:eastAsia="Times New Roman" w:hAnsi="Times New Roman" w:cs="Times New Roman"/>
+          <w:b/>
+          <w:bCs/>
+          <w:sz w:val="24"/>
+          <w:szCs w:val="24"/>
+        </w:rPr>
+        <w:t>dropdown</w:t>
+      </w:r>
+      <w:r>
+        <w:rPr>
+          <w:rFonts w:ascii="Times New Roman" w:eastAsia="Times New Roman" w:hAnsi="Times New Roman" w:cs="Times New Roman"/>
+          <w:sz w:val="24"/>
+          <w:szCs w:val="24"/>
+        </w:rPr>
+        <w:t xml:space="preserve"> жагсаалтаас сонгоно</w:t>
+      </w:r>
+    </w:p>
+    <w:p>
+      <w:pPr>
+        <w:numPr>
+          <w:ilvl w:val="0"/>
+          <w:numId w:val="7"/>
+        </w:numPr>
+        <w:spacing w:before="100" w:beforeAutospacing="1" w:after="100" w:afterAutospacing="1" w:line="240" w:lineRule="auto"/>
+        <w:rPr>
+          <w:rFonts w:ascii="Times New Roman" w:eastAsia="Times New Roman" w:hAnsi="Times New Roman" w:cs="Times New Roman"/>
+          <w:sz w:val="24"/>
+          <w:szCs w:val="24"/>
+        </w:rPr>
+      </w:pPr>
+      <w:r>
+        <w:rPr>
+          <w:rFonts w:ascii="Segoe UI Symbol" w:eastAsia="Times New Roman" w:hAnsi="Segoe UI Symbol" w:cs="Segoe UI Symbol"/>
+          <w:sz w:val="24"/>
+          <w:szCs w:val="24"/>
+        </w:rPr>
+        <w:t>✅</w:t>
+      </w:r>
+      <w:r>
+        <w:rPr>
+          <w:rFonts w:ascii="Times New Roman" w:eastAsia="Times New Roman" w:hAnsi="Times New Roman" w:cs="Times New Roman"/>
+          <w:sz w:val="24"/>
+          <w:szCs w:val="24"/>
+        </w:rPr>
+        <w:t xml:space="preserve"> </w:t>
+      </w:r>
+      <w:r>
+        <w:rPr>
+          <w:rFonts w:ascii="Times New Roman" w:eastAsia="Times New Roman" w:hAnsi="Times New Roman" w:cs="Times New Roman"/>
+          <w:b/>
+          <w:bCs/>
+          <w:sz w:val="24"/>
+          <w:szCs w:val="24"/>
+        </w:rPr>
+        <w:t>Он</w:t>
+      </w:r>
+      <w:r>
+        <w:rPr>
+          <w:rFonts w:ascii="Times New Roman" w:eastAsia="Times New Roman" w:hAnsi="Times New Roman" w:cs="Times New Roman"/>
+          <w:sz w:val="24"/>
+          <w:szCs w:val="24"/>
+        </w:rPr>
+        <w:t xml:space="preserve"> талбар нэмэгдлээ</w:t>
+      </w:r>
+    </w:p>
+    <w:p>
+      <w:pPr>
+        <w:numPr>
+          <w:ilvl w:val="0"/>
+          <w:numId w:val="7"/>
+        </w:numPr>
+        <w:spacing w:before="100" w:beforeAutospacing="1" w:after="100" w:afterAutospacing="1" w:line="240" w:lineRule="auto"/>
+        <w:rPr>
+          <w:rFonts w:ascii="Times New Roman" w:eastAsia="Times New Roman" w:hAnsi="Times New Roman" w:cs="Times New Roman"/>
+          <w:sz w:val="24"/>
+          <w:szCs w:val="24"/>
+        </w:rPr>
+      </w:pPr>
+      <w:r>
+        <w:rPr>
+          <w:rFonts w:ascii="Segoe UI Symbol" w:eastAsia="Times New Roman" w:hAnsi="Segoe UI Symbol" w:cs="Segoe UI Symbol"/>
+          <w:sz w:val="24"/>
+          <w:szCs w:val="24"/>
+        </w:rPr>
+        <w:t>✅</w:t>
+      </w:r>
+      <w:r>
+        <w:rPr>
+          <w:rFonts w:ascii="Times New Roman" w:eastAsia="Times New Roman" w:hAnsi="Times New Roman" w:cs="Times New Roman"/>
+          <w:sz w:val="24"/>
+          <w:szCs w:val="24"/>
+        </w:rPr>
+        <w:t xml:space="preserve"> Нэр харагдахад </w:t>
+      </w:r>
+      <w:r>
+        <w:rPr>
+          <w:rFonts w:ascii="Times New Roman" w:eastAsia="Times New Roman" w:hAnsi="Times New Roman" w:cs="Times New Roman"/>
+          <w:b/>
+          <w:bCs/>
+          <w:sz w:val="24"/>
+          <w:szCs w:val="24"/>
+        </w:rPr>
+        <w:t>"2026 · Улсын наадам"</w:t>
+      </w:r>
+      <w:r>
+        <w:rPr>
+          <w:rFonts w:ascii="Times New Roman" w:eastAsia="Times New Roman" w:hAnsi="Times New Roman" w:cs="Times New Roman"/>
+          <w:sz w:val="24"/>
+          <w:szCs w:val="24"/>
+        </w:rPr>
+        <w:t xml:space="preserve"> гэж гарна</w:t>
+      </w:r>
+    </w:p>
+    <w:p>
+      <w:pPr>
+        <w:spacing w:before="100" w:beforeAutospacing="1" w:after="100" w:afterAutospacing="1" w:line="240" w:lineRule="auto"/>
+        <w:rPr>
+          <w:rFonts w:ascii="Times New Roman" w:eastAsia="Times New Roman" w:hAnsi="Times New Roman" w:cs="Times New Roman"/>
+          <w:sz w:val="24"/>
+          <w:szCs w:val="24"/>
+        </w:rPr>
+      </w:pPr>
+    </w:p>
+    <w:p>
+      <w:pPr>
+        <w:spacing w:before="100" w:beforeAutospacing="1" w:after="100" w:afterAutospacing="1" w:line="240" w:lineRule="auto"/>
+        <w:rPr>
+          <w:rFonts w:ascii="Times New Roman" w:eastAsia="Times New Roman" w:hAnsi="Times New Roman" w:cs="Times New Roman"/>
+          <w:sz w:val="24"/>
+          <w:szCs w:val="24"/>
+          <w:lang w:val="mn-MN"/>
+        </w:rPr>
+      </w:pPr>
+      <w:r>
+        <w:rPr>
+          <w:rFonts w:ascii="Times New Roman" w:eastAsia="Times New Roman" w:hAnsi="Times New Roman" w:cs="Times New Roman"/>
+          <w:sz w:val="24"/>
+          <w:szCs w:val="24"/>
+          <w:lang w:val="mn-MN"/>
+        </w:rPr>
+        <w:lastRenderedPageBreak/>
+        <w:t xml:space="preserve">Апп-ын </w:t>
+      </w:r>
+      <w:r>
+        <w:rPr>
+          <w:rFonts w:ascii="Times New Roman" w:eastAsia="Times New Roman" w:hAnsi="Times New Roman" w:cs="Times New Roman"/>
+          <w:sz w:val="24"/>
+          <w:szCs w:val="24"/>
+          <w:lang w:val="mn-MN"/>
+        </w:rPr>
+        <w:t>бүтцийг дараах байдлаар өөрчилье.</w:t>
+      </w:r>
+    </w:p>
+    <w:p>
+      <w:pPr>
+        <w:pStyle w:val="ListParagraph"/>
+        <w:numPr>
+          <w:ilvl w:val="0"/>
+          <w:numId w:val="8"/>
+        </w:numPr>
+        <w:spacing w:before="100" w:beforeAutospacing="1" w:after="100" w:afterAutospacing="1" w:line="240" w:lineRule="auto"/>
+        <w:rPr>
+          <w:rFonts w:ascii="Times New Roman" w:eastAsia="Times New Roman" w:hAnsi="Times New Roman" w:cs="Times New Roman"/>
+          <w:sz w:val="24"/>
+          <w:szCs w:val="24"/>
+          <w:lang w:val="mn-MN"/>
+        </w:rPr>
+      </w:pPr>
+      <w:r>
+        <w:rPr>
+          <w:rFonts w:ascii="Times New Roman" w:eastAsia="Times New Roman" w:hAnsi="Times New Roman" w:cs="Times New Roman"/>
+          <w:sz w:val="24"/>
+          <w:szCs w:val="24"/>
+          <w:lang w:val="mn-MN"/>
+        </w:rPr>
+        <w:t xml:space="preserve">Наадам </w:t>
+      </w:r>
+      <w:r>
+        <w:rPr>
+          <w:rFonts w:ascii="Times New Roman" w:eastAsia="Times New Roman" w:hAnsi="Times New Roman" w:cs="Times New Roman"/>
+          <w:sz w:val="24"/>
+          <w:szCs w:val="24"/>
+        </w:rPr>
+        <w:t>tab-</w:t>
+      </w:r>
+      <w:r>
+        <w:rPr>
+          <w:rFonts w:ascii="Times New Roman" w:eastAsia="Times New Roman" w:hAnsi="Times New Roman" w:cs="Times New Roman"/>
+          <w:sz w:val="24"/>
+          <w:szCs w:val="24"/>
+          <w:lang w:val="mn-MN"/>
+        </w:rPr>
+        <w:t xml:space="preserve">ын нэрийг өөрчилж, Таамаглал болгох. </w:t>
+      </w:r>
+    </w:p>
+    <w:p>
+      <w:pPr>
+        <w:pStyle w:val="ListParagraph"/>
+        <w:numPr>
+          <w:ilvl w:val="0"/>
+          <w:numId w:val="9"/>
+        </w:numPr>
+        <w:spacing w:before="100" w:beforeAutospacing="1" w:after="100" w:afterAutospacing="1" w:line="240" w:lineRule="auto"/>
+        <w:rPr>
+          <w:rFonts w:ascii="Times New Roman" w:eastAsia="Times New Roman" w:hAnsi="Times New Roman" w:cs="Times New Roman"/>
+          <w:sz w:val="24"/>
+          <w:szCs w:val="24"/>
+          <w:lang w:val="mn-MN"/>
+        </w:rPr>
+      </w:pPr>
+      <w:r>
+        <w:rPr>
+          <w:rFonts w:ascii="Times New Roman" w:eastAsia="Times New Roman" w:hAnsi="Times New Roman" w:cs="Times New Roman"/>
+          <w:sz w:val="24"/>
+          <w:szCs w:val="24"/>
+          <w:lang w:val="mn-MN"/>
+        </w:rPr>
+        <w:t>Таа</w:t>
+      </w:r>
+      <w:r>
+        <w:rPr>
+          <w:rFonts w:ascii="Times New Roman" w:eastAsia="Times New Roman" w:hAnsi="Times New Roman" w:cs="Times New Roman"/>
+          <w:sz w:val="24"/>
+          <w:szCs w:val="24"/>
+          <w:lang w:val="mn-MN"/>
+        </w:rPr>
+        <w:t xml:space="preserve">маглал </w:t>
+      </w:r>
+      <w:r>
+        <w:rPr>
+          <w:rFonts w:ascii="Times New Roman" w:eastAsia="Times New Roman" w:hAnsi="Times New Roman" w:cs="Times New Roman"/>
+          <w:sz w:val="24"/>
+          <w:szCs w:val="24"/>
+        </w:rPr>
+        <w:t>(</w:t>
+      </w:r>
+      <w:r>
+        <w:rPr>
+          <w:rFonts w:ascii="Times New Roman" w:eastAsia="Times New Roman" w:hAnsi="Times New Roman" w:cs="Times New Roman"/>
+          <w:sz w:val="24"/>
+          <w:szCs w:val="24"/>
+          <w:lang w:val="mn-MN"/>
+        </w:rPr>
+        <w:t xml:space="preserve">Наадам </w:t>
+      </w:r>
+      <w:r>
+        <w:rPr>
+          <w:rFonts w:ascii="Times New Roman" w:eastAsia="Times New Roman" w:hAnsi="Times New Roman" w:cs="Times New Roman"/>
+          <w:sz w:val="24"/>
+          <w:szCs w:val="24"/>
+        </w:rPr>
+        <w:t>tab-</w:t>
+      </w:r>
+      <w:r>
+        <w:rPr>
+          <w:rFonts w:ascii="Times New Roman" w:eastAsia="Times New Roman" w:hAnsi="Times New Roman" w:cs="Times New Roman"/>
+          <w:sz w:val="24"/>
+          <w:szCs w:val="24"/>
+          <w:lang w:val="mn-MN"/>
+        </w:rPr>
+        <w:t>ын нэрийг өөрчлөх</w:t>
+      </w:r>
+      <w:r>
+        <w:rPr>
+          <w:rFonts w:ascii="Times New Roman" w:eastAsia="Times New Roman" w:hAnsi="Times New Roman" w:cs="Times New Roman"/>
+          <w:sz w:val="24"/>
+          <w:szCs w:val="24"/>
+        </w:rPr>
+        <w:t>)</w:t>
+      </w:r>
+    </w:p>
+    <w:p>
+      <w:pPr>
+        <w:pStyle w:val="ListParagraph"/>
+        <w:numPr>
+          <w:ilvl w:val="1"/>
+          <w:numId w:val="9"/>
+        </w:numPr>
+        <w:spacing w:before="100" w:beforeAutospacing="1" w:after="100" w:afterAutospacing="1" w:line="240" w:lineRule="auto"/>
+        <w:rPr>
+          <w:rFonts w:ascii="Times New Roman" w:eastAsia="Times New Roman" w:hAnsi="Times New Roman" w:cs="Times New Roman"/>
+          <w:sz w:val="24"/>
+          <w:szCs w:val="24"/>
+          <w:lang w:val="mn-MN"/>
+        </w:rPr>
+      </w:pPr>
+      <w:r>
+        <w:rPr>
+          <w:rFonts w:ascii="Times New Roman" w:eastAsia="Times New Roman" w:hAnsi="Times New Roman" w:cs="Times New Roman"/>
+          <w:sz w:val="24"/>
+          <w:szCs w:val="24"/>
+          <w:lang w:val="mn-MN"/>
+        </w:rPr>
+        <w:t>Барилдаан 1</w:t>
+      </w:r>
+    </w:p>
+    <w:p>
+      <w:pPr>
+        <w:pStyle w:val="ListParagraph"/>
+        <w:numPr>
+          <w:ilvl w:val="2"/>
+          <w:numId w:val="9"/>
+        </w:numPr>
+        <w:spacing w:before="100" w:beforeAutospacing="1" w:after="100" w:afterAutospacing="1" w:line="240" w:lineRule="auto"/>
+        <w:rPr>
+          <w:rFonts w:ascii="Times New Roman" w:eastAsia="Times New Roman" w:hAnsi="Times New Roman" w:cs="Times New Roman"/>
+          <w:sz w:val="24"/>
+          <w:szCs w:val="24"/>
+          <w:lang w:val="mn-MN"/>
+        </w:rPr>
+      </w:pPr>
+      <w:r>
+        <w:rPr>
+          <w:rFonts w:ascii="Times New Roman" w:eastAsia="Times New Roman" w:hAnsi="Times New Roman" w:cs="Times New Roman"/>
+          <w:sz w:val="24"/>
+          <w:szCs w:val="24"/>
+          <w:lang w:val="mn-MN"/>
+        </w:rPr>
+        <w:t>Таавар 1</w:t>
+      </w:r>
+    </w:p>
+    <w:p>
+      <w:pPr>
+        <w:pStyle w:val="ListParagraph"/>
+        <w:numPr>
+          <w:ilvl w:val="2"/>
+          <w:numId w:val="9"/>
+        </w:numPr>
+        <w:spacing w:before="100" w:beforeAutospacing="1" w:after="100" w:afterAutospacing="1" w:line="240" w:lineRule="auto"/>
+        <w:rPr>
+          <w:rFonts w:ascii="Times New Roman" w:eastAsia="Times New Roman" w:hAnsi="Times New Roman" w:cs="Times New Roman"/>
+          <w:sz w:val="24"/>
+          <w:szCs w:val="24"/>
+          <w:lang w:val="mn-MN"/>
+        </w:rPr>
+      </w:pPr>
+      <w:r>
+        <w:rPr>
+          <w:rFonts w:ascii="Times New Roman" w:eastAsia="Times New Roman" w:hAnsi="Times New Roman" w:cs="Times New Roman"/>
+          <w:sz w:val="24"/>
+          <w:szCs w:val="24"/>
+          <w:lang w:val="mn-MN"/>
+        </w:rPr>
+        <w:t>Таавар 2</w:t>
+      </w:r>
+    </w:p>
+    <w:p>
+      <w:pPr>
+        <w:pStyle w:val="ListParagraph"/>
+        <w:numPr>
+          <w:ilvl w:val="2"/>
+          <w:numId w:val="9"/>
+        </w:numPr>
+        <w:spacing w:before="100" w:beforeAutospacing="1" w:after="100" w:afterAutospacing="1" w:line="240" w:lineRule="auto"/>
+        <w:rPr>
+          <w:rFonts w:ascii="Times New Roman" w:eastAsia="Times New Roman" w:hAnsi="Times New Roman" w:cs="Times New Roman"/>
+          <w:sz w:val="24"/>
+          <w:szCs w:val="24"/>
+          <w:lang w:val="mn-MN"/>
+        </w:rPr>
+      </w:pPr>
+      <w:r>
+        <w:rPr>
+          <w:rFonts w:ascii="Times New Roman" w:eastAsia="Times New Roman" w:hAnsi="Times New Roman" w:cs="Times New Roman"/>
+          <w:sz w:val="24"/>
+          <w:szCs w:val="24"/>
+          <w:lang w:val="mn-MN"/>
+        </w:rPr>
+        <w:t>Таавар 3</w:t>
+      </w:r>
+    </w:p>
+    <w:p>
+      <w:pPr>
+        <w:pStyle w:val="ListParagraph"/>
+        <w:numPr>
+          <w:ilvl w:val="2"/>
+          <w:numId w:val="9"/>
+        </w:numPr>
+        <w:spacing w:before="100" w:beforeAutospacing="1" w:after="100" w:afterAutospacing="1" w:line="240" w:lineRule="auto"/>
+        <w:rPr>
+          <w:rFonts w:ascii="Times New Roman" w:eastAsia="Times New Roman" w:hAnsi="Times New Roman" w:cs="Times New Roman"/>
+          <w:sz w:val="24"/>
+          <w:szCs w:val="24"/>
+          <w:lang w:val="mn-MN"/>
+        </w:rPr>
+      </w:pPr>
+      <w:r>
+        <w:rPr>
+          <w:rFonts w:ascii="Times New Roman" w:eastAsia="Times New Roman" w:hAnsi="Times New Roman" w:cs="Times New Roman"/>
+          <w:sz w:val="24"/>
+          <w:szCs w:val="24"/>
+          <w:lang w:val="mn-MN"/>
+        </w:rPr>
+        <w:t>Таавар 4</w:t>
+      </w:r>
+    </w:p>
+    <w:p>
+      <w:pPr>
+        <w:pStyle w:val="ListParagraph"/>
+        <w:numPr>
+          <w:ilvl w:val="2"/>
+          <w:numId w:val="9"/>
+        </w:numPr>
+        <w:spacing w:before="100" w:beforeAutospacing="1" w:after="100" w:afterAutospacing="1" w:line="240" w:lineRule="auto"/>
+        <w:rPr>
+          <w:rFonts w:ascii="Times New Roman" w:eastAsia="Times New Roman" w:hAnsi="Times New Roman" w:cs="Times New Roman"/>
+          <w:sz w:val="24"/>
+          <w:szCs w:val="24"/>
+          <w:lang w:val="mn-MN"/>
+        </w:rPr>
+      </w:pPr>
+      <w:r>
+        <w:rPr>
+          <w:rFonts w:ascii="Times New Roman" w:eastAsia="Times New Roman" w:hAnsi="Times New Roman" w:cs="Times New Roman"/>
+          <w:sz w:val="24"/>
+          <w:szCs w:val="24"/>
+          <w:lang w:val="mn-MN"/>
+        </w:rPr>
+        <w:t xml:space="preserve">Таавар </w:t>
+      </w:r>
+      <w:r>
+        <w:rPr>
+          <w:rFonts w:ascii="Times New Roman" w:eastAsia="Times New Roman" w:hAnsi="Times New Roman" w:cs="Times New Roman"/>
+          <w:sz w:val="24"/>
+          <w:szCs w:val="24"/>
+          <w:lang w:val="mn-MN"/>
+        </w:rPr>
+        <w:t>5</w:t>
+      </w:r>
+    </w:p>
+    <w:p>
+      <w:pPr>
+        <w:pStyle w:val="ListParagraph"/>
+        <w:spacing w:before="100" w:beforeAutospacing="1" w:after="100" w:afterAutospacing="1" w:line="240" w:lineRule="auto"/>
+        <w:ind w:left="2160"/>
+        <w:rPr>
+          <w:rFonts w:ascii="Times New Roman" w:eastAsia="Times New Roman" w:hAnsi="Times New Roman" w:cs="Times New Roman"/>
+          <w:sz w:val="24"/>
+          <w:szCs w:val="24"/>
+          <w:lang w:val="mn-MN"/>
+        </w:rPr>
+      </w:pPr>
+    </w:p>
+    <w:p>
+      <w:pPr>
+        <w:pStyle w:val="ListParagraph"/>
+        <w:numPr>
+          <w:ilvl w:val="1"/>
+          <w:numId w:val="9"/>
+        </w:numPr>
+        <w:spacing w:before="100" w:beforeAutospacing="1" w:after="100" w:afterAutospacing="1" w:line="240" w:lineRule="auto"/>
+        <w:rPr>
+          <w:rFonts w:ascii="Times New Roman" w:eastAsia="Times New Roman" w:hAnsi="Times New Roman" w:cs="Times New Roman"/>
+          <w:sz w:val="24"/>
+          <w:szCs w:val="24"/>
+          <w:lang w:val="mn-MN"/>
+        </w:rPr>
+      </w:pPr>
+      <w:r>
+        <w:rPr>
+          <w:rFonts w:ascii="Times New Roman" w:eastAsia="Times New Roman" w:hAnsi="Times New Roman" w:cs="Times New Roman"/>
+          <w:sz w:val="24"/>
+          <w:szCs w:val="24"/>
+          <w:lang w:val="mn-MN"/>
+        </w:rPr>
+        <w:t>Барилдаан 2</w:t>
+      </w:r>
+    </w:p>
+    <w:p>
+      <w:pPr>
+        <w:pStyle w:val="ListParagraph"/>
+        <w:numPr>
+          <w:ilvl w:val="2"/>
+          <w:numId w:val="9"/>
+        </w:numPr>
+        <w:spacing w:before="100" w:beforeAutospacing="1" w:after="100" w:afterAutospacing="1" w:line="240" w:lineRule="auto"/>
+        <w:rPr>
+          <w:rFonts w:ascii="Times New Roman" w:eastAsia="Times New Roman" w:hAnsi="Times New Roman" w:cs="Times New Roman"/>
+          <w:sz w:val="24"/>
+          <w:szCs w:val="24"/>
+          <w:lang w:val="mn-MN"/>
+        </w:rPr>
+      </w:pPr>
+      <w:r>
+        <w:rPr>
+          <w:rFonts w:ascii="Times New Roman" w:eastAsia="Times New Roman" w:hAnsi="Times New Roman" w:cs="Times New Roman"/>
+          <w:sz w:val="24"/>
+          <w:szCs w:val="24"/>
+          <w:lang w:val="mn-MN"/>
+        </w:rPr>
+        <w:t>Таавар 1</w:t>
+      </w:r>
+    </w:p>
+    <w:p>
+      <w:pPr>
+        <w:pStyle w:val="ListParagraph"/>
+        <w:numPr>
+          <w:ilvl w:val="2"/>
+          <w:numId w:val="9"/>
+        </w:numPr>
+        <w:spacing w:before="100" w:beforeAutospacing="1" w:after="100" w:afterAutospacing="1" w:line="240" w:lineRule="auto"/>
+        <w:rPr>
+          <w:rFonts w:ascii="Times New Roman" w:eastAsia="Times New Roman" w:hAnsi="Times New Roman" w:cs="Times New Roman"/>
+          <w:sz w:val="24"/>
+          <w:szCs w:val="24"/>
+          <w:lang w:val="mn-MN"/>
+        </w:rPr>
+      </w:pPr>
+      <w:r>
+        <w:rPr>
+          <w:rFonts w:ascii="Times New Roman" w:eastAsia="Times New Roman" w:hAnsi="Times New Roman" w:cs="Times New Roman"/>
+          <w:sz w:val="24"/>
+          <w:szCs w:val="24"/>
+          <w:lang w:val="mn-MN"/>
+        </w:rPr>
+        <w:t>Таавар 2</w:t>
+      </w:r>
+    </w:p>
+    <w:p>
+      <w:pPr>
+        <w:pStyle w:val="ListParagraph"/>
+        <w:numPr>
+          <w:ilvl w:val="2"/>
+          <w:numId w:val="9"/>
+        </w:numPr>
+        <w:spacing w:before="100" w:beforeAutospacing="1" w:after="100" w:afterAutospacing="1" w:line="240" w:lineRule="auto"/>
+        <w:rPr>
+          <w:rFonts w:ascii="Times New Roman" w:eastAsia="Times New Roman" w:hAnsi="Times New Roman" w:cs="Times New Roman"/>
+          <w:sz w:val="24"/>
+          <w:szCs w:val="24"/>
+          <w:lang w:val="mn-MN"/>
+        </w:rPr>
+      </w:pPr>
+      <w:r>
+        <w:rPr>
+          <w:rFonts w:ascii="Times New Roman" w:eastAsia="Times New Roman" w:hAnsi="Times New Roman" w:cs="Times New Roman"/>
+          <w:sz w:val="24"/>
+          <w:szCs w:val="24"/>
+          <w:lang w:val="mn-MN"/>
+        </w:rPr>
+        <w:t>Таавар 3</w:t>
+      </w:r>
+    </w:p>
+    <w:p>
+      <w:pPr>
+        <w:pStyle w:val="ListParagraph"/>
+        <w:numPr>
+          <w:ilvl w:val="2"/>
+          <w:numId w:val="9"/>
+        </w:numPr>
+        <w:spacing w:before="100" w:beforeAutospacing="1" w:after="100" w:afterAutospacing="1" w:line="240" w:lineRule="auto"/>
+        <w:rPr>
+          <w:rFonts w:ascii="Times New Roman" w:eastAsia="Times New Roman" w:hAnsi="Times New Roman" w:cs="Times New Roman"/>
+          <w:sz w:val="24"/>
+          <w:szCs w:val="24"/>
+          <w:lang w:val="mn-MN"/>
+        </w:rPr>
+      </w:pPr>
+      <w:r>
+        <w:rPr>
+          <w:rFonts w:ascii="Times New Roman" w:eastAsia="Times New Roman" w:hAnsi="Times New Roman" w:cs="Times New Roman"/>
+          <w:sz w:val="24"/>
+          <w:szCs w:val="24"/>
+          <w:lang w:val="mn-MN"/>
+        </w:rPr>
+        <w:t>Таавар 4</w:t>
+      </w:r>
+    </w:p>
+    <w:p>
+      <w:pPr>
+        <w:pStyle w:val="ListParagraph"/>
+        <w:numPr>
+          <w:ilvl w:val="2"/>
+          <w:numId w:val="9"/>
+        </w:numPr>
+        <w:spacing w:before="100" w:beforeAutospacing="1" w:after="100" w:afterAutospacing="1" w:line="240" w:lineRule="auto"/>
+        <w:rPr>
+          <w:rFonts w:ascii="Times New Roman" w:eastAsia="Times New Roman" w:hAnsi="Times New Roman" w:cs="Times New Roman"/>
+          <w:sz w:val="24"/>
+          <w:szCs w:val="24"/>
+          <w:lang w:val="mn-MN"/>
+        </w:rPr>
+      </w:pPr>
+      <w:r>
+        <w:rPr>
+          <w:rFonts w:ascii="Times New Roman" w:eastAsia="Times New Roman" w:hAnsi="Times New Roman" w:cs="Times New Roman"/>
+          <w:sz w:val="24"/>
+          <w:szCs w:val="24"/>
+          <w:lang w:val="mn-MN"/>
+        </w:rPr>
+        <w:t>Таавар 5</w:t>
+      </w:r>
+    </w:p>
+    <w:p>
+      <w:pPr>
+        <w:pStyle w:val="ListParagraph"/>
+        <w:spacing w:before="100" w:beforeAutospacing="1" w:after="100" w:afterAutospacing="1" w:line="240" w:lineRule="auto"/>
+        <w:ind w:left="1440"/>
+        <w:rPr>
+          <w:rFonts w:ascii="Times New Roman" w:eastAsia="Times New Roman" w:hAnsi="Times New Roman" w:cs="Times New Roman"/>
+          <w:sz w:val="24"/>
+          <w:szCs w:val="24"/>
+          <w:lang w:val="mn-MN"/>
+        </w:rPr>
+      </w:pPr>
+    </w:p>
+    <w:p>
+      <w:pPr>
+        <w:pStyle w:val="ListParagraph"/>
+        <w:numPr>
+          <w:ilvl w:val="1"/>
+          <w:numId w:val="9"/>
+        </w:numPr>
+        <w:spacing w:before="100" w:beforeAutospacing="1" w:after="100" w:afterAutospacing="1" w:line="240" w:lineRule="auto"/>
+        <w:rPr>
+          <w:rFonts w:ascii="Times New Roman" w:eastAsia="Times New Roman" w:hAnsi="Times New Roman" w:cs="Times New Roman"/>
+          <w:sz w:val="24"/>
+          <w:szCs w:val="24"/>
+          <w:lang w:val="mn-MN"/>
+        </w:rPr>
+      </w:pPr>
+      <w:r>
+        <w:rPr>
+          <w:rFonts w:ascii="Times New Roman" w:eastAsia="Times New Roman" w:hAnsi="Times New Roman" w:cs="Times New Roman"/>
+          <w:sz w:val="24"/>
+          <w:szCs w:val="24"/>
+          <w:lang w:val="mn-MN"/>
+        </w:rPr>
+        <w:t>Барилдаан 3</w:t>
+      </w:r>
+    </w:p>
+    <w:p>
+      <w:pPr>
+        <w:pStyle w:val="ListParagraph"/>
+        <w:numPr>
+          <w:ilvl w:val="2"/>
+          <w:numId w:val="9"/>
+        </w:numPr>
+        <w:spacing w:before="100" w:beforeAutospacing="1" w:after="100" w:afterAutospacing="1" w:line="240" w:lineRule="auto"/>
+        <w:rPr>
+          <w:rFonts w:ascii="Times New Roman" w:eastAsia="Times New Roman" w:hAnsi="Times New Roman" w:cs="Times New Roman"/>
+          <w:sz w:val="24"/>
+          <w:szCs w:val="24"/>
+          <w:lang w:val="mn-MN"/>
+        </w:rPr>
+      </w:pPr>
+      <w:r>
+        <w:rPr>
+          <w:rFonts w:ascii="Times New Roman" w:eastAsia="Times New Roman" w:hAnsi="Times New Roman" w:cs="Times New Roman"/>
+          <w:sz w:val="24"/>
+          <w:szCs w:val="24"/>
+          <w:lang w:val="mn-MN"/>
+        </w:rPr>
+        <w:t>Таавар 1</w:t>
+      </w:r>
+    </w:p>
+    <w:p>
+      <w:pPr>
+        <w:pStyle w:val="ListParagraph"/>
+        <w:numPr>
+          <w:ilvl w:val="2"/>
+          <w:numId w:val="9"/>
+        </w:numPr>
+        <w:spacing w:before="100" w:beforeAutospacing="1" w:after="100" w:afterAutospacing="1" w:line="240" w:lineRule="auto"/>
+        <w:rPr>
+          <w:rFonts w:ascii="Times New Roman" w:eastAsia="Times New Roman" w:hAnsi="Times New Roman" w:cs="Times New Roman"/>
+          <w:sz w:val="24"/>
+          <w:szCs w:val="24"/>
+          <w:lang w:val="mn-MN"/>
+        </w:rPr>
+      </w:pPr>
+      <w:r>
+        <w:rPr>
+          <w:rFonts w:ascii="Times New Roman" w:eastAsia="Times New Roman" w:hAnsi="Times New Roman" w:cs="Times New Roman"/>
+          <w:sz w:val="24"/>
+          <w:szCs w:val="24"/>
+          <w:lang w:val="mn-MN"/>
+        </w:rPr>
+        <w:t>Таавар 2</w:t>
+      </w:r>
+    </w:p>
+    <w:p>
+      <w:pPr>
+        <w:pStyle w:val="ListParagraph"/>
+        <w:numPr>
+          <w:ilvl w:val="2"/>
+          <w:numId w:val="9"/>
+        </w:numPr>
+        <w:spacing w:before="100" w:beforeAutospacing="1" w:after="100" w:afterAutospacing="1" w:line="240" w:lineRule="auto"/>
+        <w:rPr>
+          <w:rFonts w:ascii="Times New Roman" w:eastAsia="Times New Roman" w:hAnsi="Times New Roman" w:cs="Times New Roman"/>
+          <w:sz w:val="24"/>
+          <w:szCs w:val="24"/>
+          <w:lang w:val="mn-MN"/>
+        </w:rPr>
+      </w:pPr>
+      <w:r>
+        <w:rPr>
+          <w:rFonts w:ascii="Times New Roman" w:eastAsia="Times New Roman" w:hAnsi="Times New Roman" w:cs="Times New Roman"/>
+          <w:sz w:val="24"/>
+          <w:szCs w:val="24"/>
+          <w:lang w:val="mn-MN"/>
+        </w:rPr>
+        <w:t>Таавар 3</w:t>
+      </w:r>
+    </w:p>
+    <w:p>
+      <w:pPr>
+        <w:pStyle w:val="ListParagraph"/>
+        <w:numPr>
+          <w:ilvl w:val="2"/>
+          <w:numId w:val="9"/>
+        </w:numPr>
+        <w:spacing w:before="100" w:beforeAutospacing="1" w:after="100" w:afterAutospacing="1" w:line="240" w:lineRule="auto"/>
+        <w:rPr>
+          <w:rFonts w:ascii="Times New Roman" w:eastAsia="Times New Roman" w:hAnsi="Times New Roman" w:cs="Times New Roman"/>
+          <w:sz w:val="24"/>
+          <w:szCs w:val="24"/>
+          <w:lang w:val="mn-MN"/>
+        </w:rPr>
+      </w:pPr>
+      <w:r>
+        <w:rPr>
+          <w:rFonts w:ascii="Times New Roman" w:eastAsia="Times New Roman" w:hAnsi="Times New Roman" w:cs="Times New Roman"/>
+          <w:sz w:val="24"/>
+          <w:szCs w:val="24"/>
+          <w:lang w:val="mn-MN"/>
+        </w:rPr>
+        <w:t>Таавар 4</w:t>
+      </w:r>
+    </w:p>
+    <w:p>
+      <w:pPr>
+        <w:pStyle w:val="ListParagraph"/>
+        <w:numPr>
+          <w:ilvl w:val="2"/>
+          <w:numId w:val="9"/>
+        </w:numPr>
+        <w:spacing w:before="100" w:beforeAutospacing="1" w:after="100" w:afterAutospacing="1" w:line="240" w:lineRule="auto"/>
+        <w:rPr>
+          <w:rFonts w:ascii="Times New Roman" w:eastAsia="Times New Roman" w:hAnsi="Times New Roman" w:cs="Times New Roman"/>
+          <w:sz w:val="24"/>
+          <w:szCs w:val="24"/>
+          <w:lang w:val="mn-MN"/>
+        </w:rPr>
+      </w:pPr>
+      <w:r>
+        <w:rPr>
+          <w:rFonts w:ascii="Times New Roman" w:eastAsia="Times New Roman" w:hAnsi="Times New Roman" w:cs="Times New Roman"/>
+          <w:sz w:val="24"/>
+          <w:szCs w:val="24"/>
+          <w:lang w:val="mn-MN"/>
+        </w:rPr>
+        <w:t>Таавар 5</w:t>
+      </w:r>
+    </w:p>
+    <w:p>
+      <w:pPr>
+        <w:pStyle w:val="ListParagraph"/>
+        <w:spacing w:before="100" w:beforeAutospacing="1" w:after="100" w:afterAutospacing="1" w:line="240" w:lineRule="auto"/>
+        <w:rPr>
+          <w:rFonts w:ascii="Times New Roman" w:eastAsia="Times New Roman" w:hAnsi="Times New Roman" w:cs="Times New Roman"/>
+          <w:sz w:val="24"/>
+          <w:szCs w:val="24"/>
+          <w:lang w:val="mn-MN"/>
+        </w:rPr>
+      </w:pPr>
+    </w:p>
+    <w:p>
+      <w:pPr>
+        <w:pStyle w:val="ListParagraph"/>
+        <w:numPr>
+          <w:ilvl w:val="0"/>
+          <w:numId w:val="8"/>
+        </w:numPr>
+        <w:spacing w:before="100" w:beforeAutospacing="1" w:after="100" w:afterAutospacing="1" w:line="240" w:lineRule="auto"/>
+        <w:rPr>
+          <w:rFonts w:ascii="Times New Roman" w:eastAsia="Times New Roman" w:hAnsi="Times New Roman" w:cs="Times New Roman"/>
+          <w:sz w:val="24"/>
+          <w:szCs w:val="24"/>
+          <w:lang w:val="mn-MN"/>
+        </w:rPr>
+      </w:pPr>
+      <w:r>
+        <w:rPr>
+          <w:rFonts w:ascii="Times New Roman" w:eastAsia="Times New Roman" w:hAnsi="Times New Roman" w:cs="Times New Roman"/>
+          <w:sz w:val="24"/>
+          <w:szCs w:val="24"/>
+          <w:lang w:val="mn-MN"/>
+        </w:rPr>
+        <w:t>Таа</w:t>
+      </w:r>
+      <w:r>
+        <w:rPr>
+          <w:rFonts w:ascii="Times New Roman" w:eastAsia="Times New Roman" w:hAnsi="Times New Roman" w:cs="Times New Roman"/>
+          <w:sz w:val="24"/>
+          <w:szCs w:val="24"/>
+          <w:lang w:val="mn-MN"/>
+        </w:rPr>
+        <w:t>маглал</w:t>
+      </w:r>
+      <w:r>
+        <w:rPr>
+          <w:rFonts w:ascii="Times New Roman" w:eastAsia="Times New Roman" w:hAnsi="Times New Roman" w:cs="Times New Roman"/>
+          <w:sz w:val="24"/>
+          <w:szCs w:val="24"/>
+          <w:lang w:val="mn-MN"/>
+        </w:rPr>
+        <w:t xml:space="preserve"> дотор </w:t>
+      </w:r>
+      <w:r>
+        <w:rPr>
+          <w:rFonts w:ascii="Times New Roman" w:eastAsia="Times New Roman" w:hAnsi="Times New Roman" w:cs="Times New Roman"/>
+          <w:sz w:val="24"/>
+          <w:szCs w:val="24"/>
+        </w:rPr>
+        <w:t>tab</w:t>
+      </w:r>
+      <w:r>
+        <w:rPr>
+          <w:rFonts w:ascii="Times New Roman" w:eastAsia="Times New Roman" w:hAnsi="Times New Roman" w:cs="Times New Roman"/>
+          <w:sz w:val="24"/>
+          <w:szCs w:val="24"/>
+          <w:lang w:val="mn-MN"/>
+        </w:rPr>
+        <w:t xml:space="preserve"> дотор нэгэн зэрэг хэд хэдэн </w:t>
+      </w:r>
+      <w:r>
+        <w:rPr>
+          <w:rFonts w:ascii="Times New Roman" w:eastAsia="Times New Roman" w:hAnsi="Times New Roman" w:cs="Times New Roman"/>
+          <w:sz w:val="24"/>
+          <w:szCs w:val="24"/>
+          <w:lang w:val="mn-MN"/>
+        </w:rPr>
+        <w:t>барилдаантай байна</w:t>
+      </w:r>
+    </w:p>
+    <w:p>
+      <w:pPr>
+        <w:pStyle w:val="ListParagraph"/>
+        <w:numPr>
+          <w:ilvl w:val="0"/>
+          <w:numId w:val="8"/>
+        </w:numPr>
+        <w:spacing w:before="100" w:beforeAutospacing="1" w:after="100" w:afterAutospacing="1" w:line="240" w:lineRule="auto"/>
+        <w:rPr>
+          <w:rFonts w:ascii="Times New Roman" w:eastAsia="Times New Roman" w:hAnsi="Times New Roman" w:cs="Times New Roman"/>
+          <w:sz w:val="24"/>
+          <w:szCs w:val="24"/>
+          <w:lang w:val="mn-MN"/>
+        </w:rPr>
+      </w:pPr>
+      <w:r>
+        <w:rPr>
+          <w:rFonts w:ascii="Times New Roman" w:eastAsia="Times New Roman" w:hAnsi="Times New Roman" w:cs="Times New Roman"/>
+          <w:sz w:val="24"/>
+          <w:szCs w:val="24"/>
+          <w:lang w:val="mn-MN"/>
+        </w:rPr>
+        <w:t xml:space="preserve">Барилдаан дотор </w:t>
+      </w:r>
+      <w:r>
+        <w:rPr>
+          <w:rFonts w:ascii="Times New Roman" w:eastAsia="Times New Roman" w:hAnsi="Times New Roman" w:cs="Times New Roman"/>
+          <w:sz w:val="24"/>
+          <w:szCs w:val="24"/>
+          <w:lang w:val="mn-MN"/>
+        </w:rPr>
+        <w:t>нэгэн зэрэг хэд хэдэн барилдаантай байна</w:t>
+      </w:r>
+    </w:p>
+    <w:p>
+      <w:pPr>
+        <w:pStyle w:val="ListParagraph"/>
+        <w:numPr>
+          <w:ilvl w:val="0"/>
+          <w:numId w:val="8"/>
+        </w:numPr>
+        <w:spacing w:before="100" w:beforeAutospacing="1" w:after="100" w:afterAutospacing="1" w:line="240" w:lineRule="auto"/>
+        <w:rPr>
+          <w:rFonts w:ascii="Times New Roman" w:eastAsia="Times New Roman" w:hAnsi="Times New Roman" w:cs="Times New Roman"/>
+          <w:sz w:val="24"/>
+          <w:szCs w:val="24"/>
+          <w:lang w:val="mn-MN"/>
+        </w:rPr>
+      </w:pPr>
+      <w:r>
+        <w:rPr>
+          <w:rFonts w:ascii="Times New Roman" w:eastAsia="Times New Roman" w:hAnsi="Times New Roman" w:cs="Times New Roman"/>
+          <w:sz w:val="24"/>
+          <w:szCs w:val="24"/>
+          <w:lang w:val="mn-MN"/>
+        </w:rPr>
+        <w:t>Админ б</w:t>
+      </w:r>
+      <w:r>
+        <w:rPr>
+          <w:rFonts w:ascii="Times New Roman" w:eastAsia="Times New Roman" w:hAnsi="Times New Roman" w:cs="Times New Roman"/>
+          <w:sz w:val="24"/>
+          <w:szCs w:val="24"/>
+          <w:lang w:val="mn-MN"/>
+        </w:rPr>
+        <w:t>арилдаан үүсгэх, устгах, засах боломжтой байх. Устгах, засах үйлдэл нь дотроо идэвхитэй таа</w:t>
+      </w:r>
+      <w:r>
+        <w:rPr>
+          <w:rFonts w:ascii="Times New Roman" w:eastAsia="Times New Roman" w:hAnsi="Times New Roman" w:cs="Times New Roman"/>
+          <w:sz w:val="24"/>
+          <w:szCs w:val="24"/>
+          <w:lang w:val="mn-MN"/>
+        </w:rPr>
+        <w:t>варгүй үед шууд биелнэ. Таавар</w:t>
+      </w:r>
+      <w:r>
+        <w:rPr>
+          <w:rFonts w:ascii="Times New Roman" w:eastAsia="Times New Roman" w:hAnsi="Times New Roman" w:cs="Times New Roman"/>
+          <w:sz w:val="24"/>
+          <w:szCs w:val="24"/>
+          <w:lang w:val="mn-MN"/>
+        </w:rPr>
+        <w:t xml:space="preserve">тай бол </w:t>
+      </w:r>
+      <w:r>
+        <w:rPr>
+          <w:rFonts w:ascii="Times New Roman" w:eastAsia="Times New Roman" w:hAnsi="Times New Roman" w:cs="Times New Roman"/>
+          <w:sz w:val="24"/>
+          <w:szCs w:val="24"/>
+        </w:rPr>
+        <w:t>“</w:t>
+      </w:r>
+      <w:r>
+        <w:rPr>
+          <w:rFonts w:ascii="Times New Roman" w:eastAsia="Times New Roman" w:hAnsi="Times New Roman" w:cs="Times New Roman"/>
+          <w:sz w:val="24"/>
+          <w:szCs w:val="24"/>
+          <w:lang w:val="mn-MN"/>
+        </w:rPr>
+        <w:t>Идэвхитэй таа</w:t>
+      </w:r>
+      <w:r>
+        <w:rPr>
+          <w:rFonts w:ascii="Times New Roman" w:eastAsia="Times New Roman" w:hAnsi="Times New Roman" w:cs="Times New Roman"/>
+          <w:sz w:val="24"/>
+          <w:szCs w:val="24"/>
+          <w:lang w:val="mn-MN"/>
+        </w:rPr>
+        <w:t>вар</w:t>
+      </w:r>
+      <w:r>
+        <w:rPr>
+          <w:rFonts w:ascii="Times New Roman" w:eastAsia="Times New Roman" w:hAnsi="Times New Roman" w:cs="Times New Roman"/>
+          <w:sz w:val="24"/>
+          <w:szCs w:val="24"/>
+          <w:lang w:val="mn-MN"/>
+        </w:rPr>
+        <w:t xml:space="preserve"> байна. Устгах уу</w:t>
+      </w:r>
+      <w:r>
+        <w:rPr>
+          <w:rFonts w:ascii="Times New Roman" w:eastAsia="Times New Roman" w:hAnsi="Times New Roman" w:cs="Times New Roman"/>
+          <w:sz w:val="24"/>
+          <w:szCs w:val="24"/>
+        </w:rPr>
+        <w:t>”</w:t>
+      </w:r>
+      <w:r>
+        <w:rPr>
+          <w:rFonts w:ascii="Times New Roman" w:eastAsia="Times New Roman" w:hAnsi="Times New Roman" w:cs="Times New Roman"/>
+          <w:sz w:val="24"/>
+          <w:szCs w:val="24"/>
+          <w:lang w:val="mn-MN"/>
+        </w:rPr>
+        <w:t xml:space="preserve"> гэж асуугаад </w:t>
+      </w:r>
+      <w:r>
+        <w:rPr>
+          <w:rFonts w:ascii="Times New Roman" w:eastAsia="Times New Roman" w:hAnsi="Times New Roman" w:cs="Times New Roman"/>
+          <w:sz w:val="24"/>
+          <w:szCs w:val="24"/>
+        </w:rPr>
+        <w:t>“</w:t>
+      </w:r>
+      <w:r>
+        <w:rPr>
+          <w:rFonts w:ascii="Times New Roman" w:eastAsia="Times New Roman" w:hAnsi="Times New Roman" w:cs="Times New Roman"/>
+          <w:sz w:val="24"/>
+          <w:szCs w:val="24"/>
+          <w:lang w:val="mn-MN"/>
+        </w:rPr>
+        <w:t>Устгах, Болих</w:t>
+      </w:r>
+      <w:r>
+        <w:rPr>
+          <w:rFonts w:ascii="Times New Roman" w:eastAsia="Times New Roman" w:hAnsi="Times New Roman" w:cs="Times New Roman"/>
+          <w:sz w:val="24"/>
+          <w:szCs w:val="24"/>
+        </w:rPr>
+        <w:t>”</w:t>
+      </w:r>
+      <w:r>
+        <w:rPr>
+          <w:rFonts w:ascii="Times New Roman" w:eastAsia="Times New Roman" w:hAnsi="Times New Roman" w:cs="Times New Roman"/>
+          <w:sz w:val="24"/>
+          <w:szCs w:val="24"/>
+          <w:lang w:val="mn-MN"/>
+        </w:rPr>
+        <w:t xml:space="preserve"> </w:t>
+      </w:r>
+      <w:r>
+        <w:rPr>
+          <w:rFonts w:ascii="Times New Roman" w:eastAsia="Times New Roman" w:hAnsi="Times New Roman" w:cs="Times New Roman"/>
+          <w:sz w:val="24"/>
+          <w:szCs w:val="24"/>
+          <w:lang w:val="mn-MN"/>
+        </w:rPr>
+        <w:t>гэсэн 2 сонголт харуулна</w:t>
+      </w:r>
+      <w:r>
+        <w:rPr>
+          <w:rFonts w:ascii="Times New Roman" w:eastAsia="Times New Roman" w:hAnsi="Times New Roman" w:cs="Times New Roman"/>
+          <w:sz w:val="24"/>
+          <w:szCs w:val="24"/>
+          <w:lang w:val="mn-MN"/>
+        </w:rPr>
+        <w:t>.</w:t>
+      </w:r>
+      <w:r>
+        <w:rPr>
+          <w:rFonts w:ascii="Times New Roman" w:eastAsia="Times New Roman" w:hAnsi="Times New Roman" w:cs="Times New Roman"/>
+          <w:sz w:val="24"/>
+          <w:szCs w:val="24"/>
+          <w:lang w:val="mn-MN"/>
+        </w:rPr>
+        <w:t xml:space="preserve"> </w:t>
+      </w:r>
+      <w:r>
+        <w:rPr>
+          <w:rFonts w:ascii="Times New Roman" w:eastAsia="Times New Roman" w:hAnsi="Times New Roman" w:cs="Times New Roman"/>
+          <w:sz w:val="24"/>
+          <w:szCs w:val="24"/>
+          <w:lang w:val="mn-MN"/>
+        </w:rPr>
+        <w:t xml:space="preserve"> </w:t>
+      </w:r>
+      <w:r>
+        <w:rPr>
+          <w:rFonts w:ascii="Times New Roman" w:eastAsia="Times New Roman" w:hAnsi="Times New Roman" w:cs="Times New Roman"/>
+          <w:sz w:val="24"/>
+          <w:szCs w:val="24"/>
+        </w:rPr>
+        <w:t>“</w:t>
+      </w:r>
+      <w:r>
+        <w:rPr>
+          <w:rFonts w:ascii="Times New Roman" w:eastAsia="Times New Roman" w:hAnsi="Times New Roman" w:cs="Times New Roman"/>
+          <w:sz w:val="24"/>
+          <w:szCs w:val="24"/>
+          <w:lang w:val="mn-MN"/>
+        </w:rPr>
+        <w:t>Устгах</w:t>
+      </w:r>
+      <w:r>
+        <w:rPr>
+          <w:rFonts w:ascii="Times New Roman" w:eastAsia="Times New Roman" w:hAnsi="Times New Roman" w:cs="Times New Roman"/>
+          <w:sz w:val="24"/>
+          <w:szCs w:val="24"/>
+        </w:rPr>
+        <w:t>”</w:t>
+      </w:r>
+      <w:r>
+        <w:rPr>
+          <w:rFonts w:ascii="Times New Roman" w:eastAsia="Times New Roman" w:hAnsi="Times New Roman" w:cs="Times New Roman"/>
+          <w:sz w:val="24"/>
+          <w:szCs w:val="24"/>
+          <w:lang w:val="mn-MN"/>
+        </w:rPr>
+        <w:t xml:space="preserve"> дарвал устгана.  </w:t>
+      </w:r>
+      <w:r>
+        <w:rPr>
+          <w:rFonts w:ascii="Times New Roman" w:eastAsia="Times New Roman" w:hAnsi="Times New Roman" w:cs="Times New Roman"/>
+          <w:sz w:val="24"/>
+          <w:szCs w:val="24"/>
+        </w:rPr>
+        <w:t>“</w:t>
+      </w:r>
+      <w:r>
+        <w:rPr>
+          <w:rFonts w:ascii="Times New Roman" w:eastAsia="Times New Roman" w:hAnsi="Times New Roman" w:cs="Times New Roman"/>
+          <w:sz w:val="24"/>
+          <w:szCs w:val="24"/>
+          <w:lang w:val="mn-MN"/>
+        </w:rPr>
+        <w:t>Болих</w:t>
+      </w:r>
+      <w:r>
+        <w:rPr>
+          <w:rFonts w:ascii="Times New Roman" w:eastAsia="Times New Roman" w:hAnsi="Times New Roman" w:cs="Times New Roman"/>
+          <w:sz w:val="24"/>
+          <w:szCs w:val="24"/>
+        </w:rPr>
+        <w:t>”</w:t>
+      </w:r>
+      <w:r>
+        <w:rPr>
+          <w:rFonts w:ascii="Times New Roman" w:eastAsia="Times New Roman" w:hAnsi="Times New Roman" w:cs="Times New Roman"/>
+          <w:sz w:val="24"/>
+          <w:szCs w:val="24"/>
+          <w:lang w:val="mn-MN"/>
+        </w:rPr>
+        <w:t xml:space="preserve"> дарвал хэвээр үлдээнэ.</w:t>
+      </w:r>
+    </w:p>
+    <w:p>
+      <w:pPr>
+        <w:pStyle w:val="ListParagraph"/>
+        <w:numPr>
+          <w:ilvl w:val="0"/>
+          <w:numId w:val="8"/>
+        </w:numPr>
+        <w:spacing w:before="100" w:beforeAutospacing="1" w:after="100" w:afterAutospacing="1" w:line="240" w:lineRule="auto"/>
+        <w:rPr>
+          <w:rFonts w:ascii="Times New Roman" w:eastAsia="Times New Roman" w:hAnsi="Times New Roman" w:cs="Times New Roman"/>
+          <w:sz w:val="24"/>
+          <w:szCs w:val="24"/>
+          <w:lang w:val="mn-MN"/>
+        </w:rPr>
+      </w:pPr>
+      <w:r>
+        <w:rPr>
+          <w:rFonts w:ascii="Times New Roman" w:eastAsia="Times New Roman" w:hAnsi="Times New Roman" w:cs="Times New Roman"/>
+          <w:sz w:val="24"/>
+          <w:szCs w:val="24"/>
+          <w:lang w:val="mn-MN"/>
+        </w:rPr>
+        <w:t xml:space="preserve">Таавар нь </w:t>
+      </w:r>
+    </w:p>
+    <w:p>
+      <w:pPr>
+        <w:pStyle w:val="ListParagraph"/>
+        <w:numPr>
+          <w:ilvl w:val="1"/>
+          <w:numId w:val="8"/>
+        </w:numPr>
+        <w:spacing w:before="100" w:beforeAutospacing="1" w:after="100" w:afterAutospacing="1" w:line="240" w:lineRule="auto"/>
+        <w:rPr>
+          <w:rFonts w:ascii="Times New Roman" w:eastAsia="Times New Roman" w:hAnsi="Times New Roman" w:cs="Times New Roman"/>
+          <w:sz w:val="24"/>
+          <w:szCs w:val="24"/>
+          <w:lang w:val="mn-MN"/>
+        </w:rPr>
+      </w:pPr>
+      <w:r>
+        <w:rPr>
+          <w:rFonts w:ascii="Times New Roman" w:eastAsia="Times New Roman" w:hAnsi="Times New Roman" w:cs="Times New Roman"/>
+          <w:sz w:val="24"/>
+          <w:szCs w:val="24"/>
+          <w:lang w:val="mn-MN"/>
+        </w:rPr>
+        <w:t xml:space="preserve">Шөвгийн </w:t>
+      </w:r>
+      <w:r>
+        <w:rPr>
+          <w:rFonts w:ascii="Times New Roman" w:eastAsia="Times New Roman" w:hAnsi="Times New Roman" w:cs="Times New Roman"/>
+          <w:sz w:val="24"/>
+          <w:szCs w:val="24"/>
+          <w:lang w:val="mn-MN"/>
+        </w:rPr>
+        <w:t>16</w:t>
+      </w:r>
+      <w:r>
+        <w:rPr>
+          <w:rFonts w:ascii="Times New Roman" w:eastAsia="Times New Roman" w:hAnsi="Times New Roman" w:cs="Times New Roman"/>
+          <w:sz w:val="24"/>
+          <w:szCs w:val="24"/>
+          <w:lang w:val="mn-MN"/>
+        </w:rPr>
+        <w:t xml:space="preserve"> бөх</w:t>
+      </w:r>
+    </w:p>
+    <w:p>
+      <w:pPr>
+        <w:pStyle w:val="ListParagraph"/>
+        <w:numPr>
+          <w:ilvl w:val="1"/>
+          <w:numId w:val="8"/>
+        </w:numPr>
+        <w:spacing w:before="100" w:beforeAutospacing="1" w:after="100" w:afterAutospacing="1" w:line="240" w:lineRule="auto"/>
+        <w:rPr>
+          <w:rFonts w:ascii="Times New Roman" w:eastAsia="Times New Roman" w:hAnsi="Times New Roman" w:cs="Times New Roman"/>
+          <w:sz w:val="24"/>
+          <w:szCs w:val="24"/>
+          <w:lang w:val="mn-MN"/>
+        </w:rPr>
+      </w:pPr>
+      <w:r>
+        <w:rPr>
+          <w:rFonts w:ascii="Times New Roman" w:eastAsia="Times New Roman" w:hAnsi="Times New Roman" w:cs="Times New Roman"/>
+          <w:sz w:val="24"/>
+          <w:szCs w:val="24"/>
+          <w:lang w:val="mn-MN"/>
+        </w:rPr>
+        <w:t xml:space="preserve">Шөвгийн 8 бөх </w:t>
+      </w:r>
+    </w:p>
+    <w:p>
+      <w:pPr>
+        <w:pStyle w:val="ListParagraph"/>
+        <w:numPr>
+          <w:ilvl w:val="1"/>
+          <w:numId w:val="8"/>
+        </w:numPr>
+        <w:spacing w:before="100" w:beforeAutospacing="1" w:after="100" w:afterAutospacing="1" w:line="240" w:lineRule="auto"/>
+        <w:rPr>
+          <w:rFonts w:ascii="Times New Roman" w:eastAsia="Times New Roman" w:hAnsi="Times New Roman" w:cs="Times New Roman"/>
+          <w:sz w:val="24"/>
+          <w:szCs w:val="24"/>
+          <w:lang w:val="mn-MN"/>
+        </w:rPr>
+      </w:pPr>
+      <w:r>
+        <w:rPr>
+          <w:rFonts w:ascii="Times New Roman" w:eastAsia="Times New Roman" w:hAnsi="Times New Roman" w:cs="Times New Roman"/>
+          <w:sz w:val="24"/>
+          <w:szCs w:val="24"/>
+          <w:lang w:val="mn-MN"/>
+        </w:rPr>
+        <w:t>Шөвгийн 4 бөх</w:t>
+      </w:r>
+      <w:r>
+        <w:rPr>
+          <w:rFonts w:ascii="Times New Roman" w:eastAsia="Times New Roman" w:hAnsi="Times New Roman" w:cs="Times New Roman"/>
+          <w:sz w:val="24"/>
+          <w:szCs w:val="24"/>
+          <w:lang w:val="mn-MN"/>
+        </w:rPr>
+        <w:t xml:space="preserve"> </w:t>
+      </w:r>
+    </w:p>
+    <w:p>
+      <w:pPr>
+        <w:pStyle w:val="ListParagraph"/>
+        <w:numPr>
+          <w:ilvl w:val="1"/>
+          <w:numId w:val="8"/>
+        </w:numPr>
+        <w:spacing w:before="100" w:beforeAutospacing="1" w:after="100" w:afterAutospacing="1" w:line="240" w:lineRule="auto"/>
+        <w:rPr>
+          <w:rFonts w:ascii="Times New Roman" w:eastAsia="Times New Roman" w:hAnsi="Times New Roman" w:cs="Times New Roman"/>
+          <w:sz w:val="24"/>
+          <w:szCs w:val="24"/>
+          <w:lang w:val="mn-MN"/>
+        </w:rPr>
+      </w:pPr>
+      <w:r>
+        <w:rPr>
+          <w:rFonts w:ascii="Times New Roman" w:eastAsia="Times New Roman" w:hAnsi="Times New Roman" w:cs="Times New Roman"/>
+          <w:sz w:val="24"/>
+          <w:szCs w:val="24"/>
+          <w:lang w:val="mn-MN"/>
+        </w:rPr>
+        <w:t>Үзүүр,</w:t>
+      </w:r>
+      <w:r>
+        <w:rPr>
+          <w:rFonts w:ascii="Times New Roman" w:eastAsia="Times New Roman" w:hAnsi="Times New Roman" w:cs="Times New Roman"/>
+          <w:sz w:val="24"/>
+          <w:szCs w:val="24"/>
+        </w:rPr>
+        <w:t xml:space="preserve"> </w:t>
+      </w:r>
+      <w:r>
+        <w:rPr>
+          <w:rFonts w:ascii="Times New Roman" w:eastAsia="Times New Roman" w:hAnsi="Times New Roman" w:cs="Times New Roman"/>
+          <w:sz w:val="24"/>
+          <w:szCs w:val="24"/>
+          <w:lang w:val="mn-MN"/>
+        </w:rPr>
+        <w:t>түрүүний бөх</w:t>
+      </w:r>
+    </w:p>
+    <w:p>
+      <w:pPr>
+        <w:pStyle w:val="ListParagraph"/>
+        <w:numPr>
+          <w:ilvl w:val="1"/>
+          <w:numId w:val="8"/>
+        </w:numPr>
+        <w:spacing w:before="100" w:beforeAutospacing="1" w:after="100" w:afterAutospacing="1" w:line="240" w:lineRule="auto"/>
+        <w:rPr>
+          <w:rFonts w:ascii="Times New Roman" w:eastAsia="Times New Roman" w:hAnsi="Times New Roman" w:cs="Times New Roman"/>
+          <w:sz w:val="24"/>
+          <w:szCs w:val="24"/>
+          <w:lang w:val="mn-MN"/>
+        </w:rPr>
+      </w:pPr>
+      <w:r>
+        <w:rPr>
+          <w:rFonts w:ascii="Times New Roman" w:eastAsia="Times New Roman" w:hAnsi="Times New Roman" w:cs="Times New Roman"/>
+          <w:sz w:val="24"/>
+          <w:szCs w:val="24"/>
+          <w:lang w:val="mn-MN"/>
+        </w:rPr>
+        <w:t>Түрүү бөх</w:t>
+      </w:r>
+    </w:p>
+    <w:p>
+      <w:pPr>
+        <w:spacing w:before="100" w:beforeAutospacing="1" w:after="100" w:afterAutospacing="1" w:line="240" w:lineRule="auto"/>
+        <w:ind w:left="720"/>
+        <w:rPr>
+          <w:rFonts w:ascii="Times New Roman" w:eastAsia="Times New Roman" w:hAnsi="Times New Roman" w:cs="Times New Roman"/>
+          <w:sz w:val="24"/>
+          <w:szCs w:val="24"/>
+          <w:lang w:val="mn-MN"/>
+        </w:rPr>
+      </w:pPr>
+      <w:r>
+        <w:rPr>
+          <w:rFonts w:ascii="Times New Roman" w:eastAsia="Times New Roman" w:hAnsi="Times New Roman" w:cs="Times New Roman"/>
+          <w:sz w:val="24"/>
+          <w:szCs w:val="24"/>
+          <w:lang w:val="mn-MN"/>
+        </w:rPr>
+        <w:t xml:space="preserve">гэж байх ба таавар бүрт баазад байгаа бүх бөхчүүдийн цол, дэвжээ, нэрийг оруулна. </w:t>
+      </w:r>
+    </w:p>
+    <w:p>
+      <w:pPr>
+        <w:pStyle w:val="NormalWeb"/>
+        <w:numPr>
+          <w:ilvl w:val="0"/>
+          <w:numId w:val="8"/>
+        </w:numPr>
+      </w:pPr>
+      <w:r>
+        <w:t xml:space="preserve">Нэг хэрэглэгч нэг барилдааны </w:t>
+      </w:r>
+      <w:r>
+        <w:t xml:space="preserve">шөвгийн </w:t>
+      </w:r>
+      <w:r>
+        <w:rPr>
+          <w:lang w:val="mn-MN"/>
+        </w:rPr>
+        <w:t>16</w:t>
+      </w:r>
+      <w:r>
+        <w:t xml:space="preserve"> бөх гэдэгт </w:t>
+      </w:r>
+      <w:r>
+        <w:rPr>
+          <w:lang w:val="mn-MN"/>
+        </w:rPr>
+        <w:t>16</w:t>
+      </w:r>
+      <w:r>
+        <w:t xml:space="preserve"> хүртэл бөх</w:t>
+      </w:r>
+      <w:r>
+        <w:t xml:space="preserve"> </w:t>
+      </w:r>
+      <w:r>
+        <w:t>шөвгийн 8 бөх гэдэгт 8 хүртэл бөх, шөвгийн 4 бөх гэдэгт 4 хүртэл бөх, үзүүр түрүүний бөх гэдэг 2 бөх, Түрүү бөх гэдэгт 1 бөх сонгоно.</w:t>
+      </w:r>
+      <w:r>
+        <w:rPr>
+          <w:lang w:val="mn-MN"/>
+        </w:rPr>
+        <w:t xml:space="preserve"> </w:t>
+      </w:r>
+    </w:p>
+    <w:p>
+      <w:pPr>
+        <w:pStyle w:val="NormalWeb"/>
+        <w:numPr>
+          <w:ilvl w:val="0"/>
+          <w:numId w:val="8"/>
+        </w:numPr>
+      </w:pPr>
+      <w:r>
+        <w:rPr>
+          <w:lang w:val="mn-MN"/>
+        </w:rPr>
+        <w:t xml:space="preserve">Хэрэглэгч сонгохдоо Бөхийг олоод </w:t>
+      </w:r>
+      <w:r>
+        <w:t>Check</w:t>
+      </w:r>
+      <w:r>
+        <w:t>box</w:t>
+      </w:r>
+      <w:r>
+        <w:t xml:space="preserve"> </w:t>
+      </w:r>
+      <w:r>
+        <w:rPr>
+          <w:lang w:val="mn-MN"/>
+        </w:rPr>
+        <w:t>чагтлах эсвэл Бөхийн нэр дээр дарж сонгонүщо</w:t>
+      </w:r>
+      <w:r>
+        <w:rPr>
+          <w:lang w:val="mn-MN"/>
+        </w:rPr>
+        <w:t>.</w:t>
+      </w:r>
+    </w:p>
+    <w:p>
+      <w:pPr>
+        <w:pStyle w:val="NormalWeb"/>
+        <w:numPr>
+          <w:ilvl w:val="0"/>
+          <w:numId w:val="8"/>
+        </w:numPr>
+      </w:pPr>
+      <w:r>
+        <w:t>Барилдаан бүрт 343 нэрийг ашиглана. Жагсаалтаас хайгаад байхгүй бол хэрэглэгч бөх нэмэх боломжтой байна. Жишээ: Цол-Улсын начин, Дэвжээ-Ховд гэж сонгоод жагсаалтад байхгүй Болд гэж бичвэл Жагсаалт 344 нэртэй болно</w:t>
+      </w:r>
+    </w:p>
+    <w:p>
+      <w:pPr>
+        <w:pStyle w:val="ListParagraph"/>
+        <w:spacing w:before="100" w:beforeAutospacing="1" w:after="100" w:afterAutospacing="1" w:line="240" w:lineRule="auto"/>
+        <w:rPr>
+          <w:rFonts w:ascii="Times New Roman" w:eastAsia="Times New Roman" w:hAnsi="Times New Roman" w:cs="Times New Roman"/>
+          <w:sz w:val="24"/>
+          <w:szCs w:val="24"/>
+          <w:lang w:val="mn-MN"/>
+        </w:rPr>
+      </w:pPr>
+    </w:p>
+    <w:p>
+      <w:pPr>
+        <w:pStyle w:val="ListParagraph"/>
+        <w:numPr>
+          <w:ilvl w:val="0"/>
+          <w:numId w:val="8"/>
+        </w:numPr>
+        <w:spacing w:before="100" w:beforeAutospacing="1" w:after="100" w:afterAutospacing="1" w:line="240" w:lineRule="auto"/>
+        <w:rPr>
+          <w:rFonts w:ascii="Times New Roman" w:eastAsia="Times New Roman" w:hAnsi="Times New Roman" w:cs="Times New Roman"/>
+          <w:sz w:val="24"/>
+          <w:szCs w:val="24"/>
+          <w:lang w:val="mn-MN"/>
+        </w:rPr>
+      </w:pPr>
+      <w:r>
+        <w:rPr>
+          <w:rFonts w:ascii="Times New Roman" w:eastAsia="Times New Roman" w:hAnsi="Times New Roman" w:cs="Times New Roman"/>
+          <w:sz w:val="24"/>
+          <w:szCs w:val="24"/>
+          <w:lang w:val="mn-MN"/>
+        </w:rPr>
+        <w:t xml:space="preserve">Барилдааны нэр </w:t>
+      </w:r>
+      <w:r>
+        <w:rPr>
+          <w:rFonts w:ascii="Times New Roman" w:eastAsia="Times New Roman" w:hAnsi="Times New Roman" w:cs="Times New Roman"/>
+          <w:sz w:val="24"/>
+          <w:szCs w:val="24"/>
+        </w:rPr>
+        <w:t>(</w:t>
+      </w:r>
+      <w:r>
+        <w:rPr>
+          <w:rFonts w:ascii="Times New Roman" w:eastAsia="Times New Roman" w:hAnsi="Times New Roman" w:cs="Times New Roman"/>
+          <w:sz w:val="24"/>
+          <w:szCs w:val="24"/>
+          <w:lang w:val="mn-MN"/>
+        </w:rPr>
+        <w:t>Жишээ нь</w:t>
+      </w:r>
+      <w:r>
+        <w:rPr>
+          <w:rFonts w:ascii="Times New Roman" w:eastAsia="Times New Roman" w:hAnsi="Times New Roman" w:cs="Times New Roman"/>
+          <w:sz w:val="24"/>
+          <w:szCs w:val="24"/>
+        </w:rPr>
+        <w:t xml:space="preserve">: </w:t>
+      </w:r>
+      <w:r>
+        <w:rPr>
+          <w:rFonts w:ascii="Times New Roman" w:eastAsia="Times New Roman" w:hAnsi="Times New Roman" w:cs="Times New Roman"/>
+          <w:sz w:val="24"/>
+          <w:szCs w:val="24"/>
+          <w:lang w:val="mn-MN"/>
+        </w:rPr>
+        <w:t>2026 он. Улсын наадам</w:t>
+      </w:r>
+      <w:r>
+        <w:rPr>
+          <w:rFonts w:ascii="Times New Roman" w:eastAsia="Times New Roman" w:hAnsi="Times New Roman" w:cs="Times New Roman"/>
+          <w:sz w:val="24"/>
+          <w:szCs w:val="24"/>
+        </w:rPr>
+        <w:t>)</w:t>
+      </w:r>
+    </w:p>
+    <w:p>
+      <w:pPr>
+        <w:pStyle w:val="ListParagraph"/>
+        <w:numPr>
+          <w:ilvl w:val="2"/>
+          <w:numId w:val="8"/>
+        </w:numPr>
+        <w:spacing w:before="100" w:beforeAutospacing="1" w:after="100" w:afterAutospacing="1" w:line="240" w:lineRule="auto"/>
+        <w:rPr>
+          <w:rFonts w:ascii="Times New Roman" w:eastAsia="Times New Roman" w:hAnsi="Times New Roman" w:cs="Times New Roman"/>
+          <w:sz w:val="24"/>
+          <w:szCs w:val="24"/>
+          <w:lang w:val="mn-MN"/>
+        </w:rPr>
+      </w:pPr>
+      <w:r>
+        <w:rPr>
+          <w:rFonts w:ascii="Times New Roman" w:eastAsia="Times New Roman" w:hAnsi="Times New Roman" w:cs="Times New Roman"/>
+          <w:sz w:val="24"/>
+          <w:szCs w:val="24"/>
+          <w:lang w:val="mn-MN"/>
+        </w:rPr>
+        <w:t xml:space="preserve">Тааврууд </w:t>
+      </w:r>
+      <w:r>
+        <w:rPr>
+          <w:rFonts w:ascii="Times New Roman" w:eastAsia="Times New Roman" w:hAnsi="Times New Roman" w:cs="Times New Roman"/>
+          <w:sz w:val="24"/>
+          <w:szCs w:val="24"/>
+        </w:rPr>
+        <w:t>(</w:t>
+      </w:r>
+      <w:r>
+        <w:rPr>
+          <w:rFonts w:ascii="Times New Roman" w:eastAsia="Times New Roman" w:hAnsi="Times New Roman" w:cs="Times New Roman"/>
+          <w:sz w:val="24"/>
+          <w:szCs w:val="24"/>
+          <w:lang w:val="mn-MN"/>
+        </w:rPr>
+        <w:t xml:space="preserve">Шөвгийн </w:t>
+      </w:r>
+      <w:r>
+        <w:rPr>
+          <w:rFonts w:ascii="Times New Roman" w:eastAsia="Times New Roman" w:hAnsi="Times New Roman" w:cs="Times New Roman"/>
+          <w:sz w:val="24"/>
+          <w:szCs w:val="24"/>
+          <w:lang w:val="mn-MN"/>
+        </w:rPr>
+        <w:t>16</w:t>
+      </w:r>
+      <w:r>
+        <w:rPr>
+          <w:rFonts w:ascii="Times New Roman" w:eastAsia="Times New Roman" w:hAnsi="Times New Roman" w:cs="Times New Roman"/>
+          <w:sz w:val="24"/>
+          <w:szCs w:val="24"/>
+          <w:lang w:val="mn-MN"/>
+        </w:rPr>
+        <w:t xml:space="preserve"> бөх</w:t>
+      </w:r>
+      <w:r>
+        <w:rPr>
+          <w:rFonts w:ascii="Times New Roman" w:eastAsia="Times New Roman" w:hAnsi="Times New Roman" w:cs="Times New Roman"/>
+          <w:sz w:val="24"/>
+          <w:szCs w:val="24"/>
+        </w:rPr>
+        <w:t>;</w:t>
+      </w:r>
+      <w:r>
+        <w:rPr>
+          <w:rFonts w:ascii="Times New Roman" w:eastAsia="Times New Roman" w:hAnsi="Times New Roman" w:cs="Times New Roman"/>
+          <w:sz w:val="24"/>
+          <w:szCs w:val="24"/>
+          <w:lang w:val="mn-MN"/>
+        </w:rPr>
+        <w:t>Шөвгийн 8 бөх</w:t>
+      </w:r>
+      <w:r>
+        <w:rPr>
+          <w:rFonts w:ascii="Times New Roman" w:eastAsia="Times New Roman" w:hAnsi="Times New Roman" w:cs="Times New Roman"/>
+          <w:sz w:val="24"/>
+          <w:szCs w:val="24"/>
+        </w:rPr>
+        <w:t>;</w:t>
+      </w:r>
+      <w:r>
+        <w:rPr>
+          <w:rFonts w:ascii="Times New Roman" w:eastAsia="Times New Roman" w:hAnsi="Times New Roman" w:cs="Times New Roman"/>
+          <w:sz w:val="24"/>
+          <w:szCs w:val="24"/>
+          <w:lang w:val="mn-MN"/>
+        </w:rPr>
+        <w:t xml:space="preserve"> </w:t>
+      </w:r>
+      <w:r>
+        <w:rPr>
+          <w:rFonts w:ascii="Times New Roman" w:eastAsia="Times New Roman" w:hAnsi="Times New Roman" w:cs="Times New Roman"/>
+          <w:sz w:val="24"/>
+          <w:szCs w:val="24"/>
+          <w:lang w:val="mn-MN"/>
+        </w:rPr>
+        <w:t xml:space="preserve">Шөвгийн </w:t>
+      </w:r>
+      <w:r>
+        <w:rPr>
+          <w:rFonts w:ascii="Times New Roman" w:eastAsia="Times New Roman" w:hAnsi="Times New Roman" w:cs="Times New Roman"/>
+          <w:sz w:val="24"/>
+          <w:szCs w:val="24"/>
+          <w:lang w:val="mn-MN"/>
+        </w:rPr>
+        <w:t>4 бөх</w:t>
+      </w:r>
+      <w:r>
+        <w:rPr>
+          <w:rFonts w:ascii="Times New Roman" w:eastAsia="Times New Roman" w:hAnsi="Times New Roman" w:cs="Times New Roman"/>
+          <w:sz w:val="24"/>
+          <w:szCs w:val="24"/>
+        </w:rPr>
+        <w:t>;</w:t>
+      </w:r>
+      <w:r>
+        <w:rPr>
+          <w:rFonts w:ascii="Times New Roman" w:eastAsia="Times New Roman" w:hAnsi="Times New Roman" w:cs="Times New Roman"/>
+          <w:sz w:val="24"/>
+          <w:szCs w:val="24"/>
+          <w:lang w:val="mn-MN"/>
+        </w:rPr>
+        <w:t xml:space="preserve"> </w:t>
+      </w:r>
+      <w:r>
+        <w:rPr>
+          <w:rFonts w:ascii="Times New Roman" w:eastAsia="Times New Roman" w:hAnsi="Times New Roman" w:cs="Times New Roman"/>
+          <w:sz w:val="24"/>
+          <w:szCs w:val="24"/>
+          <w:lang w:val="mn-MN"/>
+        </w:rPr>
+        <w:t>Үзүүр,</w:t>
+      </w:r>
+      <w:r>
+        <w:rPr>
+          <w:rFonts w:ascii="Times New Roman" w:eastAsia="Times New Roman" w:hAnsi="Times New Roman" w:cs="Times New Roman"/>
+          <w:sz w:val="24"/>
+          <w:szCs w:val="24"/>
+        </w:rPr>
+        <w:t xml:space="preserve"> </w:t>
+      </w:r>
+      <w:r>
+        <w:rPr>
+          <w:rFonts w:ascii="Times New Roman" w:eastAsia="Times New Roman" w:hAnsi="Times New Roman" w:cs="Times New Roman"/>
+          <w:sz w:val="24"/>
+          <w:szCs w:val="24"/>
+          <w:lang w:val="mn-MN"/>
+        </w:rPr>
+        <w:t>түрүүний бөх, Түрүү бөх</w:t>
+      </w:r>
+      <w:r>
+        <w:rPr>
+          <w:rFonts w:ascii="Times New Roman" w:eastAsia="Times New Roman" w:hAnsi="Times New Roman" w:cs="Times New Roman"/>
+          <w:sz w:val="24"/>
+          <w:szCs w:val="24"/>
+        </w:rPr>
+        <w:t>)</w:t>
+      </w:r>
+    </w:p>
+    <w:p>
+      <w:pPr>
+        <w:pStyle w:val="ListParagraph"/>
+        <w:numPr>
+          <w:ilvl w:val="1"/>
+          <w:numId w:val="8"/>
+        </w:numPr>
+        <w:spacing w:before="100" w:beforeAutospacing="1" w:after="100" w:afterAutospacing="1" w:line="240" w:lineRule="auto"/>
+        <w:rPr>
+          <w:rFonts w:ascii="Times New Roman" w:eastAsia="Times New Roman" w:hAnsi="Times New Roman" w:cs="Times New Roman"/>
+          <w:sz w:val="24"/>
+          <w:szCs w:val="24"/>
+          <w:lang w:val="mn-MN"/>
+        </w:rPr>
+      </w:pPr>
+      <w:r>
+        <w:rPr>
+          <w:rFonts w:ascii="Times New Roman" w:eastAsia="Times New Roman" w:hAnsi="Times New Roman" w:cs="Times New Roman"/>
+          <w:sz w:val="24"/>
+          <w:szCs w:val="24"/>
+          <w:lang w:val="mn-MN"/>
+        </w:rPr>
+        <w:lastRenderedPageBreak/>
+        <w:t>Барилдааны нэр</w:t>
+      </w:r>
+      <w:r>
+        <w:rPr>
+          <w:rFonts w:ascii="Times New Roman" w:eastAsia="Times New Roman" w:hAnsi="Times New Roman" w:cs="Times New Roman"/>
+          <w:sz w:val="24"/>
+          <w:szCs w:val="24"/>
+        </w:rPr>
+        <w:t xml:space="preserve"> </w:t>
+      </w:r>
+      <w:r>
+        <w:rPr>
+          <w:rFonts w:ascii="Times New Roman" w:eastAsia="Times New Roman" w:hAnsi="Times New Roman" w:cs="Times New Roman"/>
+          <w:sz w:val="24"/>
+          <w:szCs w:val="24"/>
+        </w:rPr>
+        <w:t>(</w:t>
+      </w:r>
+      <w:r>
+        <w:rPr>
+          <w:rFonts w:ascii="Times New Roman" w:eastAsia="Times New Roman" w:hAnsi="Times New Roman" w:cs="Times New Roman"/>
+          <w:sz w:val="24"/>
+          <w:szCs w:val="24"/>
+          <w:lang w:val="mn-MN"/>
+        </w:rPr>
+        <w:t>Жишээ нь</w:t>
+      </w:r>
+      <w:r>
+        <w:rPr>
+          <w:rFonts w:ascii="Times New Roman" w:eastAsia="Times New Roman" w:hAnsi="Times New Roman" w:cs="Times New Roman"/>
+          <w:sz w:val="24"/>
+          <w:szCs w:val="24"/>
+        </w:rPr>
+        <w:t xml:space="preserve">: 2026 </w:t>
+      </w:r>
+      <w:r>
+        <w:rPr>
+          <w:rFonts w:ascii="Times New Roman" w:eastAsia="Times New Roman" w:hAnsi="Times New Roman" w:cs="Times New Roman"/>
+          <w:sz w:val="24"/>
+          <w:szCs w:val="24"/>
+          <w:lang w:val="mn-MN"/>
+        </w:rPr>
+        <w:t>он. Ерөнхийлөгчийн цом</w:t>
+      </w:r>
+      <w:r>
+        <w:rPr>
+          <w:rFonts w:ascii="Times New Roman" w:eastAsia="Times New Roman" w:hAnsi="Times New Roman" w:cs="Times New Roman"/>
+          <w:sz w:val="24"/>
+          <w:szCs w:val="24"/>
+        </w:rPr>
+        <w:t>)</w:t>
+      </w:r>
+    </w:p>
+    <w:p>
+      <w:pPr>
+        <w:pStyle w:val="ListParagraph"/>
+        <w:numPr>
+          <w:ilvl w:val="2"/>
+          <w:numId w:val="8"/>
+        </w:numPr>
+        <w:spacing w:before="100" w:beforeAutospacing="1" w:after="100" w:afterAutospacing="1" w:line="240" w:lineRule="auto"/>
+        <w:rPr>
+          <w:rFonts w:ascii="Times New Roman" w:eastAsia="Times New Roman" w:hAnsi="Times New Roman" w:cs="Times New Roman"/>
+          <w:sz w:val="24"/>
+          <w:szCs w:val="24"/>
+          <w:lang w:val="mn-MN"/>
+        </w:rPr>
+      </w:pPr>
+      <w:r>
+        <w:rPr>
+          <w:rFonts w:ascii="Times New Roman" w:eastAsia="Times New Roman" w:hAnsi="Times New Roman" w:cs="Times New Roman"/>
+          <w:sz w:val="24"/>
+          <w:szCs w:val="24"/>
+          <w:lang w:val="mn-MN"/>
+        </w:rPr>
+        <w:t xml:space="preserve">Тааврууд </w:t>
+      </w:r>
+      <w:r>
+        <w:rPr>
+          <w:rFonts w:ascii="Times New Roman" w:eastAsia="Times New Roman" w:hAnsi="Times New Roman" w:cs="Times New Roman"/>
+          <w:sz w:val="24"/>
+          <w:szCs w:val="24"/>
+        </w:rPr>
+        <w:t>(</w:t>
+      </w:r>
+      <w:r>
+        <w:rPr>
+          <w:rFonts w:ascii="Times New Roman" w:eastAsia="Times New Roman" w:hAnsi="Times New Roman" w:cs="Times New Roman"/>
+          <w:sz w:val="24"/>
+          <w:szCs w:val="24"/>
+          <w:lang w:val="mn-MN"/>
+        </w:rPr>
+        <w:t xml:space="preserve">Шөвгийн </w:t>
+      </w:r>
+      <w:r>
+        <w:rPr>
+          <w:rFonts w:ascii="Times New Roman" w:eastAsia="Times New Roman" w:hAnsi="Times New Roman" w:cs="Times New Roman"/>
+          <w:sz w:val="24"/>
+          <w:szCs w:val="24"/>
+          <w:lang w:val="mn-MN"/>
+        </w:rPr>
+        <w:t>16</w:t>
+      </w:r>
+      <w:r>
+        <w:rPr>
+          <w:rFonts w:ascii="Times New Roman" w:eastAsia="Times New Roman" w:hAnsi="Times New Roman" w:cs="Times New Roman"/>
+          <w:sz w:val="24"/>
+          <w:szCs w:val="24"/>
+          <w:lang w:val="mn-MN"/>
+        </w:rPr>
+        <w:t xml:space="preserve"> бөх</w:t>
+      </w:r>
+      <w:r>
+        <w:rPr>
+          <w:rFonts w:ascii="Times New Roman" w:eastAsia="Times New Roman" w:hAnsi="Times New Roman" w:cs="Times New Roman"/>
+          <w:sz w:val="24"/>
+          <w:szCs w:val="24"/>
+        </w:rPr>
+        <w:t>;</w:t>
+      </w:r>
+      <w:r>
+        <w:rPr>
+          <w:rFonts w:ascii="Times New Roman" w:eastAsia="Times New Roman" w:hAnsi="Times New Roman" w:cs="Times New Roman"/>
+          <w:sz w:val="24"/>
+          <w:szCs w:val="24"/>
+          <w:lang w:val="mn-MN"/>
+        </w:rPr>
+        <w:t xml:space="preserve"> </w:t>
+      </w:r>
+      <w:r>
+        <w:rPr>
+          <w:rFonts w:ascii="Times New Roman" w:eastAsia="Times New Roman" w:hAnsi="Times New Roman" w:cs="Times New Roman"/>
+          <w:sz w:val="24"/>
+          <w:szCs w:val="24"/>
+          <w:lang w:val="mn-MN"/>
+        </w:rPr>
+        <w:t>Шөвгийн 8 бөх</w:t>
+      </w:r>
+      <w:r>
+        <w:rPr>
+          <w:rFonts w:ascii="Times New Roman" w:eastAsia="Times New Roman" w:hAnsi="Times New Roman" w:cs="Times New Roman"/>
+          <w:sz w:val="24"/>
+          <w:szCs w:val="24"/>
+        </w:rPr>
+        <w:t>;</w:t>
+      </w:r>
+      <w:r>
+        <w:rPr>
+          <w:rFonts w:ascii="Times New Roman" w:eastAsia="Times New Roman" w:hAnsi="Times New Roman" w:cs="Times New Roman"/>
+          <w:sz w:val="24"/>
+          <w:szCs w:val="24"/>
+          <w:lang w:val="mn-MN"/>
+        </w:rPr>
+        <w:t xml:space="preserve"> Шөвгийн 4 бөх</w:t>
+      </w:r>
+      <w:r>
+        <w:rPr>
+          <w:rFonts w:ascii="Times New Roman" w:eastAsia="Times New Roman" w:hAnsi="Times New Roman" w:cs="Times New Roman"/>
+          <w:sz w:val="24"/>
+          <w:szCs w:val="24"/>
+        </w:rPr>
+        <w:t>;</w:t>
+      </w:r>
+      <w:r>
+        <w:rPr>
+          <w:rFonts w:ascii="Times New Roman" w:eastAsia="Times New Roman" w:hAnsi="Times New Roman" w:cs="Times New Roman"/>
+          <w:sz w:val="24"/>
+          <w:szCs w:val="24"/>
+          <w:lang w:val="mn-MN"/>
+        </w:rPr>
+        <w:t xml:space="preserve"> </w:t>
+      </w:r>
+      <w:r>
+        <w:rPr>
+          <w:rFonts w:ascii="Times New Roman" w:eastAsia="Times New Roman" w:hAnsi="Times New Roman" w:cs="Times New Roman"/>
+          <w:sz w:val="24"/>
+          <w:szCs w:val="24"/>
+          <w:lang w:val="mn-MN"/>
+        </w:rPr>
+        <w:t>Үзүүр,</w:t>
+      </w:r>
+      <w:r>
+        <w:rPr>
+          <w:rFonts w:ascii="Times New Roman" w:eastAsia="Times New Roman" w:hAnsi="Times New Roman" w:cs="Times New Roman"/>
+          <w:sz w:val="24"/>
+          <w:szCs w:val="24"/>
+        </w:rPr>
+        <w:t xml:space="preserve"> </w:t>
+      </w:r>
+      <w:r>
+        <w:rPr>
+          <w:rFonts w:ascii="Times New Roman" w:eastAsia="Times New Roman" w:hAnsi="Times New Roman" w:cs="Times New Roman"/>
+          <w:sz w:val="24"/>
+          <w:szCs w:val="24"/>
+          <w:lang w:val="mn-MN"/>
+        </w:rPr>
+        <w:t>түрүүний бөх, Түрүү бөх</w:t>
+      </w:r>
+      <w:r>
+        <w:rPr>
+          <w:rFonts w:ascii="Times New Roman" w:eastAsia="Times New Roman" w:hAnsi="Times New Roman" w:cs="Times New Roman"/>
+          <w:sz w:val="24"/>
+          <w:szCs w:val="24"/>
+        </w:rPr>
+        <w:t>)</w:t>
+      </w:r>
+    </w:p>
+    <w:p>
+      <w:pPr>
+        <w:pStyle w:val="ListParagraph"/>
+        <w:spacing w:before="100" w:beforeAutospacing="1" w:after="100" w:afterAutospacing="1" w:line="240" w:lineRule="auto"/>
+        <w:ind w:left="2160"/>
+        <w:rPr>
+          <w:rFonts w:ascii="Times New Roman" w:eastAsia="Times New Roman" w:hAnsi="Times New Roman" w:cs="Times New Roman"/>
+          <w:sz w:val="24"/>
+          <w:szCs w:val="24"/>
+          <w:lang w:val="mn-MN"/>
+        </w:rPr>
+      </w:pPr>
       <w:bookmarkStart w:id="0" w:name="_GoBack"/>
       <w:bookmarkEnd w:id="0"/>
-      <w:r>
-        <w:rPr>
-          <w:lang w:val="mn-MN"/>
+    </w:p>
+    <w:p>
+      <w:pPr>
+        <w:pStyle w:val="ListParagraph"/>
+        <w:numPr>
+          <w:ilvl w:val="0"/>
+          <w:numId w:val="8"/>
+        </w:numPr>
+        <w:spacing w:before="100" w:beforeAutospacing="1" w:after="100" w:afterAutospacing="1" w:line="240" w:lineRule="auto"/>
+        <w:rPr>
+          <w:rFonts w:ascii="Times New Roman" w:eastAsia="Times New Roman" w:hAnsi="Times New Roman" w:cs="Times New Roman"/>
+          <w:sz w:val="24"/>
+          <w:szCs w:val="24"/>
+          <w:lang w:val="mn-MN"/>
+        </w:rPr>
+      </w:pPr>
+      <w:r>
+        <w:rPr>
+          <w:rFonts w:ascii="Times New Roman" w:eastAsia="Times New Roman" w:hAnsi="Times New Roman" w:cs="Times New Roman"/>
+          <w:sz w:val="24"/>
+          <w:szCs w:val="24"/>
+          <w:lang w:val="mn-MN"/>
+        </w:rPr>
+        <w:t>Барилдаан бүр тус</w:t>
+      </w:r>
+      <w:r>
+        <w:rPr>
+          <w:rFonts w:ascii="Times New Roman" w:eastAsia="Times New Roman" w:hAnsi="Times New Roman" w:cs="Times New Roman"/>
+          <w:sz w:val="24"/>
+          <w:szCs w:val="24"/>
+          <w:lang w:val="mn-MN"/>
+        </w:rPr>
+        <w:t>даа шагналын сантай байх</w:t>
+      </w:r>
+    </w:p>
+    <w:p>
+      <w:pPr>
+        <w:pStyle w:val="ListParagraph"/>
+        <w:numPr>
+          <w:ilvl w:val="0"/>
+          <w:numId w:val="8"/>
+        </w:numPr>
+        <w:spacing w:before="100" w:beforeAutospacing="1" w:after="100" w:afterAutospacing="1" w:line="240" w:lineRule="auto"/>
+        <w:rPr>
+          <w:rFonts w:ascii="Times New Roman" w:eastAsia="Times New Roman" w:hAnsi="Times New Roman" w:cs="Times New Roman"/>
+          <w:sz w:val="24"/>
+          <w:szCs w:val="24"/>
+          <w:lang w:val="mn-MN"/>
+        </w:rPr>
+      </w:pPr>
+      <w:r>
+        <w:rPr>
+          <w:rFonts w:ascii="Times New Roman" w:eastAsia="Times New Roman" w:hAnsi="Times New Roman" w:cs="Times New Roman"/>
+          <w:sz w:val="24"/>
+          <w:szCs w:val="24"/>
+          <w:lang w:val="mn-MN"/>
+        </w:rPr>
+        <w:t>Дүрэм-</w:t>
+      </w:r>
+      <w:r>
+        <w:rPr>
+          <w:rFonts w:ascii="Times New Roman" w:eastAsia="Times New Roman" w:hAnsi="Times New Roman" w:cs="Times New Roman"/>
+          <w:sz w:val="24"/>
+          <w:szCs w:val="24"/>
+          <w:lang w:val="mn-MN"/>
+        </w:rPr>
+        <w:t xml:space="preserve">Шөвгийн 16 бөхөөс 15-г, Шөвгийн 8 бөхөөс 4-г, Түрүү бөхийг таасан бол 15*1+4*2+1*16= 39 оноо авна. </w:t>
+      </w:r>
+      <w:r>
+        <w:rPr>
+          <w:rFonts w:ascii="Times New Roman" w:eastAsia="Times New Roman" w:hAnsi="Times New Roman" w:cs="Times New Roman"/>
+          <w:sz w:val="24"/>
+          <w:szCs w:val="24"/>
+          <w:lang w:val="mn-MN"/>
+        </w:rPr>
+        <w:t xml:space="preserve">Бүх тааварт оролцогчдын оноог нэмж, </w:t>
+      </w:r>
+      <w:r>
+        <w:rPr>
+          <w:rFonts w:ascii="Times New Roman" w:eastAsia="Times New Roman" w:hAnsi="Times New Roman" w:cs="Times New Roman"/>
+          <w:sz w:val="24"/>
+          <w:szCs w:val="24"/>
+        </w:rPr>
+        <w:t>“</w:t>
+      </w:r>
+      <w:r>
+        <w:rPr>
+          <w:rFonts w:ascii="Times New Roman" w:eastAsia="Times New Roman" w:hAnsi="Times New Roman" w:cs="Times New Roman"/>
+          <w:sz w:val="24"/>
+          <w:szCs w:val="24"/>
+          <w:lang w:val="mn-MN"/>
+        </w:rPr>
+        <w:t>барилдааны нийт оноо</w:t>
+      </w:r>
+      <w:r>
+        <w:rPr>
+          <w:rFonts w:ascii="Times New Roman" w:eastAsia="Times New Roman" w:hAnsi="Times New Roman" w:cs="Times New Roman"/>
+          <w:sz w:val="24"/>
+          <w:szCs w:val="24"/>
+        </w:rPr>
+        <w:t>”-</w:t>
+      </w:r>
+      <w:r>
+        <w:rPr>
+          <w:rFonts w:ascii="Times New Roman" w:eastAsia="Times New Roman" w:hAnsi="Times New Roman" w:cs="Times New Roman"/>
+          <w:sz w:val="24"/>
+          <w:szCs w:val="24"/>
+          <w:lang w:val="mn-MN"/>
+        </w:rPr>
+        <w:t xml:space="preserve">г олно. </w:t>
+      </w:r>
+      <w:r>
+        <w:rPr>
+          <w:rFonts w:ascii="Times New Roman" w:eastAsia="Times New Roman" w:hAnsi="Times New Roman" w:cs="Times New Roman"/>
+          <w:sz w:val="24"/>
+          <w:szCs w:val="24"/>
+        </w:rPr>
+        <w:t>“</w:t>
+      </w:r>
+      <w:r>
+        <w:rPr>
+          <w:rFonts w:ascii="Times New Roman" w:eastAsia="Times New Roman" w:hAnsi="Times New Roman" w:cs="Times New Roman"/>
+          <w:sz w:val="24"/>
+          <w:szCs w:val="24"/>
+          <w:lang w:val="mn-MN"/>
+        </w:rPr>
+        <w:t>Нэг онооны үнэ цэнэ</w:t>
+      </w:r>
+      <w:r>
+        <w:rPr>
+          <w:rFonts w:ascii="Times New Roman" w:eastAsia="Times New Roman" w:hAnsi="Times New Roman" w:cs="Times New Roman"/>
+          <w:sz w:val="24"/>
+          <w:szCs w:val="24"/>
+        </w:rPr>
+        <w:t>”-</w:t>
+      </w:r>
+      <w:r>
+        <w:rPr>
+          <w:rFonts w:ascii="Times New Roman" w:eastAsia="Times New Roman" w:hAnsi="Times New Roman" w:cs="Times New Roman"/>
+          <w:sz w:val="24"/>
+          <w:szCs w:val="24"/>
+          <w:lang w:val="mn-MN"/>
+        </w:rPr>
+        <w:t xml:space="preserve">ийг шагналын санг </w:t>
+      </w:r>
+      <w:r>
+        <w:rPr>
+          <w:rFonts w:ascii="Times New Roman" w:eastAsia="Times New Roman" w:hAnsi="Times New Roman" w:cs="Times New Roman"/>
+          <w:sz w:val="24"/>
+          <w:szCs w:val="24"/>
+        </w:rPr>
+        <w:t>“</w:t>
+      </w:r>
+      <w:r>
+        <w:rPr>
+          <w:rFonts w:ascii="Times New Roman" w:eastAsia="Times New Roman" w:hAnsi="Times New Roman" w:cs="Times New Roman"/>
+          <w:sz w:val="24"/>
+          <w:szCs w:val="24"/>
+          <w:lang w:val="mn-MN"/>
+        </w:rPr>
+        <w:t>барилдааны нийт оноо</w:t>
+      </w:r>
+      <w:r>
+        <w:rPr>
+          <w:rFonts w:ascii="Times New Roman" w:eastAsia="Times New Roman" w:hAnsi="Times New Roman" w:cs="Times New Roman"/>
+          <w:sz w:val="24"/>
+          <w:szCs w:val="24"/>
+        </w:rPr>
+        <w:t>”-</w:t>
+      </w:r>
+      <w:r>
+        <w:rPr>
+          <w:rFonts w:ascii="Times New Roman" w:eastAsia="Times New Roman" w:hAnsi="Times New Roman" w:cs="Times New Roman"/>
+          <w:sz w:val="24"/>
+          <w:szCs w:val="24"/>
+          <w:lang w:val="mn-MN"/>
+        </w:rPr>
+        <w:t>нд хувааж олно. Оролцогчид олгох шагналын мөнгийг оролцогчийн авсан оноог</w:t>
+      </w:r>
+      <w:r>
+        <w:rPr>
+          <w:rFonts w:ascii="Times New Roman" w:eastAsia="Times New Roman" w:hAnsi="Times New Roman" w:cs="Times New Roman"/>
+          <w:sz w:val="24"/>
+          <w:szCs w:val="24"/>
         </w:rPr>
         <w:t xml:space="preserve"> </w:t>
       </w:r>
-    </w:p>
-    <w:p>
-      <w:pPr>
-        <w:pStyle w:val="NormalWeb"/>
-        <w:ind w:left="360"/>
-        <w:rPr>
-          <w:lang w:val="mn-MN"/>
-        </w:rPr>
-      </w:pPr>
-    </w:p>
-    <w:p>
-      <w:pPr>
-        <w:pStyle w:val="NormalWeb"/>
-        <w:ind w:left="360"/>
-        <w:rPr>
-          <w:lang w:val="mn-MN"/>
-        </w:rPr>
-      </w:pPr>
-      <w:r>
-        <w:t xml:space="preserve">Channel </w:t>
-      </w:r>
-      <w:r>
-        <w:rPr>
-          <w:lang w:val="mn-MN"/>
-        </w:rPr>
-        <w:t>болон</w:t>
-      </w:r>
-      <w:r>
-        <w:t xml:space="preserve"> </w:t>
-      </w:r>
-      <w:proofErr w:type="spellStart"/>
-      <w:r>
-        <w:t>Telegramm</w:t>
-      </w:r>
-      <w:proofErr w:type="spellEnd"/>
-      <w:r>
-        <w:t xml:space="preserve"> </w:t>
-      </w:r>
-      <w:r>
-        <w:rPr>
-          <w:lang w:val="mn-MN"/>
-        </w:rPr>
-        <w:t xml:space="preserve">хөгжүүлэх талаар асуух. </w:t>
-      </w:r>
-      <w:proofErr w:type="spellStart"/>
-      <w:r>
-        <w:t>Subsciption</w:t>
-      </w:r>
-      <w:proofErr w:type="spellEnd"/>
-      <w:r>
-        <w:t xml:space="preserve"> fee </w:t>
-      </w:r>
-      <w:r>
-        <w:rPr>
-          <w:lang w:val="mn-MN"/>
-        </w:rPr>
-        <w:t>яаж орж ирдэг вэ. Ирсэнийг яаж мэдэх вэ. Түрийвч нээх үү.</w:t>
-      </w:r>
-    </w:p>
-    <w:p>
-      <w:pPr>
-        <w:pStyle w:val="NormalWeb"/>
-        <w:ind w:left="360"/>
-        <w:rPr>
+      <w:r>
+        <w:rPr>
+          <w:rFonts w:ascii="Times New Roman" w:eastAsia="Times New Roman" w:hAnsi="Times New Roman" w:cs="Times New Roman"/>
+          <w:sz w:val="24"/>
+          <w:szCs w:val="24"/>
+        </w:rPr>
+        <w:t>“</w:t>
+      </w:r>
+      <w:r>
+        <w:rPr>
+          <w:rFonts w:ascii="Times New Roman" w:eastAsia="Times New Roman" w:hAnsi="Times New Roman" w:cs="Times New Roman"/>
+          <w:sz w:val="24"/>
+          <w:szCs w:val="24"/>
+          <w:lang w:val="mn-MN"/>
+        </w:rPr>
+        <w:t>Нэг онооны үнэ цэнэ</w:t>
+      </w:r>
+      <w:r>
+        <w:rPr>
+          <w:rFonts w:ascii="Times New Roman" w:eastAsia="Times New Roman" w:hAnsi="Times New Roman" w:cs="Times New Roman"/>
+          <w:sz w:val="24"/>
+          <w:szCs w:val="24"/>
+        </w:rPr>
+        <w:t>”-</w:t>
+      </w:r>
+      <w:r>
+        <w:rPr>
+          <w:rFonts w:ascii="Times New Roman" w:eastAsia="Times New Roman" w:hAnsi="Times New Roman" w:cs="Times New Roman"/>
+          <w:sz w:val="24"/>
+          <w:szCs w:val="24"/>
+          <w:lang w:val="mn-MN"/>
+        </w:rPr>
+        <w:t>ээр үржүүлж олно. Энэ шагналын мөнгөнөөс 10</w:t>
+      </w:r>
+      <w:r>
+        <w:rPr>
+          <w:rFonts w:ascii="Times New Roman" w:eastAsia="Times New Roman" w:hAnsi="Times New Roman" w:cs="Times New Roman"/>
+          <w:sz w:val="24"/>
+          <w:szCs w:val="24"/>
+        </w:rPr>
+        <w:t>%-</w:t>
+      </w:r>
+      <w:r>
+        <w:rPr>
+          <w:rFonts w:ascii="Times New Roman" w:eastAsia="Times New Roman" w:hAnsi="Times New Roman" w:cs="Times New Roman"/>
+          <w:sz w:val="24"/>
+          <w:szCs w:val="24"/>
+          <w:lang w:val="mn-MN"/>
+        </w:rPr>
+        <w:t>ийг платформ суутгаж, 90</w:t>
+      </w:r>
+      <w:r>
+        <w:rPr>
+          <w:rFonts w:ascii="Times New Roman" w:eastAsia="Times New Roman" w:hAnsi="Times New Roman" w:cs="Times New Roman"/>
+          <w:sz w:val="24"/>
+          <w:szCs w:val="24"/>
+        </w:rPr>
+        <w:t>%-</w:t>
+      </w:r>
+      <w:r>
+        <w:rPr>
+          <w:rFonts w:ascii="Times New Roman" w:eastAsia="Times New Roman" w:hAnsi="Times New Roman" w:cs="Times New Roman"/>
+          <w:sz w:val="24"/>
+          <w:szCs w:val="24"/>
+          <w:lang w:val="mn-MN"/>
+        </w:rPr>
+        <w:t>ийг оролцогчид олгоно.</w:t>
+      </w:r>
+    </w:p>
+    <w:p>
+      <w:pPr>
+        <w:pStyle w:val="ListParagraph"/>
+        <w:numPr>
+          <w:ilvl w:val="0"/>
+          <w:numId w:val="8"/>
+        </w:numPr>
+        <w:spacing w:before="100" w:beforeAutospacing="1" w:after="100" w:afterAutospacing="1" w:line="240" w:lineRule="auto"/>
+        <w:rPr>
+          <w:rFonts w:ascii="Times New Roman" w:eastAsia="Times New Roman" w:hAnsi="Times New Roman" w:cs="Times New Roman"/>
+          <w:sz w:val="24"/>
+          <w:szCs w:val="24"/>
+          <w:lang w:val="mn-MN"/>
+        </w:rPr>
+      </w:pPr>
+      <w:r>
+        <w:rPr>
+          <w:rFonts w:ascii="Times New Roman" w:eastAsia="Times New Roman" w:hAnsi="Times New Roman" w:cs="Times New Roman"/>
+          <w:sz w:val="24"/>
+          <w:szCs w:val="24"/>
+          <w:lang w:val="mn-MN"/>
+        </w:rPr>
+        <w:t xml:space="preserve">Шагналын санг эхний ээлжинд </w:t>
+      </w:r>
+      <w:r>
+        <w:rPr>
+          <w:rFonts w:ascii="Times New Roman" w:eastAsia="Times New Roman" w:hAnsi="Times New Roman" w:cs="Times New Roman"/>
+          <w:sz w:val="24"/>
+          <w:szCs w:val="24"/>
+          <w:lang w:val="mn-MN"/>
+        </w:rPr>
+        <w:t>Админ тохируулъя. Дараа нь subs</w:t>
+      </w:r>
+      <w:r>
+        <w:rPr>
+          <w:rFonts w:ascii="Times New Roman" w:eastAsia="Times New Roman" w:hAnsi="Times New Roman" w:cs="Times New Roman"/>
+          <w:sz w:val="24"/>
+          <w:szCs w:val="24"/>
+        </w:rPr>
+        <w:t>c</w:t>
+      </w:r>
+      <w:r>
+        <w:rPr>
+          <w:rFonts w:ascii="Times New Roman" w:eastAsia="Times New Roman" w:hAnsi="Times New Roman" w:cs="Times New Roman"/>
+          <w:sz w:val="24"/>
+          <w:szCs w:val="24"/>
+          <w:lang w:val="mn-MN"/>
+        </w:rPr>
+        <w:t xml:space="preserve">iption орлогоос автоматаар болгоно. </w:t>
+      </w:r>
+    </w:p>
+    <w:p>
+      <w:pPr>
+        <w:pStyle w:val="ListParagraph"/>
+        <w:numPr>
+          <w:ilvl w:val="0"/>
+          <w:numId w:val="8"/>
+        </w:numPr>
+        <w:spacing w:before="100" w:beforeAutospacing="1" w:after="100" w:afterAutospacing="1" w:line="240" w:lineRule="auto"/>
+        <w:rPr>
+          <w:rFonts w:ascii="Times New Roman" w:eastAsia="Times New Roman" w:hAnsi="Times New Roman" w:cs="Times New Roman"/>
+          <w:sz w:val="24"/>
+          <w:szCs w:val="24"/>
+          <w:lang w:val="mn-MN"/>
+        </w:rPr>
+      </w:pPr>
+      <w:r>
+        <w:rPr>
+          <w:rFonts w:ascii="Times New Roman" w:eastAsia="Times New Roman" w:hAnsi="Times New Roman" w:cs="Times New Roman"/>
+          <w:sz w:val="24"/>
+          <w:szCs w:val="24"/>
+          <w:lang w:val="mn-MN"/>
+        </w:rPr>
+        <w:t xml:space="preserve">Барилдааны бүрийн оноо тусдаа тооцогдоно. </w:t>
+      </w:r>
+    </w:p>
+    <w:p>
+      <w:pPr>
+        <w:pStyle w:val="ListParagraph"/>
+        <w:numPr>
+          <w:ilvl w:val="0"/>
+          <w:numId w:val="8"/>
+        </w:numPr>
+        <w:spacing w:before="100" w:beforeAutospacing="1" w:after="100" w:afterAutospacing="1" w:line="240" w:lineRule="auto"/>
+        <w:rPr>
+          <w:rFonts w:ascii="Times New Roman" w:eastAsia="Times New Roman" w:hAnsi="Times New Roman" w:cs="Times New Roman"/>
+          <w:sz w:val="24"/>
+          <w:szCs w:val="24"/>
+          <w:lang w:val="mn-MN"/>
+        </w:rPr>
+      </w:pPr>
+      <w:r>
+        <w:rPr>
+          <w:rFonts w:ascii="Times New Roman" w:eastAsia="Times New Roman" w:hAnsi="Times New Roman" w:cs="Times New Roman"/>
+          <w:sz w:val="24"/>
+          <w:szCs w:val="24"/>
+        </w:rPr>
+        <w:t>Fixed navigation bar-</w:t>
+      </w:r>
+      <w:r>
+        <w:rPr>
+          <w:rFonts w:ascii="Times New Roman" w:eastAsia="Times New Roman" w:hAnsi="Times New Roman" w:cs="Times New Roman"/>
+          <w:sz w:val="24"/>
+          <w:szCs w:val="24"/>
+          <w:lang w:val="mn-MN"/>
+        </w:rPr>
+        <w:t xml:space="preserve">ууд хэвээрээ. </w:t>
+      </w:r>
+      <w:r>
+        <w:rPr>
+          <w:rFonts w:ascii="Times New Roman" w:eastAsia="Times New Roman" w:hAnsi="Times New Roman" w:cs="Times New Roman"/>
+          <w:sz w:val="24"/>
+          <w:szCs w:val="24"/>
+        </w:rPr>
+        <w:t>Bar-</w:t>
+      </w:r>
+      <w:r>
+        <w:rPr>
+          <w:rFonts w:ascii="Times New Roman" w:eastAsia="Times New Roman" w:hAnsi="Times New Roman" w:cs="Times New Roman"/>
+          <w:sz w:val="24"/>
+          <w:szCs w:val="24"/>
+          <w:lang w:val="mn-MN"/>
+        </w:rPr>
+        <w:t xml:space="preserve">ууд доторхи утга нэгэн зэрэг олон барилдааны таавар тааж болох тул түүнд тохирох байдлаар өөрчлөх. </w:t>
+      </w:r>
+    </w:p>
+    <w:p>
+      <w:pPr>
+        <w:pStyle w:val="ListParagraph"/>
+        <w:numPr>
+          <w:ilvl w:val="0"/>
+          <w:numId w:val="8"/>
+        </w:numPr>
+        <w:spacing w:before="100" w:beforeAutospacing="1" w:after="100" w:afterAutospacing="1" w:line="240" w:lineRule="auto"/>
+        <w:rPr>
+          <w:rFonts w:ascii="Times New Roman" w:eastAsia="Times New Roman" w:hAnsi="Times New Roman" w:cs="Times New Roman"/>
+          <w:sz w:val="24"/>
+          <w:szCs w:val="24"/>
+          <w:lang w:val="mn-MN"/>
+        </w:rPr>
+      </w:pPr>
+      <w:r>
+        <w:rPr>
+          <w:rFonts w:ascii="Times New Roman" w:eastAsia="Times New Roman" w:hAnsi="Times New Roman" w:cs="Times New Roman"/>
+          <w:sz w:val="24"/>
+          <w:szCs w:val="24"/>
+          <w:lang w:val="mn-MN"/>
+        </w:rPr>
+        <w:t>Барилдааны Шөвгийн 16 бөх тодорхой болсон үед Админ 16 бөхийг тэмдэглэхэд Profile дотор авсан оноо харагдаж байвал сайн</w:t>
+      </w:r>
+    </w:p>
+    <w:p>
+      <w:pPr>
+        <w:pStyle w:val="ListParagraph"/>
+        <w:numPr>
+          <w:ilvl w:val="0"/>
+          <w:numId w:val="8"/>
+        </w:numPr>
+        <w:spacing w:before="100" w:beforeAutospacing="1" w:after="100" w:afterAutospacing="1" w:line="240" w:lineRule="auto"/>
+        <w:rPr>
+          <w:rFonts w:ascii="Times New Roman" w:eastAsia="Times New Roman" w:hAnsi="Times New Roman" w:cs="Times New Roman"/>
+          <w:sz w:val="24"/>
+          <w:szCs w:val="24"/>
+          <w:lang w:val="mn-MN"/>
+        </w:rPr>
+      </w:pPr>
+    </w:p>
+    <w:p>
+      <w:pPr>
+        <w:pStyle w:val="ListParagraph"/>
+        <w:spacing w:before="100" w:beforeAutospacing="1" w:after="100" w:afterAutospacing="1" w:line="240" w:lineRule="auto"/>
+        <w:ind w:left="1440"/>
+        <w:rPr>
+          <w:rFonts w:ascii="Times New Roman" w:eastAsia="Times New Roman" w:hAnsi="Times New Roman" w:cs="Times New Roman"/>
+          <w:sz w:val="24"/>
+          <w:szCs w:val="24"/>
+          <w:lang w:val="mn-MN"/>
+        </w:rPr>
+      </w:pPr>
+    </w:p>
+    <w:p>
+      <w:pPr>
+        <w:spacing w:before="100" w:beforeAutospacing="1" w:after="100" w:afterAutospacing="1" w:line="240" w:lineRule="auto"/>
+        <w:rPr>
+          <w:rFonts w:ascii="Times New Roman" w:eastAsia="Times New Roman" w:hAnsi="Times New Roman" w:cs="Times New Roman"/>
+          <w:sz w:val="24"/>
+          <w:szCs w:val="24"/>
           <w:lang w:val="mn-MN"/>
         </w:rPr>
       </w:pPr>
@@ -1247,6 +4398,446 @@
 <file path=word/numbering.xml><?xml version="1.0" encoding="utf-8"?>
 <w:numbering xmlns:wpc="http://schemas.microsoft.com/office/word/2010/wordprocessingCanvas" xmlns:cx="http://schemas.microsoft.com/office/drawing/2014/chartex" xmlns:cx1="http://schemas.microsoft.com/office/drawing/2015/9/8/chartex" xmlns:mc="http://schemas.openxmlformats.org/markup-compatibility/2006" xmlns:o="urn:schemas-microsoft-com:office:office" xmlns:r="http://schemas.openxmlformats.org/officeDocument/2006/relationships" xmlns:m="http://schemas.openxmlformats.org/officeDocument/2006/math" xmlns:v="urn:schemas-microsoft-com:vml" xmlns:wp14="http://schemas.microsoft.com/office/word/2010/wordprocessingDrawing" xmlns:wp="http://schemas.openxmlformats.org/drawingml/2006/wordprocessingDrawing" xmlns:w10="urn:schemas-microsoft-com:office:word" xmlns:w="http://schemas.openxmlformats.org/wordprocessingml/2006/main" xmlns:w14="http://schemas.microsoft.com/office/word/2010/wordml" xmlns:w15="http://schemas.microsoft.com/office/word/2012/wordml" xmlns:w16se="http://schemas.microsoft.com/office/word/2015/wordml/symex" xmlns:wpg="http://schemas.microsoft.com/office/word/2010/wordprocessingGroup" xmlns:wpi="http://schemas.microsoft.com/office/word/2010/wordprocessingInk" xmlns:wne="http://schemas.microsoft.com/office/word/2006/wordml" xmlns:wps="http://schemas.microsoft.com/office/word/2010/wordprocessingShape" mc:Ignorable="w14 w15 w16se wp14">
   <w:abstractNum w:abstractNumId="0" w15:restartNumberingAfterBreak="0">
+    <w:nsid w:val="07E351B1"/>
+    <w:multiLevelType w:val="hybridMultilevel"/>
+    <w:tmpl w:val="6F604B0A"/>
+    <w:lvl w:ilvl="0" w:tplc="0409000F">
+      <w:start w:val="1"/>
+      <w:numFmt w:val="decimal"/>
+      <w:lvlText w:val="%1."/>
+      <w:lvlJc w:val="left"/>
+      <w:pPr>
+        <w:ind w:left="720" w:hanging="360"/>
+      </w:pPr>
+      <w:rPr>
+        <w:rFonts w:hint="default"/>
+      </w:rPr>
+    </w:lvl>
+    <w:lvl w:ilvl="1" w:tplc="04090019" w:tentative="1">
+      <w:start w:val="1"/>
+      <w:numFmt w:val="lowerLetter"/>
+      <w:lvlText w:val="%2."/>
+      <w:lvlJc w:val="left"/>
+      <w:pPr>
+        <w:ind w:left="1440" w:hanging="360"/>
+      </w:pPr>
+    </w:lvl>
+    <w:lvl w:ilvl="2" w:tplc="0409001B" w:tentative="1">
+      <w:start w:val="1"/>
+      <w:numFmt w:val="lowerRoman"/>
+      <w:lvlText w:val="%3."/>
+      <w:lvlJc w:val="right"/>
+      <w:pPr>
+        <w:ind w:left="2160" w:hanging="180"/>
+      </w:pPr>
+    </w:lvl>
+    <w:lvl w:ilvl="3" w:tplc="0409000F" w:tentative="1">
+      <w:start w:val="1"/>
+      <w:numFmt w:val="decimal"/>
+      <w:lvlText w:val="%4."/>
+      <w:lvlJc w:val="left"/>
+      <w:pPr>
+        <w:ind w:left="2880" w:hanging="360"/>
+      </w:pPr>
+    </w:lvl>
+    <w:lvl w:ilvl="4" w:tplc="04090019" w:tentative="1">
+      <w:start w:val="1"/>
+      <w:numFmt w:val="lowerLetter"/>
+      <w:lvlText w:val="%5."/>
+      <w:lvlJc w:val="left"/>
+      <w:pPr>
+        <w:ind w:left="3600" w:hanging="360"/>
+      </w:pPr>
+    </w:lvl>
+    <w:lvl w:ilvl="5" w:tplc="0409001B" w:tentative="1">
+      <w:start w:val="1"/>
+      <w:numFmt w:val="lowerRoman"/>
+      <w:lvlText w:val="%6."/>
+      <w:lvlJc w:val="right"/>
+      <w:pPr>
+        <w:ind w:left="4320" w:hanging="180"/>
+      </w:pPr>
+    </w:lvl>
+    <w:lvl w:ilvl="6" w:tplc="0409000F" w:tentative="1">
+      <w:start w:val="1"/>
+      <w:numFmt w:val="decimal"/>
+      <w:lvlText w:val="%7."/>
+      <w:lvlJc w:val="left"/>
+      <w:pPr>
+        <w:ind w:left="5040" w:hanging="360"/>
+      </w:pPr>
+    </w:lvl>
+    <w:lvl w:ilvl="7" w:tplc="04090019" w:tentative="1">
+      <w:start w:val="1"/>
+      <w:numFmt w:val="lowerLetter"/>
+      <w:lvlText w:val="%8."/>
+      <w:lvlJc w:val="left"/>
+      <w:pPr>
+        <w:ind w:left="5760" w:hanging="360"/>
+      </w:pPr>
+    </w:lvl>
+    <w:lvl w:ilvl="8" w:tplc="0409001B" w:tentative="1">
+      <w:start w:val="1"/>
+      <w:numFmt w:val="lowerRoman"/>
+      <w:lvlText w:val="%9."/>
+      <w:lvlJc w:val="right"/>
+      <w:pPr>
+        <w:ind w:left="6480" w:hanging="180"/>
+      </w:pPr>
+    </w:lvl>
+  </w:abstractNum>
+  <w:abstractNum w:abstractNumId="1" w15:restartNumberingAfterBreak="0">
+    <w:nsid w:val="0BBF6203"/>
+    <w:multiLevelType w:val="multilevel"/>
+    <w:tmpl w:val="925C6694"/>
+    <w:lvl w:ilvl="0">
+      <w:start w:val="1"/>
+      <w:numFmt w:val="bullet"/>
+      <w:lvlText w:val=""/>
+      <w:lvlJc w:val="left"/>
+      <w:pPr>
+        <w:tabs>
+          <w:tab w:val="num" w:pos="720"/>
+        </w:tabs>
+        <w:ind w:left="720" w:hanging="360"/>
+      </w:pPr>
+      <w:rPr>
+        <w:rFonts w:ascii="Symbol" w:hAnsi="Symbol" w:hint="default"/>
+        <w:sz w:val="20"/>
+      </w:rPr>
+    </w:lvl>
+    <w:lvl w:ilvl="1" w:tentative="1">
+      <w:start w:val="1"/>
+      <w:numFmt w:val="bullet"/>
+      <w:lvlText w:val="o"/>
+      <w:lvlJc w:val="left"/>
+      <w:pPr>
+        <w:tabs>
+          <w:tab w:val="num" w:pos="1440"/>
+        </w:tabs>
+        <w:ind w:left="1440" w:hanging="360"/>
+      </w:pPr>
+      <w:rPr>
+        <w:rFonts w:ascii="Courier New" w:hAnsi="Courier New" w:hint="default"/>
+        <w:sz w:val="20"/>
+      </w:rPr>
+    </w:lvl>
+    <w:lvl w:ilvl="2" w:tentative="1">
+      <w:start w:val="1"/>
+      <w:numFmt w:val="bullet"/>
+      <w:lvlText w:val=""/>
+      <w:lvlJc w:val="left"/>
+      <w:pPr>
+        <w:tabs>
+          <w:tab w:val="num" w:pos="2160"/>
+        </w:tabs>
+        <w:ind w:left="2160" w:hanging="360"/>
+      </w:pPr>
+      <w:rPr>
+        <w:rFonts w:ascii="Wingdings" w:hAnsi="Wingdings" w:hint="default"/>
+        <w:sz w:val="20"/>
+      </w:rPr>
+    </w:lvl>
+    <w:lvl w:ilvl="3" w:tentative="1">
+      <w:start w:val="1"/>
+      <w:numFmt w:val="bullet"/>
+      <w:lvlText w:val=""/>
+      <w:lvlJc w:val="left"/>
+      <w:pPr>
+        <w:tabs>
+          <w:tab w:val="num" w:pos="2880"/>
+        </w:tabs>
+        <w:ind w:left="2880" w:hanging="360"/>
+      </w:pPr>
+      <w:rPr>
+        <w:rFonts w:ascii="Wingdings" w:hAnsi="Wingdings" w:hint="default"/>
+        <w:sz w:val="20"/>
+      </w:rPr>
+    </w:lvl>
+    <w:lvl w:ilvl="4" w:tentative="1">
+      <w:start w:val="1"/>
+      <w:numFmt w:val="bullet"/>
+      <w:lvlText w:val=""/>
+      <w:lvlJc w:val="left"/>
+      <w:pPr>
+        <w:tabs>
+          <w:tab w:val="num" w:pos="3600"/>
+        </w:tabs>
+        <w:ind w:left="3600" w:hanging="360"/>
+      </w:pPr>
+      <w:rPr>
+        <w:rFonts w:ascii="Wingdings" w:hAnsi="Wingdings" w:hint="default"/>
+        <w:sz w:val="20"/>
+      </w:rPr>
+    </w:lvl>
+    <w:lvl w:ilvl="5" w:tentative="1">
+      <w:start w:val="1"/>
+      <w:numFmt w:val="bullet"/>
+      <w:lvlText w:val=""/>
+      <w:lvlJc w:val="left"/>
+      <w:pPr>
+        <w:tabs>
+          <w:tab w:val="num" w:pos="4320"/>
+        </w:tabs>
+        <w:ind w:left="4320" w:hanging="360"/>
+      </w:pPr>
+      <w:rPr>
+        <w:rFonts w:ascii="Wingdings" w:hAnsi="Wingdings" w:hint="default"/>
+        <w:sz w:val="20"/>
+      </w:rPr>
+    </w:lvl>
+    <w:lvl w:ilvl="6" w:tentative="1">
+      <w:start w:val="1"/>
+      <w:numFmt w:val="bullet"/>
+      <w:lvlText w:val=""/>
+      <w:lvlJc w:val="left"/>
+      <w:pPr>
+        <w:tabs>
+          <w:tab w:val="num" w:pos="5040"/>
+        </w:tabs>
+        <w:ind w:left="5040" w:hanging="360"/>
+      </w:pPr>
+      <w:rPr>
+        <w:rFonts w:ascii="Wingdings" w:hAnsi="Wingdings" w:hint="default"/>
+        <w:sz w:val="20"/>
+      </w:rPr>
+    </w:lvl>
+    <w:lvl w:ilvl="7" w:tentative="1">
+      <w:start w:val="1"/>
+      <w:numFmt w:val="bullet"/>
+      <w:lvlText w:val=""/>
+      <w:lvlJc w:val="left"/>
+      <w:pPr>
+        <w:tabs>
+          <w:tab w:val="num" w:pos="5760"/>
+        </w:tabs>
+        <w:ind w:left="5760" w:hanging="360"/>
+      </w:pPr>
+      <w:rPr>
+        <w:rFonts w:ascii="Wingdings" w:hAnsi="Wingdings" w:hint="default"/>
+        <w:sz w:val="20"/>
+      </w:rPr>
+    </w:lvl>
+    <w:lvl w:ilvl="8" w:tentative="1">
+      <w:start w:val="1"/>
+      <w:numFmt w:val="bullet"/>
+      <w:lvlText w:val=""/>
+      <w:lvlJc w:val="left"/>
+      <w:pPr>
+        <w:tabs>
+          <w:tab w:val="num" w:pos="6480"/>
+        </w:tabs>
+        <w:ind w:left="6480" w:hanging="360"/>
+      </w:pPr>
+      <w:rPr>
+        <w:rFonts w:ascii="Wingdings" w:hAnsi="Wingdings" w:hint="default"/>
+        <w:sz w:val="20"/>
+      </w:rPr>
+    </w:lvl>
+  </w:abstractNum>
+  <w:abstractNum w:abstractNumId="2" w15:restartNumberingAfterBreak="0">
+    <w:nsid w:val="144E393C"/>
+    <w:multiLevelType w:val="hybridMultilevel"/>
+    <w:tmpl w:val="DB224E66"/>
+    <w:lvl w:ilvl="0" w:tplc="0409000F">
+      <w:start w:val="1"/>
+      <w:numFmt w:val="decimal"/>
+      <w:lvlText w:val="%1."/>
+      <w:lvlJc w:val="left"/>
+      <w:pPr>
+        <w:ind w:left="720" w:hanging="360"/>
+      </w:pPr>
+      <w:rPr>
+        <w:rFonts w:hint="default"/>
+      </w:rPr>
+    </w:lvl>
+    <w:lvl w:ilvl="1" w:tplc="04090019">
+      <w:start w:val="1"/>
+      <w:numFmt w:val="lowerLetter"/>
+      <w:lvlText w:val="%2."/>
+      <w:lvlJc w:val="left"/>
+      <w:pPr>
+        <w:ind w:left="1440" w:hanging="360"/>
+      </w:pPr>
+    </w:lvl>
+    <w:lvl w:ilvl="2" w:tplc="0409001B">
+      <w:start w:val="1"/>
+      <w:numFmt w:val="lowerRoman"/>
+      <w:lvlText w:val="%3."/>
+      <w:lvlJc w:val="right"/>
+      <w:pPr>
+        <w:ind w:left="2160" w:hanging="180"/>
+      </w:pPr>
+    </w:lvl>
+    <w:lvl w:ilvl="3" w:tplc="0409000F" w:tentative="1">
+      <w:start w:val="1"/>
+      <w:numFmt w:val="decimal"/>
+      <w:lvlText w:val="%4."/>
+      <w:lvlJc w:val="left"/>
+      <w:pPr>
+        <w:ind w:left="2880" w:hanging="360"/>
+      </w:pPr>
+    </w:lvl>
+    <w:lvl w:ilvl="4" w:tplc="04090019" w:tentative="1">
+      <w:start w:val="1"/>
+      <w:numFmt w:val="lowerLetter"/>
+      <w:lvlText w:val="%5."/>
+      <w:lvlJc w:val="left"/>
+      <w:pPr>
+        <w:ind w:left="3600" w:hanging="360"/>
+      </w:pPr>
+    </w:lvl>
+    <w:lvl w:ilvl="5" w:tplc="0409001B" w:tentative="1">
+      <w:start w:val="1"/>
+      <w:numFmt w:val="lowerRoman"/>
+      <w:lvlText w:val="%6."/>
+      <w:lvlJc w:val="right"/>
+      <w:pPr>
+        <w:ind w:left="4320" w:hanging="180"/>
+      </w:pPr>
+    </w:lvl>
+    <w:lvl w:ilvl="6" w:tplc="0409000F" w:tentative="1">
+      <w:start w:val="1"/>
+      <w:numFmt w:val="decimal"/>
+      <w:lvlText w:val="%7."/>
+      <w:lvlJc w:val="left"/>
+      <w:pPr>
+        <w:ind w:left="5040" w:hanging="360"/>
+      </w:pPr>
+    </w:lvl>
+    <w:lvl w:ilvl="7" w:tplc="04090019" w:tentative="1">
+      <w:start w:val="1"/>
+      <w:numFmt w:val="lowerLetter"/>
+      <w:lvlText w:val="%8."/>
+      <w:lvlJc w:val="left"/>
+      <w:pPr>
+        <w:ind w:left="5760" w:hanging="360"/>
+      </w:pPr>
+    </w:lvl>
+    <w:lvl w:ilvl="8" w:tplc="0409001B" w:tentative="1">
+      <w:start w:val="1"/>
+      <w:numFmt w:val="lowerRoman"/>
+      <w:lvlText w:val="%9."/>
+      <w:lvlJc w:val="right"/>
+      <w:pPr>
+        <w:ind w:left="6480" w:hanging="180"/>
+      </w:pPr>
+    </w:lvl>
+  </w:abstractNum>
+  <w:abstractNum w:abstractNumId="3" w15:restartNumberingAfterBreak="0">
+    <w:nsid w:val="21A31EF8"/>
+    <w:multiLevelType w:val="hybridMultilevel"/>
+    <w:tmpl w:val="45C4D6D8"/>
+    <w:lvl w:ilvl="0" w:tplc="D4AEC79C">
+      <w:start w:val="1"/>
+      <w:numFmt w:val="bullet"/>
+      <w:lvlText w:val="-"/>
+      <w:lvlJc w:val="left"/>
+      <w:pPr>
+        <w:ind w:left="720" w:hanging="360"/>
+      </w:pPr>
+      <w:rPr>
+        <w:rFonts w:ascii="Times New Roman" w:eastAsia="Times New Roman" w:hAnsi="Times New Roman" w:cs="Times New Roman" w:hint="default"/>
+      </w:rPr>
+    </w:lvl>
+    <w:lvl w:ilvl="1" w:tplc="04090003">
+      <w:start w:val="1"/>
+      <w:numFmt w:val="bullet"/>
+      <w:lvlText w:val="o"/>
+      <w:lvlJc w:val="left"/>
+      <w:pPr>
+        <w:ind w:left="1440" w:hanging="360"/>
+      </w:pPr>
+      <w:rPr>
+        <w:rFonts w:ascii="Courier New" w:hAnsi="Courier New" w:cs="Courier New" w:hint="default"/>
+      </w:rPr>
+    </w:lvl>
+    <w:lvl w:ilvl="2" w:tplc="04090005">
+      <w:start w:val="1"/>
+      <w:numFmt w:val="bullet"/>
+      <w:lvlText w:val=""/>
+      <w:lvlJc w:val="left"/>
+      <w:pPr>
+        <w:ind w:left="2160" w:hanging="360"/>
+      </w:pPr>
+      <w:rPr>
+        <w:rFonts w:ascii="Wingdings" w:hAnsi="Wingdings" w:hint="default"/>
+      </w:rPr>
+    </w:lvl>
+    <w:lvl w:ilvl="3" w:tplc="04090001" w:tentative="1">
+      <w:start w:val="1"/>
+      <w:numFmt w:val="bullet"/>
+      <w:lvlText w:val=""/>
+      <w:lvlJc w:val="left"/>
+      <w:pPr>
+        <w:ind w:left="2880" w:hanging="360"/>
+      </w:pPr>
+      <w:rPr>
+        <w:rFonts w:ascii="Symbol" w:hAnsi="Symbol" w:hint="default"/>
+      </w:rPr>
+    </w:lvl>
+    <w:lvl w:ilvl="4" w:tplc="04090003" w:tentative="1">
+      <w:start w:val="1"/>
+      <w:numFmt w:val="bullet"/>
+      <w:lvlText w:val="o"/>
+      <w:lvlJc w:val="left"/>
+      <w:pPr>
+        <w:ind w:left="3600" w:hanging="360"/>
+      </w:pPr>
+      <w:rPr>
+        <w:rFonts w:ascii="Courier New" w:hAnsi="Courier New" w:cs="Courier New" w:hint="default"/>
+      </w:rPr>
+    </w:lvl>
+    <w:lvl w:ilvl="5" w:tplc="04090005" w:tentative="1">
+      <w:start w:val="1"/>
+      <w:numFmt w:val="bullet"/>
+      <w:lvlText w:val=""/>
+      <w:lvlJc w:val="left"/>
+      <w:pPr>
+        <w:ind w:left="4320" w:hanging="360"/>
+      </w:pPr>
+      <w:rPr>
+        <w:rFonts w:ascii="Wingdings" w:hAnsi="Wingdings" w:hint="default"/>
+      </w:rPr>
+    </w:lvl>
+    <w:lvl w:ilvl="6" w:tplc="04090001" w:tentative="1">
+      <w:start w:val="1"/>
+      <w:numFmt w:val="bullet"/>
+      <w:lvlText w:val=""/>
+      <w:lvlJc w:val="left"/>
+      <w:pPr>
+        <w:ind w:left="5040" w:hanging="360"/>
+      </w:pPr>
+      <w:rPr>
+        <w:rFonts w:ascii="Symbol" w:hAnsi="Symbol" w:hint="default"/>
+      </w:rPr>
+    </w:lvl>
+    <w:lvl w:ilvl="7" w:tplc="04090003" w:tentative="1">
+      <w:start w:val="1"/>
+      <w:numFmt w:val="bullet"/>
+      <w:lvlText w:val="o"/>
+      <w:lvlJc w:val="left"/>
+      <w:pPr>
+        <w:ind w:left="5760" w:hanging="360"/>
+      </w:pPr>
+      <w:rPr>
+        <w:rFonts w:ascii="Courier New" w:hAnsi="Courier New" w:cs="Courier New" w:hint="default"/>
+      </w:rPr>
+    </w:lvl>
+    <w:lvl w:ilvl="8" w:tplc="04090005" w:tentative="1">
+      <w:start w:val="1"/>
+      <w:numFmt w:val="bullet"/>
+      <w:lvlText w:val=""/>
+      <w:lvlJc w:val="left"/>
+      <w:pPr>
+        <w:ind w:left="6480" w:hanging="360"/>
+      </w:pPr>
+      <w:rPr>
+        <w:rFonts w:ascii="Wingdings" w:hAnsi="Wingdings" w:hint="default"/>
+      </w:rPr>
+    </w:lvl>
+  </w:abstractNum>
+  <w:abstractNum w:abstractNumId="4" w15:restartNumberingAfterBreak="0">
     <w:nsid w:val="2C9A5A6A"/>
     <w:multiLevelType w:val="hybridMultilevel"/>
     <w:tmpl w:val="C42A2BAA"/>
@@ -1335,7 +4926,156 @@
       </w:pPr>
     </w:lvl>
   </w:abstractNum>
-  <w:abstractNum w:abstractNumId="1" w15:restartNumberingAfterBreak="0">
+  <w:abstractNum w:abstractNumId="5" w15:restartNumberingAfterBreak="0">
+    <w:nsid w:val="30BB37C7"/>
+    <w:multiLevelType w:val="multilevel"/>
+    <w:tmpl w:val="F768F0EC"/>
+    <w:lvl w:ilvl="0">
+      <w:start w:val="1"/>
+      <w:numFmt w:val="bullet"/>
+      <w:lvlText w:val=""/>
+      <w:lvlJc w:val="left"/>
+      <w:pPr>
+        <w:tabs>
+          <w:tab w:val="num" w:pos="720"/>
+        </w:tabs>
+        <w:ind w:left="720" w:hanging="360"/>
+      </w:pPr>
+      <w:rPr>
+        <w:rFonts w:ascii="Symbol" w:hAnsi="Symbol" w:hint="default"/>
+        <w:sz w:val="20"/>
+      </w:rPr>
+    </w:lvl>
+    <w:lvl w:ilvl="1" w:tentative="1">
+      <w:start w:val="1"/>
+      <w:numFmt w:val="bullet"/>
+      <w:lvlText w:val="o"/>
+      <w:lvlJc w:val="left"/>
+      <w:pPr>
+        <w:tabs>
+          <w:tab w:val="num" w:pos="1440"/>
+        </w:tabs>
+        <w:ind w:left="1440" w:hanging="360"/>
+      </w:pPr>
+      <w:rPr>
+        <w:rFonts w:ascii="Courier New" w:hAnsi="Courier New" w:hint="default"/>
+        <w:sz w:val="20"/>
+      </w:rPr>
+    </w:lvl>
+    <w:lvl w:ilvl="2" w:tentative="1">
+      <w:start w:val="1"/>
+      <w:numFmt w:val="bullet"/>
+      <w:lvlText w:val=""/>
+      <w:lvlJc w:val="left"/>
+      <w:pPr>
+        <w:tabs>
+          <w:tab w:val="num" w:pos="2160"/>
+        </w:tabs>
+        <w:ind w:left="2160" w:hanging="360"/>
+      </w:pPr>
+      <w:rPr>
+        <w:rFonts w:ascii="Wingdings" w:hAnsi="Wingdings" w:hint="default"/>
+        <w:sz w:val="20"/>
+      </w:rPr>
+    </w:lvl>
+    <w:lvl w:ilvl="3" w:tentative="1">
+      <w:start w:val="1"/>
+      <w:numFmt w:val="bullet"/>
+      <w:lvlText w:val=""/>
+      <w:lvlJc w:val="left"/>
+      <w:pPr>
+        <w:tabs>
+          <w:tab w:val="num" w:pos="2880"/>
+        </w:tabs>
+        <w:ind w:left="2880" w:hanging="360"/>
+      </w:pPr>
+      <w:rPr>
+        <w:rFonts w:ascii="Wingdings" w:hAnsi="Wingdings" w:hint="default"/>
+        <w:sz w:val="20"/>
+      </w:rPr>
+    </w:lvl>
+    <w:lvl w:ilvl="4" w:tentative="1">
+      <w:start w:val="1"/>
+      <w:numFmt w:val="bullet"/>
+      <w:lvlText w:val=""/>
+      <w:lvlJc w:val="left"/>
+      <w:pPr>
+        <w:tabs>
+          <w:tab w:val="num" w:pos="3600"/>
+        </w:tabs>
+        <w:ind w:left="3600" w:hanging="360"/>
+      </w:pPr>
+      <w:rPr>
+        <w:rFonts w:ascii="Wingdings" w:hAnsi="Wingdings" w:hint="default"/>
+        <w:sz w:val="20"/>
+      </w:rPr>
+    </w:lvl>
+    <w:lvl w:ilvl="5" w:tentative="1">
+      <w:start w:val="1"/>
+      <w:numFmt w:val="bullet"/>
+      <w:lvlText w:val=""/>
+      <w:lvlJc w:val="left"/>
+      <w:pPr>
+        <w:tabs>
+          <w:tab w:val="num" w:pos="4320"/>
+        </w:tabs>
+        <w:ind w:left="4320" w:hanging="360"/>
+      </w:pPr>
+      <w:rPr>
+        <w:rFonts w:ascii="Wingdings" w:hAnsi="Wingdings" w:hint="default"/>
+        <w:sz w:val="20"/>
+      </w:rPr>
+    </w:lvl>
+    <w:lvl w:ilvl="6" w:tentative="1">
+      <w:start w:val="1"/>
+      <w:numFmt w:val="bullet"/>
+      <w:lvlText w:val=""/>
+      <w:lvlJc w:val="left"/>
+      <w:pPr>
+        <w:tabs>
+          <w:tab w:val="num" w:pos="5040"/>
+        </w:tabs>
+        <w:ind w:left="5040" w:hanging="360"/>
+      </w:pPr>
+      <w:rPr>
+        <w:rFonts w:ascii="Wingdings" w:hAnsi="Wingdings" w:hint="default"/>
+        <w:sz w:val="20"/>
+      </w:rPr>
+    </w:lvl>
+    <w:lvl w:ilvl="7" w:tentative="1">
+      <w:start w:val="1"/>
+      <w:numFmt w:val="bullet"/>
+      <w:lvlText w:val=""/>
+      <w:lvlJc w:val="left"/>
+      <w:pPr>
+        <w:tabs>
+          <w:tab w:val="num" w:pos="5760"/>
+        </w:tabs>
+        <w:ind w:left="5760" w:hanging="360"/>
+      </w:pPr>
+      <w:rPr>
+        <w:rFonts w:ascii="Wingdings" w:hAnsi="Wingdings" w:hint="default"/>
+        <w:sz w:val="20"/>
+      </w:rPr>
+    </w:lvl>
+    <w:lvl w:ilvl="8" w:tentative="1">
+      <w:start w:val="1"/>
+      <w:numFmt w:val="bullet"/>
+      <w:lvlText w:val=""/>
+      <w:lvlJc w:val="left"/>
+      <w:pPr>
+        <w:tabs>
+          <w:tab w:val="num" w:pos="6480"/>
+        </w:tabs>
+        <w:ind w:left="6480" w:hanging="360"/>
+      </w:pPr>
+      <w:rPr>
+        <w:rFonts w:ascii="Wingdings" w:hAnsi="Wingdings" w:hint="default"/>
+        <w:sz w:val="20"/>
+      </w:rPr>
+    </w:lvl>
+  </w:abstractNum>
+  <w:abstractNum w:abstractNumId="6" w15:restartNumberingAfterBreak="0">
     <w:nsid w:val="40EE22DD"/>
     <w:multiLevelType w:val="hybridMultilevel"/>
     <w:tmpl w:val="14BE0F16"/>
@@ -1424,11 +5164,330 @@
       </w:pPr>
     </w:lvl>
   </w:abstractNum>
+  <w:abstractNum w:abstractNumId="7" w15:restartNumberingAfterBreak="0">
+    <w:nsid w:val="43A85161"/>
+    <w:multiLevelType w:val="multilevel"/>
+    <w:tmpl w:val="99F61C6E"/>
+    <w:lvl w:ilvl="0">
+      <w:start w:val="1"/>
+      <w:numFmt w:val="bullet"/>
+      <w:lvlText w:val=""/>
+      <w:lvlJc w:val="left"/>
+      <w:pPr>
+        <w:tabs>
+          <w:tab w:val="num" w:pos="720"/>
+        </w:tabs>
+        <w:ind w:left="720" w:hanging="360"/>
+      </w:pPr>
+      <w:rPr>
+        <w:rFonts w:ascii="Symbol" w:hAnsi="Symbol" w:hint="default"/>
+        <w:sz w:val="20"/>
+      </w:rPr>
+    </w:lvl>
+    <w:lvl w:ilvl="1" w:tentative="1">
+      <w:start w:val="1"/>
+      <w:numFmt w:val="bullet"/>
+      <w:lvlText w:val="o"/>
+      <w:lvlJc w:val="left"/>
+      <w:pPr>
+        <w:tabs>
+          <w:tab w:val="num" w:pos="1440"/>
+        </w:tabs>
+        <w:ind w:left="1440" w:hanging="360"/>
+      </w:pPr>
+      <w:rPr>
+        <w:rFonts w:ascii="Courier New" w:hAnsi="Courier New" w:hint="default"/>
+        <w:sz w:val="20"/>
+      </w:rPr>
+    </w:lvl>
+    <w:lvl w:ilvl="2" w:tentative="1">
+      <w:start w:val="1"/>
+      <w:numFmt w:val="bullet"/>
+      <w:lvlText w:val=""/>
+      <w:lvlJc w:val="left"/>
+      <w:pPr>
+        <w:tabs>
+          <w:tab w:val="num" w:pos="2160"/>
+        </w:tabs>
+        <w:ind w:left="2160" w:hanging="360"/>
+      </w:pPr>
+      <w:rPr>
+        <w:rFonts w:ascii="Wingdings" w:hAnsi="Wingdings" w:hint="default"/>
+        <w:sz w:val="20"/>
+      </w:rPr>
+    </w:lvl>
+    <w:lvl w:ilvl="3" w:tentative="1">
+      <w:start w:val="1"/>
+      <w:numFmt w:val="bullet"/>
+      <w:lvlText w:val=""/>
+      <w:lvlJc w:val="left"/>
+      <w:pPr>
+        <w:tabs>
+          <w:tab w:val="num" w:pos="2880"/>
+        </w:tabs>
+        <w:ind w:left="2880" w:hanging="360"/>
+      </w:pPr>
+      <w:rPr>
+        <w:rFonts w:ascii="Wingdings" w:hAnsi="Wingdings" w:hint="default"/>
+        <w:sz w:val="20"/>
+      </w:rPr>
+    </w:lvl>
+    <w:lvl w:ilvl="4" w:tentative="1">
+      <w:start w:val="1"/>
+      <w:numFmt w:val="bullet"/>
+      <w:lvlText w:val=""/>
+      <w:lvlJc w:val="left"/>
+      <w:pPr>
+        <w:tabs>
+          <w:tab w:val="num" w:pos="3600"/>
+        </w:tabs>
+        <w:ind w:left="3600" w:hanging="360"/>
+      </w:pPr>
+      <w:rPr>
+        <w:rFonts w:ascii="Wingdings" w:hAnsi="Wingdings" w:hint="default"/>
+        <w:sz w:val="20"/>
+      </w:rPr>
+    </w:lvl>
+    <w:lvl w:ilvl="5" w:tentative="1">
+      <w:start w:val="1"/>
+      <w:numFmt w:val="bullet"/>
+      <w:lvlText w:val=""/>
+      <w:lvlJc w:val="left"/>
+      <w:pPr>
+        <w:tabs>
+          <w:tab w:val="num" w:pos="4320"/>
+        </w:tabs>
+        <w:ind w:left="4320" w:hanging="360"/>
+      </w:pPr>
+      <w:rPr>
+        <w:rFonts w:ascii="Wingdings" w:hAnsi="Wingdings" w:hint="default"/>
+        <w:sz w:val="20"/>
+      </w:rPr>
+    </w:lvl>
+    <w:lvl w:ilvl="6" w:tentative="1">
+      <w:start w:val="1"/>
+      <w:numFmt w:val="bullet"/>
+      <w:lvlText w:val=""/>
+      <w:lvlJc w:val="left"/>
+      <w:pPr>
+        <w:tabs>
+          <w:tab w:val="num" w:pos="5040"/>
+        </w:tabs>
+        <w:ind w:left="5040" w:hanging="360"/>
+      </w:pPr>
+      <w:rPr>
+        <w:rFonts w:ascii="Wingdings" w:hAnsi="Wingdings" w:hint="default"/>
+        <w:sz w:val="20"/>
+      </w:rPr>
+    </w:lvl>
+    <w:lvl w:ilvl="7" w:tentative="1">
+      <w:start w:val="1"/>
+      <w:numFmt w:val="bullet"/>
+      <w:lvlText w:val=""/>
+      <w:lvlJc w:val="left"/>
+      <w:pPr>
+        <w:tabs>
+          <w:tab w:val="num" w:pos="5760"/>
+        </w:tabs>
+        <w:ind w:left="5760" w:hanging="360"/>
+      </w:pPr>
+      <w:rPr>
+        <w:rFonts w:ascii="Wingdings" w:hAnsi="Wingdings" w:hint="default"/>
+        <w:sz w:val="20"/>
+      </w:rPr>
+    </w:lvl>
+    <w:lvl w:ilvl="8" w:tentative="1">
+      <w:start w:val="1"/>
+      <w:numFmt w:val="bullet"/>
+      <w:lvlText w:val=""/>
+      <w:lvlJc w:val="left"/>
+      <w:pPr>
+        <w:tabs>
+          <w:tab w:val="num" w:pos="6480"/>
+        </w:tabs>
+        <w:ind w:left="6480" w:hanging="360"/>
+      </w:pPr>
+      <w:rPr>
+        <w:rFonts w:ascii="Wingdings" w:hAnsi="Wingdings" w:hint="default"/>
+        <w:sz w:val="20"/>
+      </w:rPr>
+    </w:lvl>
+  </w:abstractNum>
+  <w:abstractNum w:abstractNumId="8" w15:restartNumberingAfterBreak="0">
+    <w:nsid w:val="7A0852BD"/>
+    <w:multiLevelType w:val="multilevel"/>
+    <w:tmpl w:val="A956B790"/>
+    <w:lvl w:ilvl="0">
+      <w:start w:val="1"/>
+      <w:numFmt w:val="bullet"/>
+      <w:lvlText w:val=""/>
+      <w:lvlJc w:val="left"/>
+      <w:pPr>
+        <w:tabs>
+          <w:tab w:val="num" w:pos="720"/>
+        </w:tabs>
+        <w:ind w:left="720" w:hanging="360"/>
+      </w:pPr>
+      <w:rPr>
+        <w:rFonts w:ascii="Symbol" w:hAnsi="Symbol" w:hint="default"/>
+        <w:sz w:val="20"/>
+      </w:rPr>
+    </w:lvl>
+    <w:lvl w:ilvl="1" w:tentative="1">
+      <w:start w:val="1"/>
+      <w:numFmt w:val="bullet"/>
+      <w:lvlText w:val="o"/>
+      <w:lvlJc w:val="left"/>
+      <w:pPr>
+        <w:tabs>
+          <w:tab w:val="num" w:pos="1440"/>
+        </w:tabs>
+        <w:ind w:left="1440" w:hanging="360"/>
+      </w:pPr>
+      <w:rPr>
+        <w:rFonts w:ascii="Courier New" w:hAnsi="Courier New" w:hint="default"/>
+        <w:sz w:val="20"/>
+      </w:rPr>
+    </w:lvl>
+    <w:lvl w:ilvl="2" w:tentative="1">
+      <w:start w:val="1"/>
+      <w:numFmt w:val="bullet"/>
+      <w:lvlText w:val=""/>
+      <w:lvlJc w:val="left"/>
+      <w:pPr>
+        <w:tabs>
+          <w:tab w:val="num" w:pos="2160"/>
+        </w:tabs>
+        <w:ind w:left="2160" w:hanging="360"/>
+      </w:pPr>
+      <w:rPr>
+        <w:rFonts w:ascii="Wingdings" w:hAnsi="Wingdings" w:hint="default"/>
+        <w:sz w:val="20"/>
+      </w:rPr>
+    </w:lvl>
+    <w:lvl w:ilvl="3" w:tentative="1">
+      <w:start w:val="1"/>
+      <w:numFmt w:val="bullet"/>
+      <w:lvlText w:val=""/>
+      <w:lvlJc w:val="left"/>
+      <w:pPr>
+        <w:tabs>
+          <w:tab w:val="num" w:pos="2880"/>
+        </w:tabs>
+        <w:ind w:left="2880" w:hanging="360"/>
+      </w:pPr>
+      <w:rPr>
+        <w:rFonts w:ascii="Wingdings" w:hAnsi="Wingdings" w:hint="default"/>
+        <w:sz w:val="20"/>
+      </w:rPr>
+    </w:lvl>
+    <w:lvl w:ilvl="4" w:tentative="1">
+      <w:start w:val="1"/>
+      <w:numFmt w:val="bullet"/>
+      <w:lvlText w:val=""/>
+      <w:lvlJc w:val="left"/>
+      <w:pPr>
+        <w:tabs>
+          <w:tab w:val="num" w:pos="3600"/>
+        </w:tabs>
+        <w:ind w:left="3600" w:hanging="360"/>
+      </w:pPr>
+      <w:rPr>
+        <w:rFonts w:ascii="Wingdings" w:hAnsi="Wingdings" w:hint="default"/>
+        <w:sz w:val="20"/>
+      </w:rPr>
+    </w:lvl>
+    <w:lvl w:ilvl="5" w:tentative="1">
+      <w:start w:val="1"/>
+      <w:numFmt w:val="bullet"/>
+      <w:lvlText w:val=""/>
+      <w:lvlJc w:val="left"/>
+      <w:pPr>
+        <w:tabs>
+          <w:tab w:val="num" w:pos="4320"/>
+        </w:tabs>
+        <w:ind w:left="4320" w:hanging="360"/>
+      </w:pPr>
+      <w:rPr>
+        <w:rFonts w:ascii="Wingdings" w:hAnsi="Wingdings" w:hint="default"/>
+        <w:sz w:val="20"/>
+      </w:rPr>
+    </w:lvl>
+    <w:lvl w:ilvl="6" w:tentative="1">
+      <w:start w:val="1"/>
+      <w:numFmt w:val="bullet"/>
+      <w:lvlText w:val=""/>
+      <w:lvlJc w:val="left"/>
+      <w:pPr>
+        <w:tabs>
+          <w:tab w:val="num" w:pos="5040"/>
+        </w:tabs>
+        <w:ind w:left="5040" w:hanging="360"/>
+      </w:pPr>
+      <w:rPr>
+        <w:rFonts w:ascii="Wingdings" w:hAnsi="Wingdings" w:hint="default"/>
+        <w:sz w:val="20"/>
+      </w:rPr>
+    </w:lvl>
+    <w:lvl w:ilvl="7" w:tentative="1">
+      <w:start w:val="1"/>
+      <w:numFmt w:val="bullet"/>
+      <w:lvlText w:val=""/>
+      <w:lvlJc w:val="left"/>
+      <w:pPr>
+        <w:tabs>
+          <w:tab w:val="num" w:pos="5760"/>
+        </w:tabs>
+        <w:ind w:left="5760" w:hanging="360"/>
+      </w:pPr>
+      <w:rPr>
+        <w:rFonts w:ascii="Wingdings" w:hAnsi="Wingdings" w:hint="default"/>
+        <w:sz w:val="20"/>
+      </w:rPr>
+    </w:lvl>
+    <w:lvl w:ilvl="8" w:tentative="1">
+      <w:start w:val="1"/>
+      <w:numFmt w:val="bullet"/>
+      <w:lvlText w:val=""/>
+      <w:lvlJc w:val="left"/>
+      <w:pPr>
+        <w:tabs>
+          <w:tab w:val="num" w:pos="6480"/>
+        </w:tabs>
+        <w:ind w:left="6480" w:hanging="360"/>
+      </w:pPr>
+      <w:rPr>
+        <w:rFonts w:ascii="Wingdings" w:hAnsi="Wingdings" w:hint="default"/>
+        <w:sz w:val="20"/>
+      </w:rPr>
+    </w:lvl>
+  </w:abstractNum>
   <w:num w:numId="1">
+    <w:abstractNumId w:val="6"/>
+  </w:num>
+  <w:num w:numId="2">
+    <w:abstractNumId w:val="4"/>
+  </w:num>
+  <w:num w:numId="3">
+    <w:abstractNumId w:val="5"/>
+  </w:num>
+  <w:num w:numId="4">
+    <w:abstractNumId w:val="7"/>
+  </w:num>
+  <w:num w:numId="5">
+    <w:abstractNumId w:val="0"/>
+  </w:num>
+  <w:num w:numId="6">
     <w:abstractNumId w:val="1"/>
   </w:num>
-  <w:num w:numId="2">
-    <w:abstractNumId w:val="0"/>
+  <w:num w:numId="7">
+    <w:abstractNumId w:val="8"/>
+  </w:num>
+  <w:num w:numId="8">
+    <w:abstractNumId w:val="2"/>
+  </w:num>
+  <w:num w:numId="9">
+    <w:abstractNumId w:val="3"/>
   </w:num>
 </w:numbering>
 </file>
@@ -1827,6 +5886,27 @@
     <w:name w:val="Normal"/>
     <w:qFormat/>
   </w:style>
+  <w:style w:type="paragraph" w:styleId="Heading1">
+    <w:name w:val="heading 1"/>
+    <w:basedOn w:val="Normal"/>
+    <w:next w:val="Normal"/>
+    <w:link w:val="Heading1Char"/>
+    <w:uiPriority w:val="9"/>
+    <w:qFormat/>
+    <w:rsid w:val="000C11C0"/>
+    <w:pPr>
+      <w:keepNext/>
+      <w:keepLines/>
+      <w:spacing w:before="240" w:after="0"/>
+      <w:outlineLvl w:val="0"/>
+    </w:pPr>
+    <w:rPr>
+      <w:rFonts w:asciiTheme="majorHAnsi" w:eastAsiaTheme="majorEastAsia" w:hAnsiTheme="majorHAnsi" w:cstheme="majorBidi"/>
+      <w:color w:val="2E74B5" w:themeColor="accent1" w:themeShade="BF"/>
+      <w:sz w:val="32"/>
+      <w:szCs w:val="32"/>
+    </w:rPr>
+  </w:style>
   <w:style w:type="character" w:default="1" w:styleId="DefaultParagraphFont">
     <w:name w:val="Default Paragraph Font"/>
     <w:uiPriority w:val="1"/>
@@ -1869,6 +5949,66 @@
       <w:sz w:val="24"/>
       <w:szCs w:val="24"/>
     </w:rPr>
+  </w:style>
+  <w:style w:type="paragraph" w:customStyle="1" w:styleId="font-claude-response-body">
+    <w:name w:val="font-claude-response-body"/>
+    <w:basedOn w:val="Normal"/>
+    <w:rsid w:val="004A7FA8"/>
+    <w:pPr>
+      <w:spacing w:before="100" w:beforeAutospacing="1" w:after="100" w:afterAutospacing="1" w:line="240" w:lineRule="auto"/>
+    </w:pPr>
+    <w:rPr>
+      <w:rFonts w:ascii="Times New Roman" w:eastAsia="Times New Roman" w:hAnsi="Times New Roman" w:cs="Times New Roman"/>
+      <w:sz w:val="24"/>
+      <w:szCs w:val="24"/>
+    </w:rPr>
+  </w:style>
+  <w:style w:type="character" w:styleId="Strong">
+    <w:name w:val="Strong"/>
+    <w:basedOn w:val="DefaultParagraphFont"/>
+    <w:uiPriority w:val="22"/>
+    <w:qFormat/>
+    <w:rsid w:val="004A7FA8"/>
+    <w:rPr>
+      <w:b/>
+      <w:bCs/>
+    </w:rPr>
+  </w:style>
+  <w:style w:type="paragraph" w:styleId="ListParagraph">
+    <w:name w:val="List Paragraph"/>
+    <w:basedOn w:val="Normal"/>
+    <w:uiPriority w:val="34"/>
+    <w:qFormat/>
+    <w:rsid w:val="00D674E1"/>
+    <w:pPr>
+      <w:ind w:left="720"/>
+      <w:contextualSpacing/>
+    </w:pPr>
+  </w:style>
+  <w:style w:type="character" w:customStyle="1" w:styleId="Heading1Char">
+    <w:name w:val="Heading 1 Char"/>
+    <w:basedOn w:val="DefaultParagraphFont"/>
+    <w:link w:val="Heading1"/>
+    <w:uiPriority w:val="9"/>
+    <w:rsid w:val="000C11C0"/>
+    <w:rPr>
+      <w:rFonts w:asciiTheme="majorHAnsi" w:eastAsiaTheme="majorEastAsia" w:hAnsiTheme="majorHAnsi" w:cstheme="majorBidi"/>
+      <w:color w:val="2E74B5" w:themeColor="accent1" w:themeShade="BF"/>
+      <w:sz w:val="32"/>
+      <w:szCs w:val="32"/>
+    </w:rPr>
+  </w:style>
+  <w:style w:type="paragraph" w:styleId="TOCHeading">
+    <w:name w:val="TOC Heading"/>
+    <w:basedOn w:val="Heading1"/>
+    <w:next w:val="Normal"/>
+    <w:uiPriority w:val="39"/>
+    <w:unhideWhenUsed/>
+    <w:qFormat/>
+    <w:rsid w:val="000C11C0"/>
+    <w:pPr>
+      <w:outlineLvl w:val="9"/>
+    </w:pPr>
   </w:style>
 </w:styles>
 </file>
@@ -2132,4 +6272,16 @@
     </a:ext>
   </a:extLst>
 </a:theme>
+</file>
+
+<file path=customXml/item1.xml><?xml version="1.0" encoding="utf-8"?>
+<b:Sources xmlns:b="http://schemas.openxmlformats.org/officeDocument/2006/bibliography" xmlns="http://schemas.openxmlformats.org/officeDocument/2006/bibliography" SelectedStyle="\APASixthEditionOfficeOnline.xsl" StyleName="APA" Version="6"/>
+</file>
+
+<file path=customXml/itemProps1.xml><?xml version="1.0" encoding="utf-8"?>
+<ds:datastoreItem xmlns:ds="http://schemas.openxmlformats.org/officeDocument/2006/customXml" ds:itemID="{DB9CE30D-585F-4044-BF07-1F9E4367E9BD}">
+  <ds:schemaRefs>
+    <ds:schemaRef ds:uri="http://schemas.openxmlformats.org/officeDocument/2006/bibliography"/>
+  </ds:schemaRefs>
+</ds:datastoreItem>
 </file>
</xml_diff>